<commit_message>
Dokumente: Mobile Physiotherapie Grausam Branding, kein SEPA, keine Preisliste
- Behandlungsvertrag: Preisliste-Checkbox und -Satz entfernt
- Anamnesebogen: Neu erstellt mit korrektem Branding (Nick Grausam, info@physiotherapie-grausam.com)
- Datenschutzerklärung: Neu erstellt mit Solo-Praxis-Sprache, .com E-Mail, korrekter Telefonnummer

Co-Authored-By: Claude Sonnet 4.6 <noreply@anthropic.com>
</commit_message>
<xml_diff>
--- a/dokumente/Anamnesebogen.docx
+++ b/dokumente/Anamnesebogen.docx
@@ -4,49 +4,49 @@
   <w:body>
     <w:p>
       <w:pPr>
-        <w:spacing w:before="0" w:after="20"/>
-        <w:jc w:val="center"/>
+        <w:spacing w:before="0" w:after="40"/>
       </w:pPr>
       <w:r>
         <w:rPr>
-          <w:rFonts w:ascii="Calibri" w:hAnsi="Calibri"/>
+          <w:rFonts w:ascii="Arial" w:hAnsi="Arial"/>
           <w:b/>
-          <w:color w:val="000000"/>
-          <w:sz w:val="36"/>
+          <w:i w:val="0"/>
+          <w:color w:val="202020"/>
+          <w:sz w:val="44"/>
         </w:rPr>
         <w:t>Anamnesebogen</w:t>
       </w:r>
     </w:p>
     <w:p>
       <w:pPr>
-        <w:spacing w:before="0" w:after="200"/>
-        <w:jc w:val="center"/>
+        <w:spacing w:before="0" w:after="280"/>
       </w:pPr>
       <w:r>
         <w:rPr>
-          <w:rFonts w:ascii="Calibri" w:hAnsi="Calibri"/>
+          <w:rFonts w:ascii="Arial" w:hAnsi="Arial"/>
           <w:b w:val="0"/>
-          <w:color w:val="000000"/>
-          <w:sz w:val="18"/>
+          <w:i w:val="0"/>
+          <w:color w:val="606060"/>
+          <w:sz w:val="22"/>
         </w:rPr>
         <w:t>Mobile Physiotherapie Grausam  ·  Nick Grausam</w:t>
       </w:r>
     </w:p>
     <w:p>
       <w:pPr>
-        <w:spacing w:before="120" w:after="40"/>
-        <w:jc w:val="left"/>
-        <w:shd w:val="clear" w:color="auto" w:fill="EFEFEF"/>
+        <w:spacing w:before="200" w:after="80"/>
+        <w:shd w:val="clear" w:color="auto" w:fill="D6E4F0"/>
         <w:pBdr>
-          <w:bottom w:val="single" w:sz="4" w:space="1" w:color="000000"/>
+          <w:left w:val="single" w:sz="18" w:space="6" w:color="2E74B5"/>
         </w:pBdr>
       </w:pPr>
       <w:r>
         <w:rPr>
-          <w:rFonts w:ascii="Calibri" w:hAnsi="Calibri"/>
+          <w:rFonts w:ascii="Arial" w:hAnsi="Arial"/>
           <w:b/>
-          <w:color w:val="000000"/>
-          <w:sz w:val="18"/>
+          <w:i w:val="0"/>
+          <w:color w:val="2E74B5"/>
+          <w:sz w:val="22"/>
         </w:rPr>
         <w:t xml:space="preserve">  1  ·  Persönliche Daten</w:t>
       </w:r>
@@ -55,6 +55,7 @@
       <w:tblPr>
         <w:tblStyle w:val="TableGrid"/>
         <w:tblW w:type="auto" w:w="0"/>
+        <w:tblLayout w:type="fixed"/>
         <w:tblLook w:firstColumn="1" w:firstRow="1" w:lastColumn="0" w:lastRow="0" w:noHBand="0" w:noVBand="1" w:val="04A0"/>
       </w:tblPr>
       <w:tblGrid>
@@ -62,19 +63,35 @@
         <w:gridCol w:w="4986"/>
       </w:tblGrid>
       <w:tr>
+        <w:trPr>
+          <w:trHeight w:val="360" w:hRule="atLeast"/>
+        </w:trPr>
         <w:tc>
           <w:tcPr>
-            <w:tcW w:type="dxa" w:w="4819"/>
-            <w:vAlign w:val="center"/>
-            <w:shd w:val="clear" w:color="auto" w:fill="F8F8F8"/>
+            <w:tcW w:type="dxa" w:w="4986"/>
+            <w:tcMar>
+              <w:top w:w="80" w:type="dxa"/>
+              <w:bottom w:w="80" w:type="dxa"/>
+              <w:left w:w="120" w:type="dxa"/>
+              <w:right w:w="120" w:type="dxa"/>
+            </w:tcMar>
+            <w:tcBorders>
+              <w:top w:val="single" w:sz="4" w:space="0" w:color="CCCCCC"/>
+              <w:left w:val="single" w:sz="4" w:space="0" w:color="CCCCCC"/>
+              <w:bottom w:val="single" w:sz="4" w:space="0" w:color="CCCCCC"/>
+              <w:right w:val="single" w:sz="4" w:space="0" w:color="CCCCCC"/>
+            </w:tcBorders>
           </w:tcPr>
           <w:p>
+            <w:pPr>
+              <w:spacing w:before="0" w:after="0"/>
+            </w:pPr>
             <w:r>
               <w:rPr>
-                <w:rFonts w:ascii="Calibri" w:hAnsi="Calibri"/>
+                <w:rFonts w:ascii="Arial" w:hAnsi="Arial"/>
                 <w:b/>
-                <w:color w:val="000000"/>
-                <w:sz w:val="16"/>
+                <w:color w:val="444444"/>
+                <w:sz w:val="17"/>
               </w:rPr>
               <w:t>Vorname</w:t>
             </w:r>
@@ -82,17 +99,30 @@
         </w:tc>
         <w:tc>
           <w:tcPr>
-            <w:tcW w:type="dxa" w:w="4819"/>
-            <w:vAlign w:val="center"/>
-            <w:shd w:val="clear" w:color="auto" w:fill="F8F8F8"/>
+            <w:tcW w:type="dxa" w:w="4986"/>
+            <w:tcMar>
+              <w:top w:w="80" w:type="dxa"/>
+              <w:bottom w:w="80" w:type="dxa"/>
+              <w:left w:w="120" w:type="dxa"/>
+              <w:right w:w="120" w:type="dxa"/>
+            </w:tcMar>
+            <w:tcBorders>
+              <w:top w:val="single" w:sz="4" w:space="0" w:color="CCCCCC"/>
+              <w:left w:val="single" w:sz="4" w:space="0" w:color="CCCCCC"/>
+              <w:bottom w:val="single" w:sz="4" w:space="0" w:color="CCCCCC"/>
+              <w:right w:val="single" w:sz="4" w:space="0" w:color="CCCCCC"/>
+            </w:tcBorders>
           </w:tcPr>
           <w:p>
+            <w:pPr>
+              <w:spacing w:before="0" w:after="0"/>
+            </w:pPr>
             <w:r>
               <w:rPr>
-                <w:rFonts w:ascii="Calibri" w:hAnsi="Calibri"/>
+                <w:rFonts w:ascii="Arial" w:hAnsi="Arial"/>
                 <w:b/>
-                <w:color w:val="000000"/>
-                <w:sz w:val="16"/>
+                <w:color w:val="444444"/>
+                <w:sz w:val="17"/>
               </w:rPr>
               <w:t>Nachname</w:t>
             </w:r>
@@ -101,50 +131,34 @@
       </w:tr>
       <w:tr>
         <w:trPr>
-          <w:trHeight w:val="396"/>
-          <w:trHeight w:val="396"/>
+          <w:trHeight w:val="360" w:hRule="atLeast"/>
         </w:trPr>
         <w:tc>
           <w:tcPr>
-            <w:tcW w:type="dxa" w:w="4819"/>
-            <w:vAlign w:val="bottom"/>
-          </w:tcPr>
-          <w:p/>
-        </w:tc>
-        <w:tc>
-          <w:tcPr>
-            <w:tcW w:type="dxa" w:w="4819"/>
-            <w:vAlign w:val="bottom"/>
-          </w:tcPr>
-          <w:p/>
-        </w:tc>
-      </w:tr>
-    </w:tbl>
-    <w:p/>
-    <w:tbl>
-      <w:tblPr>
-        <w:tblStyle w:val="TableGrid"/>
-        <w:tblW w:type="auto" w:w="0"/>
-        <w:tblLook w:firstColumn="1" w:firstRow="1" w:lastColumn="0" w:lastRow="0" w:noHBand="0" w:noVBand="1" w:val="04A0"/>
-      </w:tblPr>
-      <w:tblGrid>
-        <w:gridCol w:w="4986"/>
-        <w:gridCol w:w="4986"/>
-      </w:tblGrid>
-      <w:tr>
-        <w:tc>
-          <w:tcPr>
-            <w:tcW w:type="dxa" w:w="4819"/>
-            <w:vAlign w:val="center"/>
-            <w:shd w:val="clear" w:color="auto" w:fill="F8F8F8"/>
+            <w:tcW w:type="dxa" w:w="4986"/>
+            <w:tcMar>
+              <w:top w:w="80" w:type="dxa"/>
+              <w:bottom w:w="80" w:type="dxa"/>
+              <w:left w:w="120" w:type="dxa"/>
+              <w:right w:w="120" w:type="dxa"/>
+            </w:tcMar>
+            <w:tcBorders>
+              <w:top w:val="single" w:sz="4" w:space="0" w:color="CCCCCC"/>
+              <w:left w:val="single" w:sz="4" w:space="0" w:color="CCCCCC"/>
+              <w:bottom w:val="single" w:sz="4" w:space="0" w:color="CCCCCC"/>
+              <w:right w:val="single" w:sz="4" w:space="0" w:color="CCCCCC"/>
+            </w:tcBorders>
           </w:tcPr>
           <w:p>
+            <w:pPr>
+              <w:spacing w:before="0" w:after="0"/>
+            </w:pPr>
             <w:r>
               <w:rPr>
-                <w:rFonts w:ascii="Calibri" w:hAnsi="Calibri"/>
+                <w:rFonts w:ascii="Arial" w:hAnsi="Arial"/>
                 <w:b/>
-                <w:color w:val="000000"/>
-                <w:sz w:val="16"/>
+                <w:color w:val="444444"/>
+                <w:sz w:val="17"/>
               </w:rPr>
               <w:t>Geburtsdatum</w:t>
             </w:r>
@@ -152,17 +166,30 @@
         </w:tc>
         <w:tc>
           <w:tcPr>
-            <w:tcW w:type="dxa" w:w="4819"/>
-            <w:vAlign w:val="center"/>
-            <w:shd w:val="clear" w:color="auto" w:fill="F8F8F8"/>
+            <w:tcW w:type="dxa" w:w="4986"/>
+            <w:tcMar>
+              <w:top w:w="80" w:type="dxa"/>
+              <w:bottom w:w="80" w:type="dxa"/>
+              <w:left w:w="120" w:type="dxa"/>
+              <w:right w:w="120" w:type="dxa"/>
+            </w:tcMar>
+            <w:tcBorders>
+              <w:top w:val="single" w:sz="4" w:space="0" w:color="CCCCCC"/>
+              <w:left w:val="single" w:sz="4" w:space="0" w:color="CCCCCC"/>
+              <w:bottom w:val="single" w:sz="4" w:space="0" w:color="CCCCCC"/>
+              <w:right w:val="single" w:sz="4" w:space="0" w:color="CCCCCC"/>
+            </w:tcBorders>
           </w:tcPr>
           <w:p>
+            <w:pPr>
+              <w:spacing w:before="0" w:after="0"/>
+            </w:pPr>
             <w:r>
               <w:rPr>
-                <w:rFonts w:ascii="Calibri" w:hAnsi="Calibri"/>
+                <w:rFonts w:ascii="Arial" w:hAnsi="Arial"/>
                 <w:b/>
-                <w:color w:val="000000"/>
-                <w:sz w:val="16"/>
+                <w:color w:val="444444"/>
+                <w:sz w:val="17"/>
               </w:rPr>
               <w:t>Geschlecht</w:t>
             </w:r>
@@ -171,49 +198,35 @@
       </w:tr>
       <w:tr>
         <w:trPr>
-          <w:trHeight w:val="396"/>
-          <w:trHeight w:val="396"/>
+          <w:trHeight w:val="400" w:hRule="atLeast"/>
         </w:trPr>
         <w:tc>
           <w:tcPr>
-            <w:tcW w:type="dxa" w:w="4819"/>
-            <w:vAlign w:val="bottom"/>
-          </w:tcPr>
-          <w:p/>
-        </w:tc>
-        <w:tc>
-          <w:tcPr>
-            <w:tcW w:type="dxa" w:w="4819"/>
-            <w:vAlign w:val="bottom"/>
-          </w:tcPr>
-          <w:p/>
-        </w:tc>
-      </w:tr>
-    </w:tbl>
-    <w:p/>
-    <w:tbl>
-      <w:tblPr>
-        <w:tblStyle w:val="TableGrid"/>
-        <w:tblW w:type="auto" w:w="0"/>
-        <w:tblLook w:firstColumn="1" w:firstRow="1" w:lastColumn="0" w:lastRow="0" w:noHBand="0" w:noVBand="1" w:val="04A0"/>
-      </w:tblPr>
-      <w:tblGrid>
-        <w:gridCol w:w="9972"/>
-      </w:tblGrid>
-      <w:tr>
-        <w:tc>
-          <w:tcPr>
-            <w:tcW w:type="dxa" w:w="9638"/>
-            <w:vAlign w:val="center"/>
-            <w:shd w:val="clear" w:color="auto" w:fill="F8F8F8"/>
+            <w:tcW w:type="dxa" w:w="9972"/>
+            <w:gridSpan w:val="2"/>
+            <w:tcMar>
+              <w:top w:w="80" w:type="dxa"/>
+              <w:bottom w:w="80" w:type="dxa"/>
+              <w:left w:w="120" w:type="dxa"/>
+              <w:right w:w="120" w:type="dxa"/>
+            </w:tcMar>
+            <w:tcBorders>
+              <w:top w:val="single" w:sz="4" w:space="0" w:color="CCCCCC"/>
+              <w:left w:val="single" w:sz="4" w:space="0" w:color="CCCCCC"/>
+              <w:bottom w:val="single" w:sz="4" w:space="0" w:color="CCCCCC"/>
+              <w:right w:val="single" w:sz="4" w:space="0" w:color="CCCCCC"/>
+            </w:tcBorders>
           </w:tcPr>
           <w:p>
+            <w:pPr>
+              <w:spacing w:before="0" w:after="0"/>
+            </w:pPr>
             <w:r>
               <w:rPr>
-                <w:rFonts w:ascii="Calibri" w:hAnsi="Calibri"/>
+                <w:rFonts w:ascii="Arial" w:hAnsi="Arial"/>
                 <w:b/>
-                <w:color w:val="000000"/>
-                <w:sz w:val="16"/>
+                <w:color w:val="444444"/>
+                <w:sz w:val="17"/>
               </w:rPr>
               <w:t>Adresse  (Straße, PLZ, Ort)</w:t>
             </w:r>
@@ -222,22 +235,96 @@
       </w:tr>
       <w:tr>
         <w:trPr>
-          <w:trHeight w:val="396"/>
+          <w:trHeight w:val="360" w:hRule="atLeast"/>
         </w:trPr>
         <w:tc>
           <w:tcPr>
-            <w:tcW w:type="dxa" w:w="9638"/>
-            <w:vAlign w:val="bottom"/>
+            <w:tcW w:type="dxa" w:w="4986"/>
+            <w:tcMar>
+              <w:top w:w="80" w:type="dxa"/>
+              <w:bottom w:w="80" w:type="dxa"/>
+              <w:left w:w="120" w:type="dxa"/>
+              <w:right w:w="120" w:type="dxa"/>
+            </w:tcMar>
+            <w:tcBorders>
+              <w:top w:val="single" w:sz="4" w:space="0" w:color="CCCCCC"/>
+              <w:left w:val="single" w:sz="4" w:space="0" w:color="CCCCCC"/>
+              <w:bottom w:val="single" w:sz="4" w:space="0" w:color="CCCCCC"/>
+              <w:right w:val="single" w:sz="4" w:space="0" w:color="CCCCCC"/>
+            </w:tcBorders>
           </w:tcPr>
-          <w:p/>
+          <w:p>
+            <w:pPr>
+              <w:spacing w:before="0" w:after="0"/>
+            </w:pPr>
+            <w:r>
+              <w:rPr>
+                <w:rFonts w:ascii="Arial" w:hAnsi="Arial"/>
+                <w:b/>
+                <w:color w:val="444444"/>
+                <w:sz w:val="17"/>
+              </w:rPr>
+              <w:t>Telefon</w:t>
+            </w:r>
+          </w:p>
+        </w:tc>
+        <w:tc>
+          <w:tcPr>
+            <w:tcW w:type="dxa" w:w="4986"/>
+            <w:tcMar>
+              <w:top w:w="80" w:type="dxa"/>
+              <w:bottom w:w="80" w:type="dxa"/>
+              <w:left w:w="120" w:type="dxa"/>
+              <w:right w:w="120" w:type="dxa"/>
+            </w:tcMar>
+            <w:tcBorders>
+              <w:top w:val="single" w:sz="4" w:space="0" w:color="CCCCCC"/>
+              <w:left w:val="single" w:sz="4" w:space="0" w:color="CCCCCC"/>
+              <w:bottom w:val="single" w:sz="4" w:space="0" w:color="CCCCCC"/>
+              <w:right w:val="single" w:sz="4" w:space="0" w:color="CCCCCC"/>
+            </w:tcBorders>
+          </w:tcPr>
+          <w:p>
+            <w:pPr>
+              <w:spacing w:before="0" w:after="0"/>
+            </w:pPr>
+            <w:r>
+              <w:rPr>
+                <w:rFonts w:ascii="Arial" w:hAnsi="Arial"/>
+                <w:b/>
+                <w:color w:val="444444"/>
+                <w:sz w:val="17"/>
+              </w:rPr>
+              <w:t>E-Mail</w:t>
+            </w:r>
+          </w:p>
         </w:tc>
       </w:tr>
     </w:tbl>
-    <w:p/>
+    <w:p>
+      <w:pPr>
+        <w:spacing w:before="200" w:after="80"/>
+        <w:shd w:val="clear" w:color="auto" w:fill="D6E4F0"/>
+        <w:pBdr>
+          <w:left w:val="single" w:sz="18" w:space="6" w:color="2E74B5"/>
+        </w:pBdr>
+      </w:pPr>
+      <w:r>
+        <w:rPr>
+          <w:rFonts w:ascii="Arial" w:hAnsi="Arial"/>
+          <w:b/>
+          <w:i w:val="0"/>
+          <w:color w:val="2E74B5"/>
+          <w:sz w:val="22"/>
+        </w:rPr>
+        <w:t xml:space="preserve">  2  ·  Krankenversicherung</w:t>
+      </w:r>
+    </w:p>
     <w:tbl>
       <w:tblPr>
         <w:tblStyle w:val="TableGrid"/>
         <w:tblW w:type="auto" w:w="0"/>
+        <w:tblLayout w:type="fixed"/>
         <w:tblLook w:firstColumn="1" w:firstRow="1" w:lastColumn="0" w:lastRow="0" w:noHBand="0" w:noVBand="1" w:val="04A0"/>
       </w:tblPr>
       <w:tblGrid>
@@ -245,150 +332,70 @@
         <w:gridCol w:w="4986"/>
       </w:tblGrid>
       <w:tr>
+        <w:trPr>
+          <w:trHeight w:val="360" w:hRule="atLeast"/>
+        </w:trPr>
         <w:tc>
           <w:tcPr>
-            <w:tcW w:type="dxa" w:w="4819"/>
-            <w:vAlign w:val="center"/>
-            <w:shd w:val="clear" w:color="auto" w:fill="F8F8F8"/>
+            <w:tcW w:type="dxa" w:w="9972"/>
+            <w:gridSpan w:val="2"/>
+            <w:tcMar>
+              <w:top w:w="80" w:type="dxa"/>
+              <w:bottom w:w="80" w:type="dxa"/>
+              <w:left w:w="120" w:type="dxa"/>
+              <w:right w:w="120" w:type="dxa"/>
+            </w:tcMar>
+            <w:tcBorders>
+              <w:top w:val="single" w:sz="4" w:space="0" w:color="CCCCCC"/>
+              <w:left w:val="single" w:sz="4" w:space="0" w:color="CCCCCC"/>
+              <w:bottom w:val="single" w:sz="4" w:space="0" w:color="CCCCCC"/>
+              <w:right w:val="single" w:sz="4" w:space="0" w:color="CCCCCC"/>
+            </w:tcBorders>
           </w:tcPr>
           <w:p>
+            <w:pPr>
+              <w:spacing w:before="0" w:after="0"/>
+            </w:pPr>
             <w:r>
               <w:rPr>
-                <w:rFonts w:ascii="Calibri" w:hAnsi="Calibri"/>
-                <w:b/>
-                <w:color w:val="000000"/>
-                <w:sz w:val="16"/>
+                <w:rFonts w:ascii="Arial" w:hAnsi="Arial"/>
+                <w:sz w:val="19"/>
               </w:rPr>
-              <w:t>Telefon</w:t>
-            </w:r>
-          </w:p>
-        </w:tc>
-        <w:tc>
-          <w:tcPr>
-            <w:tcW w:type="dxa" w:w="4819"/>
-            <w:vAlign w:val="center"/>
-            <w:shd w:val="clear" w:color="auto" w:fill="F8F8F8"/>
-          </w:tcPr>
-          <w:p>
-            <w:r>
-              <w:rPr>
-                <w:rFonts w:ascii="Calibri" w:hAnsi="Calibri"/>
-                <w:b/>
-                <w:color w:val="000000"/>
-                <w:sz w:val="16"/>
-              </w:rPr>
-              <w:t>E-Mail</w:t>
+              <w:t>Versicherungsart:    ☐ Privatpatient / -in    ☐ Beihilfe (Beamte)    ☐ Selbstzahler / -in</w:t>
             </w:r>
           </w:p>
         </w:tc>
       </w:tr>
       <w:tr>
         <w:trPr>
-          <w:trHeight w:val="396"/>
-          <w:trHeight w:val="396"/>
+          <w:trHeight w:val="360" w:hRule="atLeast"/>
         </w:trPr>
         <w:tc>
           <w:tcPr>
-            <w:tcW w:type="dxa" w:w="4819"/>
-            <w:vAlign w:val="bottom"/>
-          </w:tcPr>
-          <w:p/>
-        </w:tc>
-        <w:tc>
-          <w:tcPr>
-            <w:tcW w:type="dxa" w:w="4819"/>
-            <w:vAlign w:val="bottom"/>
-          </w:tcPr>
-          <w:p/>
-        </w:tc>
-      </w:tr>
-    </w:tbl>
-    <w:p/>
-    <w:p>
-      <w:pPr>
-        <w:spacing w:before="120" w:after="40"/>
-        <w:jc w:val="left"/>
-        <w:shd w:val="clear" w:color="auto" w:fill="EFEFEF"/>
-        <w:pBdr>
-          <w:bottom w:val="single" w:sz="4" w:space="1" w:color="000000"/>
-        </w:pBdr>
-      </w:pPr>
-      <w:r>
-        <w:rPr>
-          <w:rFonts w:ascii="Calibri" w:hAnsi="Calibri"/>
-          <w:b/>
-          <w:color w:val="000000"/>
-          <w:sz w:val="18"/>
-        </w:rPr>
-        <w:t xml:space="preserve">  2  ·  Krankenversicherung</w:t>
-      </w:r>
-    </w:p>
-    <w:p>
-      <w:pPr>
-        <w:spacing w:before="40" w:after="40"/>
-        <w:jc w:val="left"/>
-      </w:pPr>
-      <w:r>
-        <w:rPr>
-          <w:rFonts w:ascii="Calibri" w:hAnsi="Calibri"/>
-          <w:b/>
-          <w:color w:val="000000"/>
-          <w:sz w:val="18"/>
-        </w:rPr>
-        <w:t xml:space="preserve">Versicherungsart:    </w:t>
-      </w:r>
-      <w:r>
-        <w:rPr>
-          <w:rFonts w:ascii="Calibri" w:hAnsi="Calibri"/>
-          <w:b w:val="0"/>
-          <w:color w:val="000000"/>
-          <w:sz w:val="19"/>
-        </w:rPr>
-        <w:t xml:space="preserve">☐ Privatpatient / -in    </w:t>
-      </w:r>
-      <w:r>
-        <w:rPr>
-          <w:rFonts w:ascii="Calibri" w:hAnsi="Calibri"/>
-          <w:b w:val="0"/>
-          <w:color w:val="000000"/>
-          <w:sz w:val="19"/>
-        </w:rPr>
-        <w:t xml:space="preserve">☐ Beihilfe (Beamte)    </w:t>
-      </w:r>
-      <w:r>
-        <w:rPr>
-          <w:rFonts w:ascii="Calibri" w:hAnsi="Calibri"/>
-          <w:b w:val="0"/>
-          <w:color w:val="000000"/>
-          <w:sz w:val="19"/>
-        </w:rPr>
-        <w:t xml:space="preserve">☐ Selbstzahler / -in    </w:t>
-      </w:r>
-    </w:p>
-    <w:tbl>
-      <w:tblPr>
-        <w:tblStyle w:val="TableGrid"/>
-        <w:tblW w:type="auto" w:w="0"/>
-        <w:tblLook w:firstColumn="1" w:firstRow="1" w:lastColumn="0" w:lastRow="0" w:noHBand="0" w:noVBand="1" w:val="04A0"/>
-      </w:tblPr>
-      <w:tblGrid>
-        <w:gridCol w:w="4986"/>
-        <w:gridCol w:w="4986"/>
-      </w:tblGrid>
-      <w:tr>
-        <w:tc>
-          <w:tcPr>
-            <w:tcW w:type="dxa" w:w="4819"/>
-            <w:vAlign w:val="center"/>
-            <w:shd w:val="clear" w:color="auto" w:fill="F8F8F8"/>
+            <w:tcW w:type="dxa" w:w="4986"/>
+            <w:tcMar>
+              <w:top w:w="80" w:type="dxa"/>
+              <w:bottom w:w="80" w:type="dxa"/>
+              <w:left w:w="120" w:type="dxa"/>
+              <w:right w:w="120" w:type="dxa"/>
+            </w:tcMar>
+            <w:tcBorders>
+              <w:top w:val="single" w:sz="4" w:space="0" w:color="CCCCCC"/>
+              <w:left w:val="single" w:sz="4" w:space="0" w:color="CCCCCC"/>
+              <w:bottom w:val="single" w:sz="4" w:space="0" w:color="CCCCCC"/>
+              <w:right w:val="single" w:sz="4" w:space="0" w:color="CCCCCC"/>
+            </w:tcBorders>
           </w:tcPr>
           <w:p>
+            <w:pPr>
+              <w:spacing w:before="0" w:after="0"/>
+            </w:pPr>
             <w:r>
               <w:rPr>
-                <w:rFonts w:ascii="Calibri" w:hAnsi="Calibri"/>
+                <w:rFonts w:ascii="Arial" w:hAnsi="Arial"/>
                 <w:b/>
-                <w:color w:val="000000"/>
-                <w:sz w:val="16"/>
+                <w:color w:val="444444"/>
+                <w:sz w:val="17"/>
               </w:rPr>
               <w:t>Krankenversicherung (Name)</w:t>
             </w:r>
@@ -396,17 +403,30 @@
         </w:tc>
         <w:tc>
           <w:tcPr>
-            <w:tcW w:type="dxa" w:w="4819"/>
-            <w:vAlign w:val="center"/>
-            <w:shd w:val="clear" w:color="auto" w:fill="F8F8F8"/>
+            <w:tcW w:type="dxa" w:w="4986"/>
+            <w:tcMar>
+              <w:top w:w="80" w:type="dxa"/>
+              <w:bottom w:w="80" w:type="dxa"/>
+              <w:left w:w="120" w:type="dxa"/>
+              <w:right w:w="120" w:type="dxa"/>
+            </w:tcMar>
+            <w:tcBorders>
+              <w:top w:val="single" w:sz="4" w:space="0" w:color="CCCCCC"/>
+              <w:left w:val="single" w:sz="4" w:space="0" w:color="CCCCCC"/>
+              <w:bottom w:val="single" w:sz="4" w:space="0" w:color="CCCCCC"/>
+              <w:right w:val="single" w:sz="4" w:space="0" w:color="CCCCCC"/>
+            </w:tcBorders>
           </w:tcPr>
           <w:p>
+            <w:pPr>
+              <w:spacing w:before="0" w:after="0"/>
+            </w:pPr>
             <w:r>
               <w:rPr>
-                <w:rFonts w:ascii="Calibri" w:hAnsi="Calibri"/>
+                <w:rFonts w:ascii="Arial" w:hAnsi="Arial"/>
                 <w:b/>
-                <w:color w:val="000000"/>
-                <w:sz w:val="16"/>
+                <w:color w:val="444444"/>
+                <w:sz w:val="17"/>
               </w:rPr>
               <w:t>Versicherungsnummer</w:t>
             </w:r>
@@ -415,50 +435,34 @@
       </w:tr>
       <w:tr>
         <w:trPr>
-          <w:trHeight w:val="396"/>
-          <w:trHeight w:val="396"/>
+          <w:trHeight w:val="360" w:hRule="atLeast"/>
         </w:trPr>
         <w:tc>
           <w:tcPr>
-            <w:tcW w:type="dxa" w:w="4819"/>
-            <w:vAlign w:val="bottom"/>
-          </w:tcPr>
-          <w:p/>
-        </w:tc>
-        <w:tc>
-          <w:tcPr>
-            <w:tcW w:type="dxa" w:w="4819"/>
-            <w:vAlign w:val="bottom"/>
-          </w:tcPr>
-          <w:p/>
-        </w:tc>
-      </w:tr>
-    </w:tbl>
-    <w:p/>
-    <w:tbl>
-      <w:tblPr>
-        <w:tblStyle w:val="TableGrid"/>
-        <w:tblW w:type="auto" w:w="0"/>
-        <w:tblLook w:firstColumn="1" w:firstRow="1" w:lastColumn="0" w:lastRow="0" w:noHBand="0" w:noVBand="1" w:val="04A0"/>
-      </w:tblPr>
-      <w:tblGrid>
-        <w:gridCol w:w="4986"/>
-        <w:gridCol w:w="4986"/>
-      </w:tblGrid>
-      <w:tr>
-        <w:tc>
-          <w:tcPr>
-            <w:tcW w:type="dxa" w:w="4819"/>
-            <w:vAlign w:val="center"/>
-            <w:shd w:val="clear" w:color="auto" w:fill="F8F8F8"/>
+            <w:tcW w:type="dxa" w:w="4986"/>
+            <w:tcMar>
+              <w:top w:w="80" w:type="dxa"/>
+              <w:bottom w:w="80" w:type="dxa"/>
+              <w:left w:w="120" w:type="dxa"/>
+              <w:right w:w="120" w:type="dxa"/>
+            </w:tcMar>
+            <w:tcBorders>
+              <w:top w:val="single" w:sz="4" w:space="0" w:color="CCCCCC"/>
+              <w:left w:val="single" w:sz="4" w:space="0" w:color="CCCCCC"/>
+              <w:bottom w:val="single" w:sz="4" w:space="0" w:color="CCCCCC"/>
+              <w:right w:val="single" w:sz="4" w:space="0" w:color="CCCCCC"/>
+            </w:tcBorders>
           </w:tcPr>
           <w:p>
+            <w:pPr>
+              <w:spacing w:before="0" w:after="0"/>
+            </w:pPr>
             <w:r>
               <w:rPr>
-                <w:rFonts w:ascii="Calibri" w:hAnsi="Calibri"/>
+                <w:rFonts w:ascii="Arial" w:hAnsi="Arial"/>
                 <w:b/>
-                <w:color w:val="000000"/>
-                <w:sz w:val="16"/>
+                <w:color w:val="444444"/>
+                <w:sz w:val="17"/>
               </w:rPr>
               <w:t>Hausarzt (Name)</w:t>
             </w:r>
@@ -466,17 +470,30 @@
         </w:tc>
         <w:tc>
           <w:tcPr>
-            <w:tcW w:type="dxa" w:w="4819"/>
-            <w:vAlign w:val="center"/>
-            <w:shd w:val="clear" w:color="auto" w:fill="F8F8F8"/>
+            <w:tcW w:type="dxa" w:w="4986"/>
+            <w:tcMar>
+              <w:top w:w="80" w:type="dxa"/>
+              <w:bottom w:w="80" w:type="dxa"/>
+              <w:left w:w="120" w:type="dxa"/>
+              <w:right w:w="120" w:type="dxa"/>
+            </w:tcMar>
+            <w:tcBorders>
+              <w:top w:val="single" w:sz="4" w:space="0" w:color="CCCCCC"/>
+              <w:left w:val="single" w:sz="4" w:space="0" w:color="CCCCCC"/>
+              <w:bottom w:val="single" w:sz="4" w:space="0" w:color="CCCCCC"/>
+              <w:right w:val="single" w:sz="4" w:space="0" w:color="CCCCCC"/>
+            </w:tcBorders>
           </w:tcPr>
           <w:p>
+            <w:pPr>
+              <w:spacing w:before="0" w:after="0"/>
+            </w:pPr>
             <w:r>
               <w:rPr>
-                <w:rFonts w:ascii="Calibri" w:hAnsi="Calibri"/>
+                <w:rFonts w:ascii="Arial" w:hAnsi="Arial"/>
                 <w:b/>
-                <w:color w:val="000000"/>
-                <w:sz w:val="16"/>
+                <w:color w:val="444444"/>
+                <w:sz w:val="17"/>
               </w:rPr>
               <w:t>Telefon Hausarzt</w:t>
             </w:r>
@@ -485,74 +502,55 @@
       </w:tr>
       <w:tr>
         <w:trPr>
-          <w:trHeight w:val="396"/>
-          <w:trHeight w:val="396"/>
+          <w:trHeight w:val="360" w:hRule="atLeast"/>
         </w:trPr>
         <w:tc>
           <w:tcPr>
-            <w:tcW w:type="dxa" w:w="4819"/>
-            <w:vAlign w:val="bottom"/>
+            <w:tcW w:type="dxa" w:w="9972"/>
+            <w:gridSpan w:val="2"/>
+            <w:tcMar>
+              <w:top w:w="80" w:type="dxa"/>
+              <w:bottom w:w="80" w:type="dxa"/>
+              <w:left w:w="120" w:type="dxa"/>
+              <w:right w:w="120" w:type="dxa"/>
+            </w:tcMar>
+            <w:tcBorders>
+              <w:top w:val="single" w:sz="4" w:space="0" w:color="CCCCCC"/>
+              <w:left w:val="single" w:sz="4" w:space="0" w:color="CCCCCC"/>
+              <w:bottom w:val="single" w:sz="4" w:space="0" w:color="CCCCCC"/>
+              <w:right w:val="single" w:sz="4" w:space="0" w:color="CCCCCC"/>
+            </w:tcBorders>
           </w:tcPr>
-          <w:p/>
-        </w:tc>
-        <w:tc>
-          <w:tcPr>
-            <w:tcW w:type="dxa" w:w="4819"/>
-            <w:vAlign w:val="bottom"/>
-          </w:tcPr>
-          <w:p/>
+          <w:p>
+            <w:pPr>
+              <w:spacing w:before="0" w:after="0"/>
+            </w:pPr>
+            <w:r>
+              <w:rPr>
+                <w:rFonts w:ascii="Arial" w:hAnsi="Arial"/>
+                <w:sz w:val="19"/>
+              </w:rPr>
+              <w:t>Liegt ein ärztliches Rezept vor?    ☐ Ja    ☐ Nein</w:t>
+            </w:r>
+          </w:p>
         </w:tc>
       </w:tr>
     </w:tbl>
-    <w:p/>
     <w:p>
       <w:pPr>
-        <w:spacing w:before="40" w:after="80"/>
-        <w:jc w:val="left"/>
-      </w:pPr>
-      <w:r>
-        <w:rPr>
-          <w:rFonts w:ascii="Calibri" w:hAnsi="Calibri"/>
-          <w:b/>
-          <w:color w:val="000000"/>
-          <w:sz w:val="18"/>
-        </w:rPr>
-        <w:t xml:space="preserve">Liegt ein ärztliches Rezept vor?    </w:t>
-      </w:r>
-      <w:r>
-        <w:rPr>
-          <w:rFonts w:ascii="Calibri" w:hAnsi="Calibri"/>
-          <w:b w:val="0"/>
-          <w:color w:val="000000"/>
-          <w:sz w:val="19"/>
-        </w:rPr>
-        <w:t xml:space="preserve">☐ Ja    </w:t>
-      </w:r>
-      <w:r>
-        <w:rPr>
-          <w:rFonts w:ascii="Calibri" w:hAnsi="Calibri"/>
-          <w:b w:val="0"/>
-          <w:color w:val="000000"/>
-          <w:sz w:val="19"/>
-        </w:rPr>
-        <w:t xml:space="preserve">☐ Nein    </w:t>
-      </w:r>
-    </w:p>
-    <w:p>
-      <w:pPr>
-        <w:spacing w:before="120" w:after="40"/>
-        <w:jc w:val="left"/>
-        <w:shd w:val="clear" w:color="auto" w:fill="EFEFEF"/>
+        <w:spacing w:before="200" w:after="80"/>
+        <w:shd w:val="clear" w:color="auto" w:fill="D6E4F0"/>
         <w:pBdr>
-          <w:bottom w:val="single" w:sz="4" w:space="1" w:color="000000"/>
+          <w:left w:val="single" w:sz="18" w:space="6" w:color="2E74B5"/>
         </w:pBdr>
       </w:pPr>
       <w:r>
         <w:rPr>
-          <w:rFonts w:ascii="Calibri" w:hAnsi="Calibri"/>
+          <w:rFonts w:ascii="Arial" w:hAnsi="Arial"/>
           <w:b/>
-          <w:color w:val="000000"/>
-          <w:sz w:val="18"/>
+          <w:i w:val="0"/>
+          <w:color w:val="2E74B5"/>
+          <w:sz w:val="22"/>
         </w:rPr>
         <w:t xml:space="preserve">  3  ·  Aktuelle Beschwerden</w:t>
       </w:r>
@@ -561,25 +559,44 @@
       <w:tblPr>
         <w:tblStyle w:val="TableGrid"/>
         <w:tblW w:type="auto" w:w="0"/>
+        <w:tblLayout w:type="fixed"/>
         <w:tblLook w:firstColumn="1" w:firstRow="1" w:lastColumn="0" w:lastRow="0" w:noHBand="0" w:noVBand="1" w:val="04A0"/>
       </w:tblPr>
       <w:tblGrid>
-        <w:gridCol w:w="9972"/>
+        <w:gridCol w:w="4986"/>
+        <w:gridCol w:w="4986"/>
       </w:tblGrid>
       <w:tr>
+        <w:trPr>
+          <w:trHeight w:val="700" w:hRule="atLeast"/>
+        </w:trPr>
         <w:tc>
           <w:tcPr>
-            <w:tcW w:type="dxa" w:w="9638"/>
-            <w:vAlign w:val="center"/>
-            <w:shd w:val="clear" w:color="auto" w:fill="F8F8F8"/>
+            <w:tcW w:type="dxa" w:w="9972"/>
+            <w:gridSpan w:val="2"/>
+            <w:tcMar>
+              <w:top w:w="80" w:type="dxa"/>
+              <w:bottom w:w="80" w:type="dxa"/>
+              <w:left w:w="120" w:type="dxa"/>
+              <w:right w:w="120" w:type="dxa"/>
+            </w:tcMar>
+            <w:tcBorders>
+              <w:top w:val="single" w:sz="4" w:space="0" w:color="CCCCCC"/>
+              <w:left w:val="single" w:sz="4" w:space="0" w:color="CCCCCC"/>
+              <w:bottom w:val="single" w:sz="4" w:space="0" w:color="CCCCCC"/>
+              <w:right w:val="single" w:sz="4" w:space="0" w:color="CCCCCC"/>
+            </w:tcBorders>
           </w:tcPr>
           <w:p>
+            <w:pPr>
+              <w:spacing w:before="0" w:after="0"/>
+            </w:pPr>
             <w:r>
               <w:rPr>
-                <w:rFonts w:ascii="Calibri" w:hAnsi="Calibri"/>
+                <w:rFonts w:ascii="Arial" w:hAnsi="Arial"/>
                 <w:b/>
-                <w:color w:val="000000"/>
-                <w:sz w:val="16"/>
+                <w:color w:val="444444"/>
+                <w:sz w:val="17"/>
               </w:rPr>
               <w:t>Hauptbeschwerde / Diagnose</w:t>
             </w:r>
@@ -588,42 +605,34 @@
       </w:tr>
       <w:tr>
         <w:trPr>
-          <w:trHeight w:val="850"/>
+          <w:trHeight w:val="440" w:hRule="atLeast"/>
         </w:trPr>
         <w:tc>
           <w:tcPr>
-            <w:tcW w:type="dxa" w:w="9638"/>
-            <w:vAlign w:val="bottom"/>
-          </w:tcPr>
-          <w:p/>
-        </w:tc>
-      </w:tr>
-    </w:tbl>
-    <w:p/>
-    <w:tbl>
-      <w:tblPr>
-        <w:tblStyle w:val="TableGrid"/>
-        <w:tblW w:type="auto" w:w="0"/>
-        <w:tblLook w:firstColumn="1" w:firstRow="1" w:lastColumn="0" w:lastRow="0" w:noHBand="0" w:noVBand="1" w:val="04A0"/>
-      </w:tblPr>
-      <w:tblGrid>
-        <w:gridCol w:w="4986"/>
-        <w:gridCol w:w="4986"/>
-      </w:tblGrid>
-      <w:tr>
-        <w:tc>
-          <w:tcPr>
-            <w:tcW w:type="dxa" w:w="4819"/>
-            <w:vAlign w:val="center"/>
-            <w:shd w:val="clear" w:color="auto" w:fill="F8F8F8"/>
+            <w:tcW w:type="dxa" w:w="4986"/>
+            <w:tcMar>
+              <w:top w:w="80" w:type="dxa"/>
+              <w:bottom w:w="80" w:type="dxa"/>
+              <w:left w:w="120" w:type="dxa"/>
+              <w:right w:w="120" w:type="dxa"/>
+            </w:tcMar>
+            <w:tcBorders>
+              <w:top w:val="single" w:sz="4" w:space="0" w:color="CCCCCC"/>
+              <w:left w:val="single" w:sz="4" w:space="0" w:color="CCCCCC"/>
+              <w:bottom w:val="single" w:sz="4" w:space="0" w:color="CCCCCC"/>
+              <w:right w:val="single" w:sz="4" w:space="0" w:color="CCCCCC"/>
+            </w:tcBorders>
           </w:tcPr>
           <w:p>
+            <w:pPr>
+              <w:spacing w:before="0" w:after="0"/>
+            </w:pPr>
             <w:r>
               <w:rPr>
-                <w:rFonts w:ascii="Calibri" w:hAnsi="Calibri"/>
+                <w:rFonts w:ascii="Arial" w:hAnsi="Arial"/>
                 <w:b/>
-                <w:color w:val="000000"/>
-                <w:sz w:val="16"/>
+                <w:color w:val="444444"/>
+                <w:sz w:val="17"/>
               </w:rPr>
               <w:t>Seit wann bestehen die Beschwerden?</w:t>
             </w:r>
@@ -631,17 +640,30 @@
         </w:tc>
         <w:tc>
           <w:tcPr>
-            <w:tcW w:type="dxa" w:w="4819"/>
-            <w:vAlign w:val="center"/>
-            <w:shd w:val="clear" w:color="auto" w:fill="F8F8F8"/>
+            <w:tcW w:type="dxa" w:w="4986"/>
+            <w:tcMar>
+              <w:top w:w="80" w:type="dxa"/>
+              <w:bottom w:w="80" w:type="dxa"/>
+              <w:left w:w="120" w:type="dxa"/>
+              <w:right w:w="120" w:type="dxa"/>
+            </w:tcMar>
+            <w:tcBorders>
+              <w:top w:val="single" w:sz="4" w:space="0" w:color="CCCCCC"/>
+              <w:left w:val="single" w:sz="4" w:space="0" w:color="CCCCCC"/>
+              <w:bottom w:val="single" w:sz="4" w:space="0" w:color="CCCCCC"/>
+              <w:right w:val="single" w:sz="4" w:space="0" w:color="CCCCCC"/>
+            </w:tcBorders>
           </w:tcPr>
           <w:p>
+            <w:pPr>
+              <w:spacing w:before="0" w:after="0"/>
+            </w:pPr>
             <w:r>
               <w:rPr>
-                <w:rFonts w:ascii="Calibri" w:hAnsi="Calibri"/>
+                <w:rFonts w:ascii="Arial" w:hAnsi="Arial"/>
                 <w:b/>
-                <w:color w:val="000000"/>
-                <w:sz w:val="16"/>
+                <w:color w:val="444444"/>
+                <w:sz w:val="17"/>
               </w:rPr>
               <w:t>Wie haben sie begonnen?</w:t>
             </w:r>
@@ -650,298 +672,125 @@
       </w:tr>
       <w:tr>
         <w:trPr>
-          <w:trHeight w:val="396"/>
-          <w:trHeight w:val="396"/>
+          <w:trHeight w:val="360" w:hRule="atLeast"/>
         </w:trPr>
         <w:tc>
           <w:tcPr>
-            <w:tcW w:type="dxa" w:w="4819"/>
-            <w:vAlign w:val="bottom"/>
+            <w:tcW w:type="dxa" w:w="9972"/>
+            <w:gridSpan w:val="2"/>
+            <w:tcMar>
+              <w:top w:w="80" w:type="dxa"/>
+              <w:bottom w:w="80" w:type="dxa"/>
+              <w:left w:w="120" w:type="dxa"/>
+              <w:right w:w="120" w:type="dxa"/>
+            </w:tcMar>
+            <w:tcBorders>
+              <w:top w:val="single" w:sz="4" w:space="0" w:color="CCCCCC"/>
+              <w:left w:val="single" w:sz="4" w:space="0" w:color="CCCCCC"/>
+              <w:bottom w:val="single" w:sz="4" w:space="0" w:color="CCCCCC"/>
+              <w:right w:val="single" w:sz="4" w:space="0" w:color="CCCCCC"/>
+            </w:tcBorders>
           </w:tcPr>
-          <w:p/>
+          <w:p>
+            <w:pPr>
+              <w:spacing w:before="0" w:after="0"/>
+            </w:pPr>
+            <w:r>
+              <w:rPr>
+                <w:rFonts w:ascii="Arial" w:hAnsi="Arial"/>
+                <w:sz w:val="19"/>
+              </w:rPr>
+              <w:t>Schmerzstärke  (0 = kein Schmerz · 10 = stärkster Schmerz):      0    1    2    3    4    5    6    7    8    9    10</w:t>
+            </w:r>
+          </w:p>
         </w:tc>
+      </w:tr>
+      <w:tr>
+        <w:trPr>
+          <w:trHeight w:val="360" w:hRule="atLeast"/>
+        </w:trPr>
         <w:tc>
           <w:tcPr>
-            <w:tcW w:type="dxa" w:w="4819"/>
-            <w:vAlign w:val="bottom"/>
+            <w:tcW w:type="dxa" w:w="9972"/>
+            <w:gridSpan w:val="2"/>
+            <w:tcMar>
+              <w:top w:w="80" w:type="dxa"/>
+              <w:bottom w:w="80" w:type="dxa"/>
+              <w:left w:w="120" w:type="dxa"/>
+              <w:right w:w="120" w:type="dxa"/>
+            </w:tcMar>
+            <w:tcBorders>
+              <w:top w:val="single" w:sz="4" w:space="0" w:color="CCCCCC"/>
+              <w:left w:val="single" w:sz="4" w:space="0" w:color="CCCCCC"/>
+              <w:bottom w:val="single" w:sz="4" w:space="0" w:color="CCCCCC"/>
+              <w:right w:val="single" w:sz="4" w:space="0" w:color="CCCCCC"/>
+            </w:tcBorders>
           </w:tcPr>
-          <w:p/>
+          <w:p>
+            <w:pPr>
+              <w:spacing w:before="0" w:after="0"/>
+            </w:pPr>
+            <w:r>
+              <w:rPr>
+                <w:rFonts w:ascii="Arial" w:hAnsi="Arial"/>
+                <w:sz w:val="19"/>
+              </w:rPr>
+              <w:t>Schmerzcharakter:    ☐ dumpf    ☐ stechend    ☐ brennend    ☐ ziehend    ☐ drückend    ☐ anderes: ______________________</w:t>
+            </w:r>
+          </w:p>
+        </w:tc>
+      </w:tr>
+      <w:tr>
+        <w:trPr>
+          <w:trHeight w:val="360" w:hRule="atLeast"/>
+        </w:trPr>
+        <w:tc>
+          <w:tcPr>
+            <w:tcW w:type="dxa" w:w="9972"/>
+            <w:gridSpan w:val="2"/>
+            <w:tcMar>
+              <w:top w:w="80" w:type="dxa"/>
+              <w:bottom w:w="80" w:type="dxa"/>
+              <w:left w:w="120" w:type="dxa"/>
+              <w:right w:w="120" w:type="dxa"/>
+            </w:tcMar>
+            <w:tcBorders>
+              <w:top w:val="single" w:sz="4" w:space="0" w:color="CCCCCC"/>
+              <w:left w:val="single" w:sz="4" w:space="0" w:color="CCCCCC"/>
+              <w:bottom w:val="single" w:sz="4" w:space="0" w:color="CCCCCC"/>
+              <w:right w:val="single" w:sz="4" w:space="0" w:color="CCCCCC"/>
+            </w:tcBorders>
+          </w:tcPr>
+          <w:p>
+            <w:pPr>
+              <w:spacing w:before="0" w:after="0"/>
+            </w:pPr>
+            <w:r>
+              <w:rPr>
+                <w:rFonts w:ascii="Arial" w:hAnsi="Arial"/>
+                <w:sz w:val="19"/>
+              </w:rPr>
+              <w:t>Beschwerden stärker:    ☐ morgens    ☐ tagsüber    ☐ abends    ☐ nachts    ☐ bei Belastung    ☐ in Ruhe</w:t>
+            </w:r>
+          </w:p>
         </w:tc>
       </w:tr>
     </w:tbl>
-    <w:p/>
     <w:p>
       <w:pPr>
-        <w:spacing w:before="60" w:after="20"/>
-        <w:jc w:val="left"/>
-      </w:pPr>
-      <w:r>
-        <w:rPr>
-          <w:rFonts w:ascii="Calibri" w:hAnsi="Calibri"/>
-          <w:b/>
-          <w:color w:val="000000"/>
-          <w:sz w:val="18"/>
-        </w:rPr>
-        <w:t xml:space="preserve">Schmerzstärke  (0 = kein Schmerz · 10 = stärkster Schmerz):    </w:t>
-      </w:r>
-      <w:r>
-        <w:rPr>
-          <w:rFonts w:ascii="Calibri" w:hAnsi="Calibri"/>
-          <w:b w:val="0"/>
-          <w:color w:val="000000"/>
-          <w:sz w:val="18"/>
-        </w:rPr>
-        <w:t xml:space="preserve">  0  </w:t>
-      </w:r>
-      <w:r>
-        <w:rPr>
-          <w:rFonts w:ascii="Calibri" w:hAnsi="Calibri"/>
-          <w:b w:val="0"/>
-          <w:color w:val="000000"/>
-          <w:sz w:val="18"/>
-        </w:rPr>
-        <w:t xml:space="preserve">  1  </w:t>
-      </w:r>
-      <w:r>
-        <w:rPr>
-          <w:rFonts w:ascii="Calibri" w:hAnsi="Calibri"/>
-          <w:b w:val="0"/>
-          <w:color w:val="000000"/>
-          <w:sz w:val="18"/>
-        </w:rPr>
-        <w:t xml:space="preserve">  2  </w:t>
-      </w:r>
-      <w:r>
-        <w:rPr>
-          <w:rFonts w:ascii="Calibri" w:hAnsi="Calibri"/>
-          <w:b w:val="0"/>
-          <w:color w:val="000000"/>
-          <w:sz w:val="18"/>
-        </w:rPr>
-        <w:t xml:space="preserve">  3  </w:t>
-      </w:r>
-      <w:r>
-        <w:rPr>
-          <w:rFonts w:ascii="Calibri" w:hAnsi="Calibri"/>
-          <w:b w:val="0"/>
-          <w:color w:val="000000"/>
-          <w:sz w:val="18"/>
-        </w:rPr>
-        <w:t xml:space="preserve">  4  </w:t>
-      </w:r>
-      <w:r>
-        <w:rPr>
-          <w:rFonts w:ascii="Calibri" w:hAnsi="Calibri"/>
-          <w:b w:val="0"/>
-          <w:color w:val="000000"/>
-          <w:sz w:val="18"/>
-        </w:rPr>
-        <w:t xml:space="preserve">  5  </w:t>
-      </w:r>
-      <w:r>
-        <w:rPr>
-          <w:rFonts w:ascii="Calibri" w:hAnsi="Calibri"/>
-          <w:b w:val="0"/>
-          <w:color w:val="000000"/>
-          <w:sz w:val="18"/>
-        </w:rPr>
-        <w:t xml:space="preserve">  6  </w:t>
-      </w:r>
-      <w:r>
-        <w:rPr>
-          <w:rFonts w:ascii="Calibri" w:hAnsi="Calibri"/>
-          <w:b w:val="0"/>
-          <w:color w:val="000000"/>
-          <w:sz w:val="18"/>
-        </w:rPr>
-        <w:t xml:space="preserve">  7  </w:t>
-      </w:r>
-      <w:r>
-        <w:rPr>
-          <w:rFonts w:ascii="Calibri" w:hAnsi="Calibri"/>
-          <w:b w:val="0"/>
-          <w:color w:val="000000"/>
-          <w:sz w:val="18"/>
-        </w:rPr>
-        <w:t xml:space="preserve">  8  </w:t>
-      </w:r>
-      <w:r>
-        <w:rPr>
-          <w:rFonts w:ascii="Calibri" w:hAnsi="Calibri"/>
-          <w:b w:val="0"/>
-          <w:color w:val="000000"/>
-          <w:sz w:val="18"/>
-        </w:rPr>
-        <w:t xml:space="preserve">  9  </w:t>
-      </w:r>
-      <w:r>
-        <w:rPr>
-          <w:rFonts w:ascii="Calibri" w:hAnsi="Calibri"/>
-          <w:b w:val="0"/>
-          <w:color w:val="000000"/>
-          <w:sz w:val="18"/>
-        </w:rPr>
-        <w:t xml:space="preserve">  10  </w:t>
-      </w:r>
-    </w:p>
-    <w:p>
-      <w:pPr>
-        <w:spacing w:before="60" w:after="40"/>
-        <w:jc w:val="left"/>
-      </w:pPr>
-      <w:r>
-        <w:rPr>
-          <w:rFonts w:ascii="Calibri" w:hAnsi="Calibri"/>
-          <w:b/>
-          <w:color w:val="000000"/>
-          <w:sz w:val="18"/>
-        </w:rPr>
-        <w:t xml:space="preserve">Schmerzcharakter:    </w:t>
-      </w:r>
-      <w:r>
-        <w:rPr>
-          <w:rFonts w:ascii="Calibri" w:hAnsi="Calibri"/>
-          <w:b w:val="0"/>
-          <w:color w:val="000000"/>
-          <w:sz w:val="19"/>
-        </w:rPr>
-        <w:t xml:space="preserve">☐ dumpf    </w:t>
-      </w:r>
-      <w:r>
-        <w:rPr>
-          <w:rFonts w:ascii="Calibri" w:hAnsi="Calibri"/>
-          <w:b w:val="0"/>
-          <w:color w:val="000000"/>
-          <w:sz w:val="19"/>
-        </w:rPr>
-        <w:t xml:space="preserve">☐ stechend    </w:t>
-      </w:r>
-      <w:r>
-        <w:rPr>
-          <w:rFonts w:ascii="Calibri" w:hAnsi="Calibri"/>
-          <w:b w:val="0"/>
-          <w:color w:val="000000"/>
-          <w:sz w:val="19"/>
-        </w:rPr>
-        <w:t xml:space="preserve">☐ brennend    </w:t>
-      </w:r>
-      <w:r>
-        <w:rPr>
-          <w:rFonts w:ascii="Calibri" w:hAnsi="Calibri"/>
-          <w:b w:val="0"/>
-          <w:color w:val="000000"/>
-          <w:sz w:val="19"/>
-        </w:rPr>
-        <w:t xml:space="preserve">☐ ziehend    </w:t>
-      </w:r>
-      <w:r>
-        <w:rPr>
-          <w:rFonts w:ascii="Calibri" w:hAnsi="Calibri"/>
-          <w:b w:val="0"/>
-          <w:color w:val="000000"/>
-          <w:sz w:val="19"/>
-        </w:rPr>
-        <w:t xml:space="preserve">☐ drückend    </w:t>
-      </w:r>
-      <w:r>
-        <w:rPr>
-          <w:rFonts w:ascii="Calibri" w:hAnsi="Calibri"/>
-          <w:b w:val="0"/>
-          <w:color w:val="000000"/>
-          <w:sz w:val="19"/>
-        </w:rPr>
-        <w:t>☐ anderes: ______________________</w:t>
-      </w:r>
-    </w:p>
-    <w:p>
-      <w:pPr>
-        <w:spacing w:before="60" w:after="80"/>
-        <w:jc w:val="left"/>
-      </w:pPr>
-      <w:r>
-        <w:rPr>
-          <w:rFonts w:ascii="Calibri" w:hAnsi="Calibri"/>
-          <w:b/>
-          <w:color w:val="000000"/>
-          <w:sz w:val="18"/>
-        </w:rPr>
-        <w:t xml:space="preserve">Beschwerden stärker:    </w:t>
-      </w:r>
-      <w:r>
-        <w:rPr>
-          <w:rFonts w:ascii="Calibri" w:hAnsi="Calibri"/>
-          <w:b w:val="0"/>
-          <w:color w:val="000000"/>
-          <w:sz w:val="19"/>
-        </w:rPr>
-        <w:t xml:space="preserve">☐ morgens    </w:t>
-      </w:r>
-      <w:r>
-        <w:rPr>
-          <w:rFonts w:ascii="Calibri" w:hAnsi="Calibri"/>
-          <w:b w:val="0"/>
-          <w:color w:val="000000"/>
-          <w:sz w:val="19"/>
-        </w:rPr>
-        <w:t xml:space="preserve">☐ tagsüber    </w:t>
-      </w:r>
-      <w:r>
-        <w:rPr>
-          <w:rFonts w:ascii="Calibri" w:hAnsi="Calibri"/>
-          <w:b w:val="0"/>
-          <w:color w:val="000000"/>
-          <w:sz w:val="19"/>
-        </w:rPr>
-        <w:t xml:space="preserve">☐ abends    </w:t>
-      </w:r>
-      <w:r>
-        <w:rPr>
-          <w:rFonts w:ascii="Calibri" w:hAnsi="Calibri"/>
-          <w:b w:val="0"/>
-          <w:color w:val="000000"/>
-          <w:sz w:val="19"/>
-        </w:rPr>
-        <w:t xml:space="preserve">☐ nachts    </w:t>
-      </w:r>
-      <w:r>
-        <w:rPr>
-          <w:rFonts w:ascii="Calibri" w:hAnsi="Calibri"/>
-          <w:b w:val="0"/>
-          <w:color w:val="000000"/>
-          <w:sz w:val="19"/>
-        </w:rPr>
-        <w:t xml:space="preserve">☐ bei Belastung    </w:t>
-      </w:r>
-      <w:r>
-        <w:rPr>
-          <w:rFonts w:ascii="Calibri" w:hAnsi="Calibri"/>
-          <w:b w:val="0"/>
-          <w:color w:val="000000"/>
-          <w:sz w:val="19"/>
-        </w:rPr>
-        <w:t xml:space="preserve">☐ in Ruhe    </w:t>
-      </w:r>
-    </w:p>
-    <w:p>
-      <w:r>
-        <w:br w:type="page"/>
-      </w:r>
-    </w:p>
-    <w:p>
-      <w:pPr>
-        <w:spacing w:before="120" w:after="40"/>
-        <w:jc w:val="left"/>
-        <w:shd w:val="clear" w:color="auto" w:fill="EFEFEF"/>
+        <w:spacing w:before="200" w:after="80"/>
+        <w:shd w:val="clear" w:color="auto" w:fill="D6E4F0"/>
         <w:pBdr>
-          <w:bottom w:val="single" w:sz="4" w:space="1" w:color="000000"/>
+          <w:left w:val="single" w:sz="18" w:space="6" w:color="2E74B5"/>
         </w:pBdr>
       </w:pPr>
       <w:r>
         <w:rPr>
-          <w:rFonts w:ascii="Calibri" w:hAnsi="Calibri"/>
+          <w:rFonts w:ascii="Arial" w:hAnsi="Arial"/>
           <w:b/>
-          <w:color w:val="000000"/>
-          <w:sz w:val="18"/>
+          <w:i w:val="0"/>
+          <w:color w:val="2E74B5"/>
+          <w:sz w:val="22"/>
         </w:rPr>
         <w:t xml:space="preserve">  4  ·  Medizinische Vorgeschichte</w:t>
       </w:r>
@@ -950,25 +799,44 @@
       <w:tblPr>
         <w:tblStyle w:val="TableGrid"/>
         <w:tblW w:type="auto" w:w="0"/>
+        <w:tblLayout w:type="fixed"/>
         <w:tblLook w:firstColumn="1" w:firstRow="1" w:lastColumn="0" w:lastRow="0" w:noHBand="0" w:noVBand="1" w:val="04A0"/>
       </w:tblPr>
       <w:tblGrid>
-        <w:gridCol w:w="9972"/>
+        <w:gridCol w:w="4986"/>
+        <w:gridCol w:w="4986"/>
       </w:tblGrid>
       <w:tr>
+        <w:trPr>
+          <w:trHeight w:val="560" w:hRule="atLeast"/>
+        </w:trPr>
         <w:tc>
           <w:tcPr>
-            <w:tcW w:type="dxa" w:w="9638"/>
-            <w:vAlign w:val="center"/>
-            <w:shd w:val="clear" w:color="auto" w:fill="F8F8F8"/>
+            <w:tcW w:type="dxa" w:w="9972"/>
+            <w:gridSpan w:val="2"/>
+            <w:tcMar>
+              <w:top w:w="80" w:type="dxa"/>
+              <w:bottom w:w="80" w:type="dxa"/>
+              <w:left w:w="120" w:type="dxa"/>
+              <w:right w:w="120" w:type="dxa"/>
+            </w:tcMar>
+            <w:tcBorders>
+              <w:top w:val="single" w:sz="4" w:space="0" w:color="CCCCCC"/>
+              <w:left w:val="single" w:sz="4" w:space="0" w:color="CCCCCC"/>
+              <w:bottom w:val="single" w:sz="4" w:space="0" w:color="CCCCCC"/>
+              <w:right w:val="single" w:sz="4" w:space="0" w:color="CCCCCC"/>
+            </w:tcBorders>
           </w:tcPr>
           <w:p>
+            <w:pPr>
+              <w:spacing w:before="0" w:after="0"/>
+            </w:pPr>
             <w:r>
               <w:rPr>
-                <w:rFonts w:ascii="Calibri" w:hAnsi="Calibri"/>
+                <w:rFonts w:ascii="Arial" w:hAnsi="Arial"/>
                 <w:b/>
-                <w:color w:val="000000"/>
-                <w:sz w:val="16"/>
+                <w:color w:val="444444"/>
+                <w:sz w:val="17"/>
               </w:rPr>
               <w:t>Voroperationen</w:t>
             </w:r>
@@ -977,41 +845,35 @@
       </w:tr>
       <w:tr>
         <w:trPr>
-          <w:trHeight w:val="567"/>
+          <w:trHeight w:val="560" w:hRule="atLeast"/>
         </w:trPr>
         <w:tc>
           <w:tcPr>
-            <w:tcW w:type="dxa" w:w="9638"/>
-            <w:vAlign w:val="bottom"/>
-          </w:tcPr>
-          <w:p/>
-        </w:tc>
-      </w:tr>
-    </w:tbl>
-    <w:p/>
-    <w:tbl>
-      <w:tblPr>
-        <w:tblStyle w:val="TableGrid"/>
-        <w:tblW w:type="auto" w:w="0"/>
-        <w:tblLook w:firstColumn="1" w:firstRow="1" w:lastColumn="0" w:lastRow="0" w:noHBand="0" w:noVBand="1" w:val="04A0"/>
-      </w:tblPr>
-      <w:tblGrid>
-        <w:gridCol w:w="9972"/>
-      </w:tblGrid>
-      <w:tr>
-        <w:tc>
-          <w:tcPr>
-            <w:tcW w:type="dxa" w:w="9638"/>
-            <w:vAlign w:val="center"/>
-            <w:shd w:val="clear" w:color="auto" w:fill="F8F8F8"/>
+            <w:tcW w:type="dxa" w:w="9972"/>
+            <w:gridSpan w:val="2"/>
+            <w:tcMar>
+              <w:top w:w="80" w:type="dxa"/>
+              <w:bottom w:w="80" w:type="dxa"/>
+              <w:left w:w="120" w:type="dxa"/>
+              <w:right w:w="120" w:type="dxa"/>
+            </w:tcMar>
+            <w:tcBorders>
+              <w:top w:val="single" w:sz="4" w:space="0" w:color="CCCCCC"/>
+              <w:left w:val="single" w:sz="4" w:space="0" w:color="CCCCCC"/>
+              <w:bottom w:val="single" w:sz="4" w:space="0" w:color="CCCCCC"/>
+              <w:right w:val="single" w:sz="4" w:space="0" w:color="CCCCCC"/>
+            </w:tcBorders>
           </w:tcPr>
           <w:p>
+            <w:pPr>
+              <w:spacing w:before="0" w:after="0"/>
+            </w:pPr>
             <w:r>
               <w:rPr>
-                <w:rFonts w:ascii="Calibri" w:hAnsi="Calibri"/>
+                <w:rFonts w:ascii="Arial" w:hAnsi="Arial"/>
                 <w:b/>
-                <w:color w:val="000000"/>
-                <w:sz w:val="16"/>
+                <w:color w:val="444444"/>
+                <w:sz w:val="17"/>
               </w:rPr>
               <w:t>Vorerkrankungen / chronische Erkrankungen</w:t>
             </w:r>
@@ -1020,41 +882,35 @@
       </w:tr>
       <w:tr>
         <w:trPr>
-          <w:trHeight w:val="567"/>
+          <w:trHeight w:val="560" w:hRule="atLeast"/>
         </w:trPr>
         <w:tc>
           <w:tcPr>
-            <w:tcW w:type="dxa" w:w="9638"/>
-            <w:vAlign w:val="bottom"/>
-          </w:tcPr>
-          <w:p/>
-        </w:tc>
-      </w:tr>
-    </w:tbl>
-    <w:p/>
-    <w:tbl>
-      <w:tblPr>
-        <w:tblStyle w:val="TableGrid"/>
-        <w:tblW w:type="auto" w:w="0"/>
-        <w:tblLook w:firstColumn="1" w:firstRow="1" w:lastColumn="0" w:lastRow="0" w:noHBand="0" w:noVBand="1" w:val="04A0"/>
-      </w:tblPr>
-      <w:tblGrid>
-        <w:gridCol w:w="9972"/>
-      </w:tblGrid>
-      <w:tr>
-        <w:tc>
-          <w:tcPr>
-            <w:tcW w:type="dxa" w:w="9638"/>
-            <w:vAlign w:val="center"/>
-            <w:shd w:val="clear" w:color="auto" w:fill="F8F8F8"/>
+            <w:tcW w:type="dxa" w:w="9972"/>
+            <w:gridSpan w:val="2"/>
+            <w:tcMar>
+              <w:top w:w="80" w:type="dxa"/>
+              <w:bottom w:w="80" w:type="dxa"/>
+              <w:left w:w="120" w:type="dxa"/>
+              <w:right w:w="120" w:type="dxa"/>
+            </w:tcMar>
+            <w:tcBorders>
+              <w:top w:val="single" w:sz="4" w:space="0" w:color="CCCCCC"/>
+              <w:left w:val="single" w:sz="4" w:space="0" w:color="CCCCCC"/>
+              <w:bottom w:val="single" w:sz="4" w:space="0" w:color="CCCCCC"/>
+              <w:right w:val="single" w:sz="4" w:space="0" w:color="CCCCCC"/>
+            </w:tcBorders>
           </w:tcPr>
           <w:p>
+            <w:pPr>
+              <w:spacing w:before="0" w:after="0"/>
+            </w:pPr>
             <w:r>
               <w:rPr>
-                <w:rFonts w:ascii="Calibri" w:hAnsi="Calibri"/>
+                <w:rFonts w:ascii="Arial" w:hAnsi="Arial"/>
                 <w:b/>
-                <w:color w:val="000000"/>
-                <w:sz w:val="16"/>
+                <w:color w:val="444444"/>
+                <w:sz w:val="17"/>
               </w:rPr>
               <w:t>Aktuelle Medikamente</w:t>
             </w:r>
@@ -1063,41 +919,35 @@
       </w:tr>
       <w:tr>
         <w:trPr>
-          <w:trHeight w:val="567"/>
+          <w:trHeight w:val="560" w:hRule="atLeast"/>
         </w:trPr>
         <w:tc>
           <w:tcPr>
-            <w:tcW w:type="dxa" w:w="9638"/>
-            <w:vAlign w:val="bottom"/>
-          </w:tcPr>
-          <w:p/>
-        </w:tc>
-      </w:tr>
-    </w:tbl>
-    <w:p/>
-    <w:tbl>
-      <w:tblPr>
-        <w:tblStyle w:val="TableGrid"/>
-        <w:tblW w:type="auto" w:w="0"/>
-        <w:tblLook w:firstColumn="1" w:firstRow="1" w:lastColumn="0" w:lastRow="0" w:noHBand="0" w:noVBand="1" w:val="04A0"/>
-      </w:tblPr>
-      <w:tblGrid>
-        <w:gridCol w:w="9972"/>
-      </w:tblGrid>
-      <w:tr>
-        <w:tc>
-          <w:tcPr>
-            <w:tcW w:type="dxa" w:w="9638"/>
-            <w:vAlign w:val="center"/>
-            <w:shd w:val="clear" w:color="auto" w:fill="F8F8F8"/>
+            <w:tcW w:type="dxa" w:w="9972"/>
+            <w:gridSpan w:val="2"/>
+            <w:tcMar>
+              <w:top w:w="80" w:type="dxa"/>
+              <w:bottom w:w="80" w:type="dxa"/>
+              <w:left w:w="120" w:type="dxa"/>
+              <w:right w:w="120" w:type="dxa"/>
+            </w:tcMar>
+            <w:tcBorders>
+              <w:top w:val="single" w:sz="4" w:space="0" w:color="CCCCCC"/>
+              <w:left w:val="single" w:sz="4" w:space="0" w:color="CCCCCC"/>
+              <w:bottom w:val="single" w:sz="4" w:space="0" w:color="CCCCCC"/>
+              <w:right w:val="single" w:sz="4" w:space="0" w:color="CCCCCC"/>
+            </w:tcBorders>
           </w:tcPr>
           <w:p>
+            <w:pPr>
+              <w:spacing w:before="0" w:after="0"/>
+            </w:pPr>
             <w:r>
               <w:rPr>
-                <w:rFonts w:ascii="Calibri" w:hAnsi="Calibri"/>
+                <w:rFonts w:ascii="Arial" w:hAnsi="Arial"/>
                 <w:b/>
-                <w:color w:val="000000"/>
-                <w:sz w:val="16"/>
+                <w:color w:val="444444"/>
+                <w:sz w:val="17"/>
               </w:rPr>
               <w:t>Allergien / Unverträglichkeiten</w:t>
             </w:r>
@@ -1106,109 +956,92 @@
       </w:tr>
       <w:tr>
         <w:trPr>
-          <w:trHeight w:val="453"/>
+          <w:trHeight w:val="360" w:hRule="atLeast"/>
         </w:trPr>
         <w:tc>
           <w:tcPr>
-            <w:tcW w:type="dxa" w:w="9638"/>
-            <w:vAlign w:val="bottom"/>
+            <w:tcW w:type="dxa" w:w="9972"/>
+            <w:gridSpan w:val="2"/>
+            <w:tcMar>
+              <w:top w:w="80" w:type="dxa"/>
+              <w:bottom w:w="80" w:type="dxa"/>
+              <w:left w:w="120" w:type="dxa"/>
+              <w:right w:w="120" w:type="dxa"/>
+            </w:tcMar>
+            <w:tcBorders>
+              <w:top w:val="single" w:sz="4" w:space="0" w:color="CCCCCC"/>
+              <w:left w:val="single" w:sz="4" w:space="0" w:color="CCCCCC"/>
+              <w:bottom w:val="single" w:sz="4" w:space="0" w:color="CCCCCC"/>
+              <w:right w:val="single" w:sz="4" w:space="0" w:color="CCCCCC"/>
+            </w:tcBorders>
           </w:tcPr>
-          <w:p/>
+          <w:p>
+            <w:pPr>
+              <w:spacing w:before="0" w:after="0"/>
+            </w:pPr>
+            <w:r>
+              <w:rPr>
+                <w:rFonts w:ascii="Arial" w:hAnsi="Arial"/>
+                <w:sz w:val="19"/>
+              </w:rPr>
+              <w:t>Frühere Physiotherapie?    ☐ Ja    ☐ Nein</w:t>
+            </w:r>
+          </w:p>
         </w:tc>
       </w:tr>
-    </w:tbl>
-    <w:p/>
-    <w:p>
-      <w:pPr>
-        <w:spacing w:before="40" w:after="40"/>
-        <w:jc w:val="left"/>
-      </w:pPr>
-      <w:r>
-        <w:rPr>
-          <w:rFonts w:ascii="Calibri" w:hAnsi="Calibri"/>
-          <w:b/>
-          <w:color w:val="000000"/>
-          <w:sz w:val="18"/>
-        </w:rPr>
-        <w:t xml:space="preserve">Frühere Physiotherapie?    </w:t>
-      </w:r>
-      <w:r>
-        <w:rPr>
-          <w:rFonts w:ascii="Calibri" w:hAnsi="Calibri"/>
-          <w:b w:val="0"/>
-          <w:color w:val="000000"/>
-          <w:sz w:val="19"/>
-        </w:rPr>
-        <w:t xml:space="preserve">☐ Ja    </w:t>
-      </w:r>
-      <w:r>
-        <w:rPr>
-          <w:rFonts w:ascii="Calibri" w:hAnsi="Calibri"/>
-          <w:b w:val="0"/>
-          <w:color w:val="000000"/>
-          <w:sz w:val="19"/>
-        </w:rPr>
-        <w:t xml:space="preserve">☐ Nein    </w:t>
-      </w:r>
-    </w:p>
-    <w:tbl>
-      <w:tblPr>
-        <w:tblStyle w:val="TableGrid"/>
-        <w:tblW w:type="auto" w:w="0"/>
-        <w:tblLook w:firstColumn="1" w:firstRow="1" w:lastColumn="0" w:lastRow="0" w:noHBand="0" w:noVBand="1" w:val="04A0"/>
-      </w:tblPr>
-      <w:tblGrid>
-        <w:gridCol w:w="9972"/>
-      </w:tblGrid>
       <w:tr>
+        <w:trPr>
+          <w:trHeight w:val="480" w:hRule="atLeast"/>
+        </w:trPr>
         <w:tc>
           <w:tcPr>
-            <w:tcW w:type="dxa" w:w="9638"/>
-            <w:vAlign w:val="center"/>
-            <w:shd w:val="clear" w:color="auto" w:fill="F8F8F8"/>
+            <w:tcW w:type="dxa" w:w="9972"/>
+            <w:gridSpan w:val="2"/>
+            <w:tcMar>
+              <w:top w:w="80" w:type="dxa"/>
+              <w:bottom w:w="80" w:type="dxa"/>
+              <w:left w:w="120" w:type="dxa"/>
+              <w:right w:w="120" w:type="dxa"/>
+            </w:tcMar>
+            <w:tcBorders>
+              <w:top w:val="single" w:sz="4" w:space="0" w:color="CCCCCC"/>
+              <w:left w:val="single" w:sz="4" w:space="0" w:color="CCCCCC"/>
+              <w:bottom w:val="single" w:sz="4" w:space="0" w:color="CCCCCC"/>
+              <w:right w:val="single" w:sz="4" w:space="0" w:color="CCCCCC"/>
+            </w:tcBorders>
           </w:tcPr>
           <w:p>
+            <w:pPr>
+              <w:spacing w:before="0" w:after="0"/>
+            </w:pPr>
             <w:r>
               <w:rPr>
-                <w:rFonts w:ascii="Calibri" w:hAnsi="Calibri"/>
+                <w:rFonts w:ascii="Arial" w:hAnsi="Arial"/>
                 <w:b/>
-                <w:color w:val="000000"/>
-                <w:sz w:val="16"/>
+                <w:color w:val="444444"/>
+                <w:sz w:val="17"/>
               </w:rPr>
               <w:t>Wenn ja — wann und weshalb?</w:t>
             </w:r>
           </w:p>
         </w:tc>
       </w:tr>
-      <w:tr>
-        <w:trPr>
-          <w:trHeight w:val="453"/>
-        </w:trPr>
-        <w:tc>
-          <w:tcPr>
-            <w:tcW w:type="dxa" w:w="9638"/>
-            <w:vAlign w:val="bottom"/>
-          </w:tcPr>
-          <w:p/>
-        </w:tc>
-      </w:tr>
     </w:tbl>
-    <w:p/>
     <w:p>
       <w:pPr>
-        <w:spacing w:before="120" w:after="40"/>
-        <w:jc w:val="left"/>
-        <w:shd w:val="clear" w:color="auto" w:fill="EFEFEF"/>
+        <w:spacing w:before="200" w:after="80"/>
+        <w:shd w:val="clear" w:color="auto" w:fill="D6E4F0"/>
         <w:pBdr>
-          <w:bottom w:val="single" w:sz="4" w:space="1" w:color="000000"/>
+          <w:left w:val="single" w:sz="18" w:space="6" w:color="2E74B5"/>
         </w:pBdr>
       </w:pPr>
       <w:r>
         <w:rPr>
-          <w:rFonts w:ascii="Calibri" w:hAnsi="Calibri"/>
+          <w:rFonts w:ascii="Arial" w:hAnsi="Arial"/>
           <w:b/>
-          <w:color w:val="000000"/>
-          <w:sz w:val="18"/>
+          <w:i w:val="0"/>
+          <w:color w:val="2E74B5"/>
+          <w:sz w:val="22"/>
         </w:rPr>
         <w:t xml:space="preserve">  5  ·  Therapieziele</w:t>
       </w:r>
@@ -1217,25 +1050,44 @@
       <w:tblPr>
         <w:tblStyle w:val="TableGrid"/>
         <w:tblW w:type="auto" w:w="0"/>
+        <w:tblLayout w:type="fixed"/>
         <w:tblLook w:firstColumn="1" w:firstRow="1" w:lastColumn="0" w:lastRow="0" w:noHBand="0" w:noVBand="1" w:val="04A0"/>
       </w:tblPr>
       <w:tblGrid>
-        <w:gridCol w:w="9972"/>
+        <w:gridCol w:w="4986"/>
+        <w:gridCol w:w="4986"/>
       </w:tblGrid>
       <w:tr>
+        <w:trPr>
+          <w:trHeight w:val="600" w:hRule="atLeast"/>
+        </w:trPr>
         <w:tc>
           <w:tcPr>
-            <w:tcW w:type="dxa" w:w="9638"/>
-            <w:vAlign w:val="center"/>
-            <w:shd w:val="clear" w:color="auto" w:fill="F8F8F8"/>
+            <w:tcW w:type="dxa" w:w="9972"/>
+            <w:gridSpan w:val="2"/>
+            <w:tcMar>
+              <w:top w:w="80" w:type="dxa"/>
+              <w:bottom w:w="80" w:type="dxa"/>
+              <w:left w:w="120" w:type="dxa"/>
+              <w:right w:w="120" w:type="dxa"/>
+            </w:tcMar>
+            <w:tcBorders>
+              <w:top w:val="single" w:sz="4" w:space="0" w:color="CCCCCC"/>
+              <w:left w:val="single" w:sz="4" w:space="0" w:color="CCCCCC"/>
+              <w:bottom w:val="single" w:sz="4" w:space="0" w:color="CCCCCC"/>
+              <w:right w:val="single" w:sz="4" w:space="0" w:color="CCCCCC"/>
+            </w:tcBorders>
           </w:tcPr>
           <w:p>
+            <w:pPr>
+              <w:spacing w:before="0" w:after="0"/>
+            </w:pPr>
             <w:r>
               <w:rPr>
-                <w:rFonts w:ascii="Calibri" w:hAnsi="Calibri"/>
+                <w:rFonts w:ascii="Arial" w:hAnsi="Arial"/>
                 <w:b/>
-                <w:color w:val="000000"/>
-                <w:sz w:val="16"/>
+                <w:color w:val="444444"/>
+                <w:sz w:val="17"/>
               </w:rPr>
               <w:t>Was möchten Sie durch die Therapie erreichen?</w:t>
             </w:r>
@@ -1244,93 +1096,71 @@
       </w:tr>
       <w:tr>
         <w:trPr>
-          <w:trHeight w:val="680"/>
+          <w:trHeight w:val="560" w:hRule="atLeast"/>
         </w:trPr>
         <w:tc>
           <w:tcPr>
-            <w:tcW w:type="dxa" w:w="9638"/>
-            <w:vAlign w:val="bottom"/>
-          </w:tcPr>
-          <w:p/>
-        </w:tc>
-      </w:tr>
-    </w:tbl>
-    <w:p/>
-    <w:tbl>
-      <w:tblPr>
-        <w:tblStyle w:val="TableGrid"/>
-        <w:tblW w:type="auto" w:w="0"/>
-        <w:tblLook w:firstColumn="1" w:firstRow="1" w:lastColumn="0" w:lastRow="0" w:noHBand="0" w:noVBand="1" w:val="04A0"/>
-      </w:tblPr>
-      <w:tblGrid>
-        <w:gridCol w:w="9972"/>
-      </w:tblGrid>
-      <w:tr>
-        <w:tc>
-          <w:tcPr>
-            <w:tcW w:type="dxa" w:w="9638"/>
-            <w:vAlign w:val="center"/>
-            <w:shd w:val="clear" w:color="auto" w:fill="F8F8F8"/>
+            <w:tcW w:type="dxa" w:w="9972"/>
+            <w:gridSpan w:val="2"/>
+            <w:tcMar>
+              <w:top w:w="80" w:type="dxa"/>
+              <w:bottom w:w="80" w:type="dxa"/>
+              <w:left w:w="120" w:type="dxa"/>
+              <w:right w:w="120" w:type="dxa"/>
+            </w:tcMar>
+            <w:tcBorders>
+              <w:top w:val="single" w:sz="4" w:space="0" w:color="CCCCCC"/>
+              <w:left w:val="single" w:sz="4" w:space="0" w:color="CCCCCC"/>
+              <w:bottom w:val="single" w:sz="4" w:space="0" w:color="CCCCCC"/>
+              <w:right w:val="single" w:sz="4" w:space="0" w:color="CCCCCC"/>
+            </w:tcBorders>
           </w:tcPr>
           <w:p>
+            <w:pPr>
+              <w:spacing w:before="0" w:after="0"/>
+            </w:pPr>
             <w:r>
               <w:rPr>
-                <w:rFonts w:ascii="Calibri" w:hAnsi="Calibri"/>
+                <w:rFonts w:ascii="Arial" w:hAnsi="Arial"/>
                 <w:b/>
-                <w:color w:val="000000"/>
-                <w:sz w:val="16"/>
+                <w:color w:val="444444"/>
+                <w:sz w:val="17"/>
               </w:rPr>
               <w:t>Gibt es Einschränkungen oder Besonderheiten, die ich wissen sollte?</w:t>
             </w:r>
           </w:p>
         </w:tc>
       </w:tr>
-      <w:tr>
-        <w:trPr>
-          <w:trHeight w:val="453"/>
-        </w:trPr>
-        <w:tc>
-          <w:tcPr>
-            <w:tcW w:type="dxa" w:w="9638"/>
-            <w:vAlign w:val="bottom"/>
-          </w:tcPr>
-          <w:p/>
-        </w:tc>
-      </w:tr>
     </w:tbl>
-    <w:p/>
     <w:p>
       <w:pPr>
-        <w:spacing w:before="120" w:after="40"/>
-        <w:jc w:val="left"/>
-        <w:shd w:val="clear" w:color="auto" w:fill="EFEFEF"/>
+        <w:spacing w:before="200" w:after="80"/>
+        <w:shd w:val="clear" w:color="auto" w:fill="D6E4F0"/>
         <w:pBdr>
-          <w:bottom w:val="single" w:sz="4" w:space="1" w:color="000000"/>
+          <w:left w:val="single" w:sz="18" w:space="6" w:color="2E74B5"/>
         </w:pBdr>
       </w:pPr>
       <w:r>
         <w:rPr>
-          <w:rFonts w:ascii="Calibri" w:hAnsi="Calibri"/>
+          <w:rFonts w:ascii="Arial" w:hAnsi="Arial"/>
           <w:b/>
-          <w:color w:val="000000"/>
-          <w:sz w:val="18"/>
+          <w:i w:val="0"/>
+          <w:color w:val="2E74B5"/>
+          <w:sz w:val="22"/>
         </w:rPr>
         <w:t xml:space="preserve">  6  ·  Einwilligung &amp; Unterschrift</w:t>
       </w:r>
     </w:p>
     <w:p>
       <w:pPr>
-        <w:spacing w:before="80" w:after="120"/>
-        <w:jc w:val="left"/>
+        <w:spacing w:before="80" w:after="160"/>
       </w:pPr>
       <w:r>
         <w:rPr>
-          <w:rFonts w:ascii="Calibri" w:hAnsi="Calibri"/>
-          <w:b w:val="0"/>
-          <w:color w:val="000000"/>
-          <w:sz w:val="18"/>
+          <w:rFonts w:ascii="Arial" w:hAnsi="Arial"/>
+          <w:sz w:val="19"/>
         </w:rPr>
-        <w:t>Ich bestätige, dass die oben gemachten Angaben wahrheitsgemäß und vollständig sind. Ich bin damit einverstanden, dass diese Daten im Rahmen der physiotherapeutischen Behandlung verarbeitet und gespeichert werden (Art. 9 Abs. 2 lit. h DSGVO).</w:t>
+        <w:t>Ich bestätige, dass die oben gemachten Angaben wahrheitsgemäß und vollständig sind. Ich bin damit einverstanden, dass diese Daten im Rahmen der physiotherapeutischen Behandlung verarbeitet und gespeichert werden (Art. 9 Abs. 2 lit. h DSGVO).</w:t>
       </w:r>
     </w:p>
     <w:tbl>
@@ -1345,18 +1175,37 @@
         <w:gridCol w:w="3324"/>
       </w:tblGrid>
       <w:tr>
+        <w:trPr>
+          <w:trHeight w:val="700" w:hRule="atLeast"/>
+          <w:trHeight w:val="700" w:hRule="atLeast"/>
+          <w:trHeight w:val="700" w:hRule="atLeast"/>
+        </w:trPr>
         <w:tc>
           <w:tcPr>
-            <w:tcW w:type="dxa" w:w="3213"/>
-            <w:vAlign w:val="center"/>
+            <w:tcW w:type="dxa" w:w="5"/>
+            <w:tcMar>
+              <w:top w:w="80" w:type="dxa"/>
+              <w:bottom w:w="80" w:type="dxa"/>
+              <w:left w:w="120" w:type="dxa"/>
+              <w:right w:w="120" w:type="dxa"/>
+            </w:tcMar>
+            <w:tcBorders>
+              <w:top w:val="single" w:sz="4" w:space="0" w:color="CCCCCC"/>
+              <w:left w:val="single" w:sz="4" w:space="0" w:color="CCCCCC"/>
+              <w:bottom w:val="single" w:sz="4" w:space="0" w:color="CCCCCC"/>
+              <w:right w:val="single" w:sz="4" w:space="0" w:color="CCCCCC"/>
+            </w:tcBorders>
           </w:tcPr>
           <w:p>
+            <w:pPr>
+              <w:spacing w:before="0" w:after="0"/>
+            </w:pPr>
             <w:r>
               <w:rPr>
-                <w:rFonts w:ascii="Calibri" w:hAnsi="Calibri"/>
+                <w:rFonts w:ascii="Arial" w:hAnsi="Arial"/>
                 <w:b/>
-                <w:color w:val="000000"/>
-                <w:sz w:val="16"/>
+                <w:color w:val="444444"/>
+                <w:sz w:val="17"/>
               </w:rPr>
               <w:t>Ort</w:t>
             </w:r>
@@ -1364,16 +1213,30 @@
         </w:tc>
         <w:tc>
           <w:tcPr>
-            <w:tcW w:type="dxa" w:w="3213"/>
-            <w:vAlign w:val="center"/>
+            <w:tcW w:type="dxa" w:w="5"/>
+            <w:tcMar>
+              <w:top w:w="80" w:type="dxa"/>
+              <w:bottom w:w="80" w:type="dxa"/>
+              <w:left w:w="120" w:type="dxa"/>
+              <w:right w:w="120" w:type="dxa"/>
+            </w:tcMar>
+            <w:tcBorders>
+              <w:top w:val="single" w:sz="4" w:space="0" w:color="CCCCCC"/>
+              <w:left w:val="single" w:sz="4" w:space="0" w:color="CCCCCC"/>
+              <w:bottom w:val="single" w:sz="4" w:space="0" w:color="CCCCCC"/>
+              <w:right w:val="single" w:sz="4" w:space="0" w:color="CCCCCC"/>
+            </w:tcBorders>
           </w:tcPr>
           <w:p>
+            <w:pPr>
+              <w:spacing w:before="0" w:after="0"/>
+            </w:pPr>
             <w:r>
               <w:rPr>
-                <w:rFonts w:ascii="Calibri" w:hAnsi="Calibri"/>
+                <w:rFonts w:ascii="Arial" w:hAnsi="Arial"/>
                 <w:b/>
-                <w:color w:val="000000"/>
-                <w:sz w:val="16"/>
+                <w:color w:val="444444"/>
+                <w:sz w:val="17"/>
               </w:rPr>
               <w:t>Datum</w:t>
             </w:r>
@@ -1381,83 +1244,45 @@
         </w:tc>
         <w:tc>
           <w:tcPr>
-            <w:tcW w:type="dxa" w:w="3213"/>
-            <w:vAlign w:val="center"/>
+            <w:tcW w:type="dxa" w:w="5"/>
+            <w:tcMar>
+              <w:top w:w="80" w:type="dxa"/>
+              <w:bottom w:w="80" w:type="dxa"/>
+              <w:left w:w="120" w:type="dxa"/>
+              <w:right w:w="120" w:type="dxa"/>
+            </w:tcMar>
+            <w:tcBorders>
+              <w:top w:val="single" w:sz="4" w:space="0" w:color="CCCCCC"/>
+              <w:left w:val="single" w:sz="4" w:space="0" w:color="CCCCCC"/>
+              <w:bottom w:val="single" w:sz="4" w:space="0" w:color="CCCCCC"/>
+              <w:right w:val="single" w:sz="4" w:space="0" w:color="CCCCCC"/>
+            </w:tcBorders>
           </w:tcPr>
           <w:p>
+            <w:pPr>
+              <w:spacing w:before="0" w:after="0"/>
+            </w:pPr>
             <w:r>
               <w:rPr>
-                <w:rFonts w:ascii="Calibri" w:hAnsi="Calibri"/>
+                <w:rFonts w:ascii="Arial" w:hAnsi="Arial"/>
                 <w:b/>
-                <w:color w:val="000000"/>
-                <w:sz w:val="16"/>
+                <w:color w:val="444444"/>
+                <w:sz w:val="17"/>
               </w:rPr>
               <w:t>Unterschrift Patient / -in</w:t>
             </w:r>
           </w:p>
         </w:tc>
       </w:tr>
-      <w:tr>
-        <w:trPr>
-          <w:trHeight w:val="680"/>
-          <w:trHeight w:val="680"/>
-          <w:trHeight w:val="680"/>
-        </w:trPr>
-        <w:tc>
-          <w:tcPr>
-            <w:tcW w:type="dxa" w:w="3213"/>
-            <w:vAlign w:val="bottom"/>
-          </w:tcPr>
-          <w:p/>
-        </w:tc>
-        <w:tc>
-          <w:tcPr>
-            <w:tcW w:type="dxa" w:w="3213"/>
-            <w:vAlign w:val="bottom"/>
-          </w:tcPr>
-          <w:p/>
-        </w:tc>
-        <w:tc>
-          <w:tcPr>
-            <w:tcW w:type="dxa" w:w="3213"/>
-            <w:vAlign w:val="bottom"/>
-          </w:tcPr>
-          <w:p/>
-        </w:tc>
-      </w:tr>
     </w:tbl>
     <w:sectPr>
-      <w:footerReference w:type="default" r:id="rId9"/>
       <w:pgSz w:w="12240" w:h="15840"/>
-      <w:pgMar w:top="1020" w:right="1134" w:bottom="1020" w:left="1134" w:header="720" w:footer="454" w:gutter="0"/>
+      <w:pgMar w:top="1134" w:right="1134" w:bottom="1134" w:left="1134" w:header="720" w:footer="720" w:gutter="0"/>
       <w:cols w:space="720"/>
       <w:docGrid w:linePitch="360"/>
     </w:sectPr>
   </w:body>
 </w:document>
-</file>
-
-<file path=word/footer1.xml><?xml version="1.0" encoding="utf-8"?>
-<w:ftr xmlns:m="http://schemas.openxmlformats.org/officeDocument/2006/math" xmlns:mc="http://schemas.openxmlformats.org/markup-compatibility/2006" xmlns:mo="http://schemas.microsoft.com/office/mac/office/2008/main" xmlns:mv="urn:schemas-microsoft-com:mac:vml" xmlns:o="urn:schemas-microsoft-com:office:office" xmlns:r="http://schemas.openxmlformats.org/officeDocument/2006/relationships" xmlns:v="urn:schemas-microsoft-com:vml" xmlns:w10="urn:schemas-microsoft-com:office:word" xmlns:w14="http://schemas.microsoft.com/office/word/2010/wordml" xmlns:w="http://schemas.openxmlformats.org/wordprocessingml/2006/main" xmlns:wne="http://schemas.microsoft.com/office/word/2006/wordml" xmlns:wp14="http://schemas.microsoft.com/office/word/2010/wordprocessingDrawing" xmlns:wp="http://schemas.openxmlformats.org/drawingml/2006/wordprocessingDrawing" xmlns:wpc="http://schemas.microsoft.com/office/word/2010/wordprocessingCanvas" xmlns:wpg="http://schemas.microsoft.com/office/word/2010/wordprocessingGroup" xmlns:wpi="http://schemas.microsoft.com/office/word/2010/wordprocessingInk" xmlns:wps="http://schemas.microsoft.com/office/word/2010/wordprocessingShape" mc:Ignorable="w14 wp14">
-  <w:p>
-    <w:pPr>
-      <w:pStyle w:val="Footer"/>
-      <w:jc w:val="center"/>
-      <w:pBdr>
-        <w:top w:val="single" w:sz="4" w:space="1" w:color="AAAAAA"/>
-      </w:pBdr>
-    </w:pPr>
-    <w:r>
-      <w:rPr>
-        <w:rFonts w:ascii="Calibri" w:hAnsi="Calibri"/>
-        <w:b w:val="0"/>
-        <w:color w:val="000000"/>
-        <w:sz w:val="15"/>
-      </w:rPr>
-      <w:t>Mobile Physiotherapie Grausam  ·  Nick Grausam  ·  info@physiotherapie-grausam.de  ·  0176 4268 5146</w:t>
-    </w:r>
-  </w:p>
-</w:ftr>
 </file>
 
 <file path=word/numbering.xml><?xml version="1.0" encoding="utf-8"?>

</xml_diff>

<commit_message>
Dokumente komplett neu nach THERASPORT-Vorlage mit eigenen Angaben
- Anamnesebogen: 2 Seiten, Körperdiagramm, Krankheitsliste, Therapeutenbereich
- Einwilligungserklärung: Datenschutz & Einwilligung, 2 Unterschriftsblöcke
- Behandlungsvertrag: 1 Seite, kein SEPA, keine Preisliste, korrekte Solo-Sprache

Co-Authored-By: Claude Sonnet 4.6 <noreply@anthropic.com>
</commit_message>
<xml_diff>
--- a/dokumente/Anamnesebogen.docx
+++ b/dokumente/Anamnesebogen.docx
@@ -2,84 +2,27 @@
 <file path=word/document.xml><?xml version="1.0" encoding="utf-8"?>
 <w:document xmlns:wpc="http://schemas.microsoft.com/office/word/2010/wordprocessingCanvas" xmlns:mo="http://schemas.microsoft.com/office/mac/office/2008/main" xmlns:mc="http://schemas.openxmlformats.org/markup-compatibility/2006" xmlns:mv="urn:schemas-microsoft-com:mac:vml" xmlns:o="urn:schemas-microsoft-com:office:office" xmlns:r="http://schemas.openxmlformats.org/officeDocument/2006/relationships" xmlns:m="http://schemas.openxmlformats.org/officeDocument/2006/math" xmlns:v="urn:schemas-microsoft-com:vml" xmlns:wp14="http://schemas.microsoft.com/office/word/2010/wordprocessingDrawing" xmlns:wp="http://schemas.openxmlformats.org/drawingml/2006/wordprocessingDrawing" xmlns:w10="urn:schemas-microsoft-com:office:word" xmlns:w="http://schemas.openxmlformats.org/wordprocessingml/2006/main" xmlns:w14="http://schemas.microsoft.com/office/word/2010/wordml" xmlns:wpg="http://schemas.microsoft.com/office/word/2010/wordprocessingGroup" xmlns:wpi="http://schemas.microsoft.com/office/word/2010/wordprocessingInk" xmlns:wne="http://schemas.microsoft.com/office/word/2006/wordml" xmlns:wps="http://schemas.microsoft.com/office/word/2010/wordprocessingShape" mc:Ignorable="w14 wp14">
   <w:body>
-    <w:p>
-      <w:pPr>
-        <w:spacing w:before="0" w:after="40"/>
-      </w:pPr>
-      <w:r>
-        <w:rPr>
-          <w:rFonts w:ascii="Arial" w:hAnsi="Arial"/>
-          <w:b/>
-          <w:i w:val="0"/>
-          <w:color w:val="202020"/>
-          <w:sz w:val="44"/>
-        </w:rPr>
-        <w:t>Anamnesebogen</w:t>
-      </w:r>
-    </w:p>
-    <w:p>
-      <w:pPr>
-        <w:spacing w:before="0" w:after="280"/>
-      </w:pPr>
-      <w:r>
-        <w:rPr>
-          <w:rFonts w:ascii="Arial" w:hAnsi="Arial"/>
-          <w:b w:val="0"/>
-          <w:i w:val="0"/>
-          <w:color w:val="606060"/>
-          <w:sz w:val="22"/>
-        </w:rPr>
-        <w:t>Mobile Physiotherapie Grausam  ·  Nick Grausam</w:t>
-      </w:r>
-    </w:p>
-    <w:p>
-      <w:pPr>
-        <w:spacing w:before="200" w:after="80"/>
-        <w:shd w:val="clear" w:color="auto" w:fill="D6E4F0"/>
-        <w:pBdr>
-          <w:left w:val="single" w:sz="18" w:space="6" w:color="2E74B5"/>
-        </w:pBdr>
-      </w:pPr>
-      <w:r>
-        <w:rPr>
-          <w:rFonts w:ascii="Arial" w:hAnsi="Arial"/>
-          <w:b/>
-          <w:i w:val="0"/>
-          <w:color w:val="2E74B5"/>
-          <w:sz w:val="22"/>
-        </w:rPr>
-        <w:t xml:space="preserve">  1  ·  Persönliche Daten</w:t>
-      </w:r>
-    </w:p>
     <w:tbl>
       <w:tblPr>
-        <w:tblStyle w:val="TableGrid"/>
         <w:tblW w:type="auto" w:w="0"/>
+        <w:jc w:val="left"/>
         <w:tblLayout w:type="fixed"/>
         <w:tblLook w:firstColumn="1" w:firstRow="1" w:lastColumn="0" w:lastRow="0" w:noHBand="0" w:noVBand="1" w:val="04A0"/>
       </w:tblPr>
       <w:tblGrid>
-        <w:gridCol w:w="4986"/>
-        <w:gridCol w:w="4986"/>
+        <w:gridCol w:w="3213"/>
+        <w:gridCol w:w="3213"/>
+        <w:gridCol w:w="3213"/>
       </w:tblGrid>
       <w:tr>
-        <w:trPr>
-          <w:trHeight w:val="360" w:hRule="atLeast"/>
-        </w:trPr>
         <w:tc>
           <w:tcPr>
-            <w:tcW w:type="dxa" w:w="4986"/>
-            <w:tcMar>
-              <w:top w:w="80" w:type="dxa"/>
-              <w:bottom w:w="80" w:type="dxa"/>
-              <w:left w:w="120" w:type="dxa"/>
-              <w:right w:w="120" w:type="dxa"/>
-            </w:tcMar>
+            <w:tcW w:type="dxa" w:w="5"/>
             <w:tcBorders>
-              <w:top w:val="single" w:sz="4" w:space="0" w:color="CCCCCC"/>
-              <w:left w:val="single" w:sz="4" w:space="0" w:color="CCCCCC"/>
-              <w:bottom w:val="single" w:sz="4" w:space="0" w:color="CCCCCC"/>
-              <w:right w:val="single" w:sz="4" w:space="0" w:color="CCCCCC"/>
+              <w:top w:val="none" w:sz="0" w:color="FFFFFF" w:space="0"/>
+              <w:bottom w:val="none" w:sz="0" w:color="FFFFFF" w:space="0"/>
+              <w:left w:val="none" w:sz="0" w:color="FFFFFF" w:space="0"/>
+              <w:right w:val="none" w:sz="0" w:color="FFFFFF" w:space="0"/>
             </w:tcBorders>
           </w:tcPr>
           <w:p>
@@ -88,29 +31,116 @@
             </w:pPr>
             <w:r>
               <w:rPr>
-                <w:rFonts w:ascii="Arial" w:hAnsi="Arial"/>
+                <w:rFonts w:ascii="Calibri" w:hAnsi="Calibri"/>
                 <w:b/>
-                <w:color w:val="444444"/>
-                <w:sz w:val="17"/>
+                <w:i w:val="0"/>
+                <w:sz w:val="24"/>
               </w:rPr>
-              <w:t>Vorname</w:t>
+              <w:t>Mobile Physiotherapie Grausam</w:t>
             </w:r>
           </w:p>
         </w:tc>
         <w:tc>
           <w:tcPr>
-            <w:tcW w:type="dxa" w:w="4986"/>
-            <w:tcMar>
-              <w:top w:w="80" w:type="dxa"/>
-              <w:bottom w:w="80" w:type="dxa"/>
-              <w:left w:w="120" w:type="dxa"/>
-              <w:right w:w="120" w:type="dxa"/>
-            </w:tcMar>
+            <w:tcW w:type="dxa" w:w="4"/>
             <w:tcBorders>
-              <w:top w:val="single" w:sz="4" w:space="0" w:color="CCCCCC"/>
-              <w:left w:val="single" w:sz="4" w:space="0" w:color="CCCCCC"/>
-              <w:bottom w:val="single" w:sz="4" w:space="0" w:color="CCCCCC"/>
-              <w:right w:val="single" w:sz="4" w:space="0" w:color="CCCCCC"/>
+              <w:top w:val="none" w:sz="0" w:color="FFFFFF" w:space="0"/>
+              <w:bottom w:val="none" w:sz="0" w:color="FFFFFF" w:space="0"/>
+              <w:left w:val="none" w:sz="0" w:color="FFFFFF" w:space="0"/>
+              <w:right w:val="none" w:sz="0" w:color="FFFFFF" w:space="0"/>
+            </w:tcBorders>
+            <w:tcBorders>
+              <w:top w:val="single" w:sz="4" w:color="000000" w:space="0"/>
+              <w:bottom w:val="single" w:sz="4" w:color="000000" w:space="0"/>
+              <w:left w:val="single" w:sz="4" w:color="000000" w:space="0"/>
+              <w:right w:val="single" w:sz="4" w:color="000000" w:space="0"/>
+            </w:tcBorders>
+            <w:vAlign w:val="center"/>
+          </w:tcPr>
+          <w:p>
+            <w:pPr>
+              <w:spacing w:before="40" w:after="0"/>
+              <w:jc w:val="center"/>
+            </w:pPr>
+            <w:r>
+              <w:rPr>
+                <w:rFonts w:ascii="Calibri" w:hAnsi="Calibri"/>
+                <w:b/>
+                <w:i w:val="0"/>
+                <w:sz w:val="24"/>
+              </w:rPr>
+              <w:t>Anamnesebogen</w:t>
+            </w:r>
+          </w:p>
+          <w:p>
+            <w:pPr>
+              <w:spacing w:before="0" w:after="40"/>
+              <w:jc w:val="center"/>
+            </w:pPr>
+            <w:r>
+              <w:rPr>
+                <w:rFonts w:ascii="Calibri" w:hAnsi="Calibri"/>
+                <w:b w:val="0"/>
+                <w:i w:val="0"/>
+                <w:sz w:val="18"/>
+              </w:rPr>
+              <w:t>Angaben freiwillig</w:t>
+            </w:r>
+          </w:p>
+        </w:tc>
+        <w:tc>
+          <w:tcPr>
+            <w:tcW w:type="dxa" w:w="5"/>
+            <w:tcBorders>
+              <w:top w:val="none" w:sz="0" w:color="FFFFFF" w:space="0"/>
+              <w:bottom w:val="none" w:sz="0" w:color="FFFFFF" w:space="0"/>
+              <w:left w:val="none" w:sz="0" w:color="FFFFFF" w:space="0"/>
+              <w:right w:val="none" w:sz="0" w:color="FFFFFF" w:space="0"/>
+            </w:tcBorders>
+          </w:tcPr>
+          <w:p>
+            <w:pPr>
+              <w:spacing w:before="0" w:after="0"/>
+              <w:jc w:val="right"/>
+            </w:pPr>
+            <w:r>
+              <w:rPr>
+                <w:rFonts w:ascii="Calibri" w:hAnsi="Calibri"/>
+                <w:b w:val="0"/>
+                <w:i w:val="0"/>
+                <w:sz w:val="20"/>
+              </w:rPr>
+              <w:t>Datum: ___ . ___ . ______</w:t>
+            </w:r>
+          </w:p>
+        </w:tc>
+      </w:tr>
+    </w:tbl>
+    <w:p>
+      <w:pPr>
+        <w:spacing w:before="0" w:after="0" w:line="120" w:lineRule="exact"/>
+      </w:pPr>
+    </w:p>
+    <w:tbl>
+      <w:tblPr>
+        <w:tblW w:type="auto" w:w="0"/>
+        <w:jc w:val="left"/>
+        <w:tblLayout w:type="fixed"/>
+        <w:tblLook w:firstColumn="1" w:firstRow="1" w:lastColumn="0" w:lastRow="0" w:noHBand="0" w:noVBand="1" w:val="04A0"/>
+      </w:tblPr>
+      <w:tblGrid>
+        <w:gridCol w:w="4819"/>
+        <w:gridCol w:w="4819"/>
+      </w:tblGrid>
+      <w:tr>
+        <w:tc>
+          <w:tcPr>
+            <w:tcW w:type="dxa" w:w="8"/>
+            <w:tcBorders>
+              <w:top w:val="none" w:sz="0" w:color="FFFFFF" w:space="0"/>
+              <w:bottom w:val="single" w:sz="4" w:color="000000" w:space="0"/>
+              <w:left w:val="none" w:sz="0" w:color="FFFFFF" w:space="0"/>
+              <w:right w:val="none" w:sz="0" w:color="FFFFFF" w:space="0"/>
             </w:tcBorders>
           </w:tcPr>
           <w:p>
@@ -119,34 +149,21 @@
             </w:pPr>
             <w:r>
               <w:rPr>
-                <w:rFonts w:ascii="Arial" w:hAnsi="Arial"/>
-                <w:b/>
-                <w:color w:val="444444"/>
-                <w:sz w:val="17"/>
+                <w:rFonts w:ascii="Calibri" w:hAnsi="Calibri"/>
+                <w:sz w:val="20"/>
               </w:rPr>
-              <w:t>Nachname</w:t>
+              <w:t>Name: ________________________,  _________________________</w:t>
             </w:r>
           </w:p>
         </w:tc>
-      </w:tr>
-      <w:tr>
-        <w:trPr>
-          <w:trHeight w:val="360" w:hRule="atLeast"/>
-        </w:trPr>
         <w:tc>
           <w:tcPr>
-            <w:tcW w:type="dxa" w:w="4986"/>
-            <w:tcMar>
-              <w:top w:w="80" w:type="dxa"/>
-              <w:bottom w:w="80" w:type="dxa"/>
-              <w:left w:w="120" w:type="dxa"/>
-              <w:right w:w="120" w:type="dxa"/>
-            </w:tcMar>
+            <w:tcW w:type="dxa" w:w="8"/>
             <w:tcBorders>
-              <w:top w:val="single" w:sz="4" w:space="0" w:color="CCCCCC"/>
-              <w:left w:val="single" w:sz="4" w:space="0" w:color="CCCCCC"/>
-              <w:bottom w:val="single" w:sz="4" w:space="0" w:color="CCCCCC"/>
-              <w:right w:val="single" w:sz="4" w:space="0" w:color="CCCCCC"/>
+              <w:top w:val="none" w:sz="0" w:color="FFFFFF" w:space="0"/>
+              <w:bottom w:val="single" w:sz="4" w:color="000000" w:space="0"/>
+              <w:left w:val="none" w:sz="0" w:color="FFFFFF" w:space="0"/>
+              <w:right w:val="none" w:sz="0" w:color="FFFFFF" w:space="0"/>
             </w:tcBorders>
           </w:tcPr>
           <w:p>
@@ -155,29 +172,40 @@
             </w:pPr>
             <w:r>
               <w:rPr>
-                <w:rFonts w:ascii="Arial" w:hAnsi="Arial"/>
-                <w:b/>
-                <w:color w:val="444444"/>
-                <w:sz w:val="17"/>
+                <w:rFonts w:ascii="Calibri" w:hAnsi="Calibri"/>
+                <w:sz w:val="20"/>
               </w:rPr>
-              <w:t>Geburtsdatum</w:t>
+              <w:t>Geburtsdatum: __ . __ . ____</w:t>
             </w:r>
           </w:p>
         </w:tc>
+      </w:tr>
+    </w:tbl>
+    <w:p>
+      <w:pPr>
+        <w:spacing w:before="0" w:after="40"/>
+      </w:pPr>
+    </w:p>
+    <w:tbl>
+      <w:tblPr>
+        <w:tblW w:type="auto" w:w="0"/>
+        <w:jc w:val="left"/>
+        <w:tblLayout w:type="fixed"/>
+        <w:tblLook w:firstColumn="1" w:firstRow="1" w:lastColumn="0" w:lastRow="0" w:noHBand="0" w:noVBand="1" w:val="04A0"/>
+      </w:tblPr>
+      <w:tblGrid>
+        <w:gridCol w:w="4819"/>
+        <w:gridCol w:w="4819"/>
+      </w:tblGrid>
+      <w:tr>
         <w:tc>
           <w:tcPr>
-            <w:tcW w:type="dxa" w:w="4986"/>
-            <w:tcMar>
-              <w:top w:w="80" w:type="dxa"/>
-              <w:bottom w:w="80" w:type="dxa"/>
-              <w:left w:w="120" w:type="dxa"/>
-              <w:right w:w="120" w:type="dxa"/>
-            </w:tcMar>
+            <w:tcW w:type="dxa" w:w="8"/>
             <w:tcBorders>
-              <w:top w:val="single" w:sz="4" w:space="0" w:color="CCCCCC"/>
-              <w:left w:val="single" w:sz="4" w:space="0" w:color="CCCCCC"/>
-              <w:bottom w:val="single" w:sz="4" w:space="0" w:color="CCCCCC"/>
-              <w:right w:val="single" w:sz="4" w:space="0" w:color="CCCCCC"/>
+              <w:top w:val="none" w:sz="0" w:color="FFFFFF" w:space="0"/>
+              <w:bottom w:val="single" w:sz="4" w:color="000000" w:space="0"/>
+              <w:left w:val="none" w:sz="0" w:color="FFFFFF" w:space="0"/>
+              <w:right w:val="none" w:sz="0" w:color="FFFFFF" w:space="0"/>
             </w:tcBorders>
           </w:tcPr>
           <w:p>
@@ -186,35 +214,21 @@
             </w:pPr>
             <w:r>
               <w:rPr>
-                <w:rFonts w:ascii="Arial" w:hAnsi="Arial"/>
-                <w:b/>
-                <w:color w:val="444444"/>
-                <w:sz w:val="17"/>
+                <w:rFonts w:ascii="Calibri" w:hAnsi="Calibri"/>
+                <w:sz w:val="20"/>
               </w:rPr>
-              <w:t>Geschlecht</w:t>
+              <w:t>Beruf/letzte Tätigkeit: _______________________</w:t>
             </w:r>
           </w:p>
         </w:tc>
-      </w:tr>
-      <w:tr>
-        <w:trPr>
-          <w:trHeight w:val="400" w:hRule="atLeast"/>
-        </w:trPr>
         <w:tc>
           <w:tcPr>
-            <w:tcW w:type="dxa" w:w="9972"/>
-            <w:gridSpan w:val="2"/>
-            <w:tcMar>
-              <w:top w:w="80" w:type="dxa"/>
-              <w:bottom w:w="80" w:type="dxa"/>
-              <w:left w:w="120" w:type="dxa"/>
-              <w:right w:w="120" w:type="dxa"/>
-            </w:tcMar>
+            <w:tcW w:type="dxa" w:w="8"/>
             <w:tcBorders>
-              <w:top w:val="single" w:sz="4" w:space="0" w:color="CCCCCC"/>
-              <w:left w:val="single" w:sz="4" w:space="0" w:color="CCCCCC"/>
-              <w:bottom w:val="single" w:sz="4" w:space="0" w:color="CCCCCC"/>
-              <w:right w:val="single" w:sz="4" w:space="0" w:color="CCCCCC"/>
+              <w:top w:val="none" w:sz="0" w:color="FFFFFF" w:space="0"/>
+              <w:bottom w:val="single" w:sz="4" w:color="000000" w:space="0"/>
+              <w:left w:val="none" w:sz="0" w:color="FFFFFF" w:space="0"/>
+              <w:right w:val="none" w:sz="0" w:color="FFFFFF" w:space="0"/>
             </w:tcBorders>
           </w:tcPr>
           <w:p>
@@ -223,79 +237,10 @@
             </w:pPr>
             <w:r>
               <w:rPr>
-                <w:rFonts w:ascii="Arial" w:hAnsi="Arial"/>
-                <w:b/>
-                <w:color w:val="444444"/>
-                <w:sz w:val="17"/>
+                <w:rFonts w:ascii="Calibri" w:hAnsi="Calibri"/>
+                <w:sz w:val="20"/>
               </w:rPr>
-              <w:t>Adresse  (Straße, PLZ, Ort)</w:t>
-            </w:r>
-          </w:p>
-        </w:tc>
-      </w:tr>
-      <w:tr>
-        <w:trPr>
-          <w:trHeight w:val="360" w:hRule="atLeast"/>
-        </w:trPr>
-        <w:tc>
-          <w:tcPr>
-            <w:tcW w:type="dxa" w:w="4986"/>
-            <w:tcMar>
-              <w:top w:w="80" w:type="dxa"/>
-              <w:bottom w:w="80" w:type="dxa"/>
-              <w:left w:w="120" w:type="dxa"/>
-              <w:right w:w="120" w:type="dxa"/>
-            </w:tcMar>
-            <w:tcBorders>
-              <w:top w:val="single" w:sz="4" w:space="0" w:color="CCCCCC"/>
-              <w:left w:val="single" w:sz="4" w:space="0" w:color="CCCCCC"/>
-              <w:bottom w:val="single" w:sz="4" w:space="0" w:color="CCCCCC"/>
-              <w:right w:val="single" w:sz="4" w:space="0" w:color="CCCCCC"/>
-            </w:tcBorders>
-          </w:tcPr>
-          <w:p>
-            <w:pPr>
-              <w:spacing w:before="0" w:after="0"/>
-            </w:pPr>
-            <w:r>
-              <w:rPr>
-                <w:rFonts w:ascii="Arial" w:hAnsi="Arial"/>
-                <w:b/>
-                <w:color w:val="444444"/>
-                <w:sz w:val="17"/>
-              </w:rPr>
-              <w:t>Telefon</w:t>
-            </w:r>
-          </w:p>
-        </w:tc>
-        <w:tc>
-          <w:tcPr>
-            <w:tcW w:type="dxa" w:w="4986"/>
-            <w:tcMar>
-              <w:top w:w="80" w:type="dxa"/>
-              <w:bottom w:w="80" w:type="dxa"/>
-              <w:left w:w="120" w:type="dxa"/>
-              <w:right w:w="120" w:type="dxa"/>
-            </w:tcMar>
-            <w:tcBorders>
-              <w:top w:val="single" w:sz="4" w:space="0" w:color="CCCCCC"/>
-              <w:left w:val="single" w:sz="4" w:space="0" w:color="CCCCCC"/>
-              <w:bottom w:val="single" w:sz="4" w:space="0" w:color="CCCCCC"/>
-              <w:right w:val="single" w:sz="4" w:space="0" w:color="CCCCCC"/>
-            </w:tcBorders>
-          </w:tcPr>
-          <w:p>
-            <w:pPr>
-              <w:spacing w:before="0" w:after="0"/>
-            </w:pPr>
-            <w:r>
-              <w:rPr>
-                <w:rFonts w:ascii="Arial" w:hAnsi="Arial"/>
-                <w:b/>
-                <w:color w:val="444444"/>
-                <w:sz w:val="17"/>
-              </w:rPr>
-              <w:t>E-Mail</w:t>
+              <w:t>Sport/Hobbys: _______________________</w:t>
             </w:r>
           </w:p>
         </w:tc>
@@ -303,234 +248,1191 @@
     </w:tbl>
     <w:p>
       <w:pPr>
-        <w:spacing w:before="200" w:after="80"/>
-        <w:shd w:val="clear" w:color="auto" w:fill="D6E4F0"/>
+        <w:spacing w:before="0" w:after="40"/>
+      </w:pPr>
+    </w:p>
+    <w:p>
+      <w:pPr>
+        <w:spacing w:before="0" w:after="40"/>
         <w:pBdr>
-          <w:left w:val="single" w:sz="18" w:space="6" w:color="2E74B5"/>
+          <w:bottom w:val="single" w:sz="4" w:space="1" w:color="000000"/>
         </w:pBdr>
       </w:pPr>
       <w:r>
         <w:rPr>
-          <w:rFonts w:ascii="Arial" w:hAnsi="Arial"/>
-          <w:b/>
+          <w:rFonts w:ascii="Calibri" w:hAnsi="Calibri"/>
+          <w:b w:val="0"/>
           <w:i w:val="0"/>
-          <w:color w:val="2E74B5"/>
-          <w:sz w:val="22"/>
+          <w:sz w:val="20"/>
         </w:rPr>
-        <w:t xml:space="preserve">  2  ·  Krankenversicherung</w:t>
+        <w:t>Was führt Sie zu uns? Welche Beschwerden haben sie?</w:t>
+      </w:r>
+    </w:p>
+    <w:p>
+      <w:pPr>
+        <w:spacing w:before="0" w:after="40"/>
+        <w:pBdr>
+          <w:bottom w:val="single" w:sz="4" w:space="1" w:color="000000"/>
+        </w:pBdr>
+      </w:pPr>
+      <w:r>
+        <w:rPr>
+          <w:rFonts w:ascii="Calibri" w:hAnsi="Calibri"/>
+          <w:b w:val="0"/>
+          <w:i w:val="0"/>
+          <w:sz w:val="20"/>
+        </w:rPr>
+        <w:t>Wo haben sie Schmerzen?</w:t>
+      </w:r>
+    </w:p>
+    <w:p>
+      <w:pPr>
+        <w:spacing w:before="80" w:after="40"/>
+      </w:pPr>
+      <w:r>
+        <w:rPr>
+          <w:rFonts w:ascii="Calibri" w:hAnsi="Calibri"/>
+          <w:b w:val="0"/>
+          <w:i w:val="0"/>
+          <w:sz w:val="20"/>
+        </w:rPr>
+        <w:t>Bitte zeichnen Sie die Schmerzlokalisation ein:</w:t>
+      </w:r>
+    </w:p>
+    <w:p>
+      <w:pPr>
+        <w:spacing w:before="0" w:after="80"/>
+      </w:pPr>
+      <w:r>
+        <w:drawing>
+          <wp:inline xmlns:a="http://schemas.openxmlformats.org/drawingml/2006/main" xmlns:pic="http://schemas.openxmlformats.org/drawingml/2006/picture">
+            <wp:extent cx="5040000" cy="3332141"/>
+            <wp:docPr id="1" name="Picture 1"/>
+            <wp:cNvGraphicFramePr>
+              <a:graphicFrameLocks noChangeAspect="1"/>
+            </wp:cNvGraphicFramePr>
+            <a:graphic>
+              <a:graphicData uri="http://schemas.openxmlformats.org/drawingml/2006/picture">
+                <pic:pic>
+                  <pic:nvPicPr>
+                    <pic:cNvPr id="0" name="body_diagram.png"/>
+                    <pic:cNvPicPr/>
+                  </pic:nvPicPr>
+                  <pic:blipFill>
+                    <a:blip r:embed="rId10"/>
+                    <a:stretch>
+                      <a:fillRect/>
+                    </a:stretch>
+                  </pic:blipFill>
+                  <pic:spPr>
+                    <a:xfrm>
+                      <a:off x="0" y="0"/>
+                      <a:ext cx="5040000" cy="3332141"/>
+                    </a:xfrm>
+                    <a:prstGeom prst="rect"/>
+                  </pic:spPr>
+                </pic:pic>
+              </a:graphicData>
+            </a:graphic>
+          </wp:inline>
+        </w:drawing>
+      </w:r>
+    </w:p>
+    <w:p>
+      <w:pPr>
+        <w:spacing w:before="0" w:after="40"/>
+        <w:pBdr>
+          <w:bottom w:val="single" w:sz="4" w:space="1" w:color="000000"/>
+        </w:pBdr>
+      </w:pPr>
+      <w:r>
+        <w:rPr>
+          <w:rFonts w:ascii="Calibri" w:hAnsi="Calibri"/>
+          <w:b w:val="0"/>
+          <w:i w:val="0"/>
+          <w:sz w:val="20"/>
+        </w:rPr>
+        <w:t>Wann haben sie Schmerzen/Beschwerden?</w:t>
+      </w:r>
+    </w:p>
+    <w:p>
+      <w:pPr>
+        <w:spacing w:before="0" w:after="40"/>
+        <w:pBdr>
+          <w:bottom w:val="single" w:sz="4" w:space="1" w:color="000000"/>
+        </w:pBdr>
+      </w:pPr>
+      <w:r>
+        <w:rPr>
+          <w:rFonts w:ascii="Calibri" w:hAnsi="Calibri"/>
+          <w:b w:val="0"/>
+          <w:i w:val="0"/>
+          <w:sz w:val="20"/>
+        </w:rPr>
+        <w:t>Ist es ein ziehender, stechender, brennender oder dumpfer Schmerz? (bitte einkreisen)</w:t>
+      </w:r>
+    </w:p>
+    <w:p>
+      <w:pPr>
+        <w:spacing w:before="0" w:after="40"/>
+      </w:pPr>
+      <w:r>
+        <w:rPr>
+          <w:rFonts w:ascii="Calibri" w:hAnsi="Calibri"/>
+          <w:b w:val="0"/>
+          <w:i w:val="0"/>
+          <w:sz w:val="20"/>
+        </w:rPr>
+        <w:t>Ich würde meine Schmerzen so einstufen:  (bitte einkreisen)   Keine  1  2  3  4  5  6  7  8  9  10  Stark</w:t>
+      </w:r>
+    </w:p>
+    <w:p>
+      <w:pPr>
+        <w:spacing w:before="0" w:after="40"/>
+        <w:pBdr>
+          <w:bottom w:val="single" w:sz="4" w:space="1" w:color="000000"/>
+        </w:pBdr>
+      </w:pPr>
+      <w:r>
+        <w:rPr>
+          <w:rFonts w:ascii="Calibri" w:hAnsi="Calibri"/>
+          <w:b w:val="0"/>
+          <w:i w:val="0"/>
+          <w:sz w:val="20"/>
+        </w:rPr>
+        <w:t>Wie lange haben sie die Beschwerden schon bzw. gab es einen Auslöser?</w:t>
+      </w:r>
+    </w:p>
+    <w:p>
+      <w:pPr>
+        <w:spacing w:before="0" w:after="40"/>
+        <w:pBdr>
+          <w:bottom w:val="single" w:sz="4" w:space="1" w:color="000000"/>
+        </w:pBdr>
+      </w:pPr>
+      <w:r>
+        <w:rPr>
+          <w:rFonts w:ascii="Calibri" w:hAnsi="Calibri"/>
+          <w:b w:val="0"/>
+          <w:i w:val="0"/>
+          <w:sz w:val="20"/>
+        </w:rPr>
+        <w:t>Welches sind ihre Hauptbeschwerden im Alltag?</w:t>
+      </w:r>
+    </w:p>
+    <w:p>
+      <w:pPr>
+        <w:spacing w:before="0" w:after="40"/>
+        <w:pBdr>
+          <w:bottom w:val="single" w:sz="4" w:space="1" w:color="000000"/>
+        </w:pBdr>
+      </w:pPr>
+      <w:r>
+        <w:rPr>
+          <w:rFonts w:ascii="Calibri" w:hAnsi="Calibri"/>
+          <w:b w:val="0"/>
+          <w:i w:val="0"/>
+          <w:sz w:val="20"/>
+        </w:rPr>
+        <w:t>Haben Sie Probleme in anderen Körperregionen?</w:t>
+      </w:r>
+    </w:p>
+    <w:p>
+      <w:pPr>
+        <w:spacing w:before="0" w:after="40"/>
+        <w:pBdr>
+          <w:bottom w:val="single" w:sz="4" w:space="1" w:color="000000"/>
+        </w:pBdr>
+      </w:pPr>
+      <w:r>
+        <w:rPr>
+          <w:rFonts w:ascii="Calibri" w:hAnsi="Calibri"/>
+          <w:b w:val="0"/>
+          <w:i w:val="0"/>
+          <w:sz w:val="20"/>
+        </w:rPr>
+        <w:t>Nehmen Sie Medikamente ein? Wenn ja, welche? ___________________________________</w:t>
+      </w:r>
+    </w:p>
+    <w:p>
+      <w:pPr>
+        <w:spacing w:before="0" w:after="40"/>
+        <w:pBdr>
+          <w:bottom w:val="single" w:sz="4" w:space="1" w:color="000000"/>
+        </w:pBdr>
+      </w:pPr>
+      <w:r>
+        <w:rPr>
+          <w:rFonts w:ascii="Calibri" w:hAnsi="Calibri"/>
+          <w:b w:val="0"/>
+          <w:i w:val="0"/>
+          <w:sz w:val="20"/>
+        </w:rPr>
+        <w:t>Hatten sie schon Operationen? Wenn ja, welche und wann?</w:t>
+      </w:r>
+    </w:p>
+    <w:p>
+      <w:r>
+        <w:br w:type="page"/>
       </w:r>
     </w:p>
     <w:tbl>
       <w:tblPr>
-        <w:tblStyle w:val="TableGrid"/>
         <w:tblW w:type="auto" w:w="0"/>
+        <w:jc w:val="left"/>
         <w:tblLayout w:type="fixed"/>
         <w:tblLook w:firstColumn="1" w:firstRow="1" w:lastColumn="0" w:lastRow="0" w:noHBand="0" w:noVBand="1" w:val="04A0"/>
       </w:tblPr>
       <w:tblGrid>
-        <w:gridCol w:w="4986"/>
-        <w:gridCol w:w="4986"/>
+        <w:gridCol w:w="2409"/>
+        <w:gridCol w:w="2409"/>
+        <w:gridCol w:w="2409"/>
+        <w:gridCol w:w="2409"/>
       </w:tblGrid>
       <w:tr>
-        <w:trPr>
-          <w:trHeight w:val="360" w:hRule="atLeast"/>
-        </w:trPr>
         <w:tc>
           <w:tcPr>
-            <w:tcW w:type="dxa" w:w="9972"/>
-            <w:gridSpan w:val="2"/>
-            <w:tcMar>
-              <w:top w:w="80" w:type="dxa"/>
-              <w:bottom w:w="80" w:type="dxa"/>
-              <w:left w:w="120" w:type="dxa"/>
-              <w:right w:w="120" w:type="dxa"/>
-            </w:tcMar>
+            <w:tcW w:type="dxa" w:w="3"/>
             <w:tcBorders>
-              <w:top w:val="single" w:sz="4" w:space="0" w:color="CCCCCC"/>
-              <w:left w:val="single" w:sz="4" w:space="0" w:color="CCCCCC"/>
-              <w:bottom w:val="single" w:sz="4" w:space="0" w:color="CCCCCC"/>
-              <w:right w:val="single" w:sz="4" w:space="0" w:color="CCCCCC"/>
+              <w:top w:val="none" w:sz="0" w:color="FFFFFF" w:space="0"/>
+              <w:bottom w:val="single" w:sz="4" w:color="CCCCCC" w:space="0"/>
+              <w:left w:val="none" w:sz="0" w:color="FFFFFF" w:space="0"/>
+              <w:right w:val="none" w:sz="0" w:color="FFFFFF" w:space="0"/>
             </w:tcBorders>
           </w:tcPr>
           <w:p>
             <w:pPr>
-              <w:spacing w:before="0" w:after="0"/>
+              <w:spacing w:before="20" w:after="20"/>
             </w:pPr>
             <w:r>
               <w:rPr>
-                <w:rFonts w:ascii="Arial" w:hAnsi="Arial"/>
-                <w:sz w:val="19"/>
+                <w:rFonts w:ascii="Calibri" w:hAnsi="Calibri"/>
+                <w:b/>
+                <w:sz w:val="18"/>
               </w:rPr>
-              <w:t>Versicherungsart:    ☐ Privatpatient / -in    ☐ Beihilfe (Beamte)    ☐ Selbstzahler / -in</w:t>
+              <w:t>Osteoporose:</w:t>
+            </w:r>
+          </w:p>
+        </w:tc>
+        <w:tc>
+          <w:tcPr>
+            <w:tcW w:type="dxa" w:w="5"/>
+            <w:tcBorders>
+              <w:top w:val="none" w:sz="0" w:color="FFFFFF" w:space="0"/>
+              <w:bottom w:val="single" w:sz="4" w:color="CCCCCC" w:space="0"/>
+              <w:left w:val="none" w:sz="0" w:color="FFFFFF" w:space="0"/>
+              <w:right w:val="none" w:sz="0" w:color="FFFFFF" w:space="0"/>
+            </w:tcBorders>
+          </w:tcPr>
+          <w:p>
+            <w:pPr>
+              <w:spacing w:before="20" w:after="20"/>
+            </w:pPr>
+            <w:r>
+              <w:rPr>
+                <w:rFonts w:ascii="Calibri" w:hAnsi="Calibri"/>
+                <w:sz w:val="18"/>
+              </w:rPr>
+              <w:t>ja  O    nein  O</w:t>
+            </w:r>
+          </w:p>
+        </w:tc>
+        <w:tc>
+          <w:tcPr>
+            <w:tcW w:type="dxa" w:w="3"/>
+            <w:tcBorders>
+              <w:top w:val="none" w:sz="0" w:color="FFFFFF" w:space="0"/>
+              <w:bottom w:val="single" w:sz="4" w:color="CCCCCC" w:space="0"/>
+              <w:left w:val="none" w:sz="0" w:color="FFFFFF" w:space="0"/>
+              <w:right w:val="none" w:sz="0" w:color="FFFFFF" w:space="0"/>
+            </w:tcBorders>
+          </w:tcPr>
+          <w:p>
+            <w:pPr>
+              <w:spacing w:before="20" w:after="20"/>
+            </w:pPr>
+            <w:r>
+              <w:rPr>
+                <w:rFonts w:ascii="Calibri" w:hAnsi="Calibri"/>
+                <w:b/>
+                <w:sz w:val="18"/>
+              </w:rPr>
+              <w:t>Niedriger Blutdruck:</w:t>
+            </w:r>
+          </w:p>
+        </w:tc>
+        <w:tc>
+          <w:tcPr>
+            <w:tcW w:type="dxa" w:w="5"/>
+            <w:tcBorders>
+              <w:top w:val="none" w:sz="0" w:color="FFFFFF" w:space="0"/>
+              <w:bottom w:val="single" w:sz="4" w:color="CCCCCC" w:space="0"/>
+              <w:left w:val="none" w:sz="0" w:color="FFFFFF" w:space="0"/>
+              <w:right w:val="none" w:sz="0" w:color="FFFFFF" w:space="0"/>
+            </w:tcBorders>
+          </w:tcPr>
+          <w:p>
+            <w:pPr>
+              <w:spacing w:before="20" w:after="20"/>
+            </w:pPr>
+            <w:r>
+              <w:rPr>
+                <w:rFonts w:ascii="Calibri" w:hAnsi="Calibri"/>
+                <w:sz w:val="18"/>
+              </w:rPr>
+              <w:t>ja  O    nein  O</w:t>
             </w:r>
           </w:p>
         </w:tc>
       </w:tr>
       <w:tr>
-        <w:trPr>
-          <w:trHeight w:val="360" w:hRule="atLeast"/>
-        </w:trPr>
         <w:tc>
           <w:tcPr>
-            <w:tcW w:type="dxa" w:w="4986"/>
-            <w:tcMar>
-              <w:top w:w="80" w:type="dxa"/>
-              <w:bottom w:w="80" w:type="dxa"/>
-              <w:left w:w="120" w:type="dxa"/>
-              <w:right w:w="120" w:type="dxa"/>
-            </w:tcMar>
+            <w:tcW w:type="dxa" w:w="3"/>
             <w:tcBorders>
-              <w:top w:val="single" w:sz="4" w:space="0" w:color="CCCCCC"/>
-              <w:left w:val="single" w:sz="4" w:space="0" w:color="CCCCCC"/>
-              <w:bottom w:val="single" w:sz="4" w:space="0" w:color="CCCCCC"/>
-              <w:right w:val="single" w:sz="4" w:space="0" w:color="CCCCCC"/>
+              <w:top w:val="none" w:sz="0" w:color="FFFFFF" w:space="0"/>
+              <w:bottom w:val="single" w:sz="4" w:color="CCCCCC" w:space="0"/>
+              <w:left w:val="none" w:sz="0" w:color="FFFFFF" w:space="0"/>
+              <w:right w:val="none" w:sz="0" w:color="FFFFFF" w:space="0"/>
             </w:tcBorders>
           </w:tcPr>
           <w:p>
             <w:pPr>
-              <w:spacing w:before="0" w:after="0"/>
+              <w:spacing w:before="20" w:after="20"/>
             </w:pPr>
             <w:r>
               <w:rPr>
-                <w:rFonts w:ascii="Arial" w:hAnsi="Arial"/>
+                <w:rFonts w:ascii="Calibri" w:hAnsi="Calibri"/>
                 <w:b/>
-                <w:color w:val="444444"/>
-                <w:sz w:val="17"/>
+                <w:sz w:val="18"/>
               </w:rPr>
-              <w:t>Krankenversicherung (Name)</w:t>
+              <w:t>Bluthochdruck:</w:t>
             </w:r>
           </w:p>
         </w:tc>
         <w:tc>
           <w:tcPr>
-            <w:tcW w:type="dxa" w:w="4986"/>
-            <w:tcMar>
-              <w:top w:w="80" w:type="dxa"/>
-              <w:bottom w:w="80" w:type="dxa"/>
-              <w:left w:w="120" w:type="dxa"/>
-              <w:right w:w="120" w:type="dxa"/>
-            </w:tcMar>
+            <w:tcW w:type="dxa" w:w="5"/>
             <w:tcBorders>
-              <w:top w:val="single" w:sz="4" w:space="0" w:color="CCCCCC"/>
-              <w:left w:val="single" w:sz="4" w:space="0" w:color="CCCCCC"/>
-              <w:bottom w:val="single" w:sz="4" w:space="0" w:color="CCCCCC"/>
-              <w:right w:val="single" w:sz="4" w:space="0" w:color="CCCCCC"/>
+              <w:top w:val="none" w:sz="0" w:color="FFFFFF" w:space="0"/>
+              <w:bottom w:val="single" w:sz="4" w:color="CCCCCC" w:space="0"/>
+              <w:left w:val="none" w:sz="0" w:color="FFFFFF" w:space="0"/>
+              <w:right w:val="none" w:sz="0" w:color="FFFFFF" w:space="0"/>
             </w:tcBorders>
           </w:tcPr>
           <w:p>
             <w:pPr>
-              <w:spacing w:before="0" w:after="0"/>
+              <w:spacing w:before="20" w:after="20"/>
             </w:pPr>
             <w:r>
               <w:rPr>
-                <w:rFonts w:ascii="Arial" w:hAnsi="Arial"/>
+                <w:rFonts w:ascii="Calibri" w:hAnsi="Calibri"/>
+                <w:sz w:val="18"/>
+              </w:rPr>
+              <w:t>ja  O    nein  O</w:t>
+            </w:r>
+          </w:p>
+        </w:tc>
+        <w:tc>
+          <w:tcPr>
+            <w:tcW w:type="dxa" w:w="3"/>
+            <w:tcBorders>
+              <w:top w:val="none" w:sz="0" w:color="FFFFFF" w:space="0"/>
+              <w:bottom w:val="single" w:sz="4" w:color="CCCCCC" w:space="0"/>
+              <w:left w:val="none" w:sz="0" w:color="FFFFFF" w:space="0"/>
+              <w:right w:val="none" w:sz="0" w:color="FFFFFF" w:space="0"/>
+            </w:tcBorders>
+          </w:tcPr>
+          <w:p>
+            <w:pPr>
+              <w:spacing w:before="20" w:after="20"/>
+            </w:pPr>
+            <w:r>
+              <w:rPr>
+                <w:rFonts w:ascii="Calibri" w:hAnsi="Calibri"/>
                 <w:b/>
-                <w:color w:val="444444"/>
-                <w:sz w:val="17"/>
+                <w:sz w:val="18"/>
               </w:rPr>
-              <w:t>Versicherungsnummer</w:t>
+              <w:t>Nächtliches Schwitzen:</w:t>
+            </w:r>
+          </w:p>
+        </w:tc>
+        <w:tc>
+          <w:tcPr>
+            <w:tcW w:type="dxa" w:w="5"/>
+            <w:tcBorders>
+              <w:top w:val="none" w:sz="0" w:color="FFFFFF" w:space="0"/>
+              <w:bottom w:val="single" w:sz="4" w:color="CCCCCC" w:space="0"/>
+              <w:left w:val="none" w:sz="0" w:color="FFFFFF" w:space="0"/>
+              <w:right w:val="none" w:sz="0" w:color="FFFFFF" w:space="0"/>
+            </w:tcBorders>
+          </w:tcPr>
+          <w:p>
+            <w:pPr>
+              <w:spacing w:before="20" w:after="20"/>
+            </w:pPr>
+            <w:r>
+              <w:rPr>
+                <w:rFonts w:ascii="Calibri" w:hAnsi="Calibri"/>
+                <w:sz w:val="18"/>
+              </w:rPr>
+              <w:t>ja  O    nein  O</w:t>
             </w:r>
           </w:p>
         </w:tc>
       </w:tr>
       <w:tr>
-        <w:trPr>
-          <w:trHeight w:val="360" w:hRule="atLeast"/>
-        </w:trPr>
         <w:tc>
           <w:tcPr>
-            <w:tcW w:type="dxa" w:w="4986"/>
-            <w:tcMar>
-              <w:top w:w="80" w:type="dxa"/>
-              <w:bottom w:w="80" w:type="dxa"/>
-              <w:left w:w="120" w:type="dxa"/>
-              <w:right w:w="120" w:type="dxa"/>
-            </w:tcMar>
+            <w:tcW w:type="dxa" w:w="3"/>
             <w:tcBorders>
-              <w:top w:val="single" w:sz="4" w:space="0" w:color="CCCCCC"/>
-              <w:left w:val="single" w:sz="4" w:space="0" w:color="CCCCCC"/>
-              <w:bottom w:val="single" w:sz="4" w:space="0" w:color="CCCCCC"/>
-              <w:right w:val="single" w:sz="4" w:space="0" w:color="CCCCCC"/>
+              <w:top w:val="none" w:sz="0" w:color="FFFFFF" w:space="0"/>
+              <w:bottom w:val="single" w:sz="4" w:color="CCCCCC" w:space="0"/>
+              <w:left w:val="none" w:sz="0" w:color="FFFFFF" w:space="0"/>
+              <w:right w:val="none" w:sz="0" w:color="FFFFFF" w:space="0"/>
             </w:tcBorders>
           </w:tcPr>
           <w:p>
             <w:pPr>
-              <w:spacing w:before="0" w:after="0"/>
+              <w:spacing w:before="20" w:after="20"/>
             </w:pPr>
             <w:r>
               <w:rPr>
-                <w:rFonts w:ascii="Arial" w:hAnsi="Arial"/>
+                <w:rFonts w:ascii="Calibri" w:hAnsi="Calibri"/>
                 <w:b/>
-                <w:color w:val="444444"/>
-                <w:sz w:val="17"/>
+                <w:sz w:val="18"/>
               </w:rPr>
-              <w:t>Hausarzt (Name)</w:t>
+              <w:t>Magenprobleme:</w:t>
             </w:r>
           </w:p>
         </w:tc>
         <w:tc>
           <w:tcPr>
-            <w:tcW w:type="dxa" w:w="4986"/>
-            <w:tcMar>
-              <w:top w:w="80" w:type="dxa"/>
-              <w:bottom w:w="80" w:type="dxa"/>
-              <w:left w:w="120" w:type="dxa"/>
-              <w:right w:w="120" w:type="dxa"/>
-            </w:tcMar>
+            <w:tcW w:type="dxa" w:w="5"/>
             <w:tcBorders>
-              <w:top w:val="single" w:sz="4" w:space="0" w:color="CCCCCC"/>
-              <w:left w:val="single" w:sz="4" w:space="0" w:color="CCCCCC"/>
-              <w:bottom w:val="single" w:sz="4" w:space="0" w:color="CCCCCC"/>
-              <w:right w:val="single" w:sz="4" w:space="0" w:color="CCCCCC"/>
+              <w:top w:val="none" w:sz="0" w:color="FFFFFF" w:space="0"/>
+              <w:bottom w:val="single" w:sz="4" w:color="CCCCCC" w:space="0"/>
+              <w:left w:val="none" w:sz="0" w:color="FFFFFF" w:space="0"/>
+              <w:right w:val="none" w:sz="0" w:color="FFFFFF" w:space="0"/>
             </w:tcBorders>
           </w:tcPr>
           <w:p>
             <w:pPr>
-              <w:spacing w:before="0" w:after="0"/>
+              <w:spacing w:before="20" w:after="20"/>
             </w:pPr>
             <w:r>
               <w:rPr>
-                <w:rFonts w:ascii="Arial" w:hAnsi="Arial"/>
+                <w:rFonts w:ascii="Calibri" w:hAnsi="Calibri"/>
+                <w:sz w:val="18"/>
+              </w:rPr>
+              <w:t>ja  O    nein  O</w:t>
+            </w:r>
+          </w:p>
+        </w:tc>
+        <w:tc>
+          <w:tcPr>
+            <w:tcW w:type="dxa" w:w="3"/>
+            <w:tcBorders>
+              <w:top w:val="none" w:sz="0" w:color="FFFFFF" w:space="0"/>
+              <w:bottom w:val="single" w:sz="4" w:color="CCCCCC" w:space="0"/>
+              <w:left w:val="none" w:sz="0" w:color="FFFFFF" w:space="0"/>
+              <w:right w:val="none" w:sz="0" w:color="FFFFFF" w:space="0"/>
+            </w:tcBorders>
+          </w:tcPr>
+          <w:p>
+            <w:pPr>
+              <w:spacing w:before="20" w:after="20"/>
+            </w:pPr>
+            <w:r>
+              <w:rPr>
+                <w:rFonts w:ascii="Calibri" w:hAnsi="Calibri"/>
                 <w:b/>
-                <w:color w:val="444444"/>
-                <w:sz w:val="17"/>
+                <w:sz w:val="18"/>
               </w:rPr>
-              <w:t>Telefon Hausarzt</w:t>
+              <w:t>Kurzatmigkeit:</w:t>
+            </w:r>
+          </w:p>
+        </w:tc>
+        <w:tc>
+          <w:tcPr>
+            <w:tcW w:type="dxa" w:w="5"/>
+            <w:tcBorders>
+              <w:top w:val="none" w:sz="0" w:color="FFFFFF" w:space="0"/>
+              <w:bottom w:val="single" w:sz="4" w:color="CCCCCC" w:space="0"/>
+              <w:left w:val="none" w:sz="0" w:color="FFFFFF" w:space="0"/>
+              <w:right w:val="none" w:sz="0" w:color="FFFFFF" w:space="0"/>
+            </w:tcBorders>
+          </w:tcPr>
+          <w:p>
+            <w:pPr>
+              <w:spacing w:before="20" w:after="20"/>
+            </w:pPr>
+            <w:r>
+              <w:rPr>
+                <w:rFonts w:ascii="Calibri" w:hAnsi="Calibri"/>
+                <w:sz w:val="18"/>
+              </w:rPr>
+              <w:t>ja  O    nein  O</w:t>
             </w:r>
           </w:p>
         </w:tc>
       </w:tr>
       <w:tr>
-        <w:trPr>
-          <w:trHeight w:val="360" w:hRule="atLeast"/>
-        </w:trPr>
         <w:tc>
           <w:tcPr>
-            <w:tcW w:type="dxa" w:w="9972"/>
-            <w:gridSpan w:val="2"/>
-            <w:tcMar>
-              <w:top w:w="80" w:type="dxa"/>
-              <w:bottom w:w="80" w:type="dxa"/>
-              <w:left w:w="120" w:type="dxa"/>
-              <w:right w:w="120" w:type="dxa"/>
-            </w:tcMar>
+            <w:tcW w:type="dxa" w:w="3"/>
             <w:tcBorders>
-              <w:top w:val="single" w:sz="4" w:space="0" w:color="CCCCCC"/>
-              <w:left w:val="single" w:sz="4" w:space="0" w:color="CCCCCC"/>
-              <w:bottom w:val="single" w:sz="4" w:space="0" w:color="CCCCCC"/>
-              <w:right w:val="single" w:sz="4" w:space="0" w:color="CCCCCC"/>
+              <w:top w:val="none" w:sz="0" w:color="FFFFFF" w:space="0"/>
+              <w:bottom w:val="single" w:sz="4" w:color="CCCCCC" w:space="0"/>
+              <w:left w:val="none" w:sz="0" w:color="FFFFFF" w:space="0"/>
+              <w:right w:val="none" w:sz="0" w:color="FFFFFF" w:space="0"/>
             </w:tcBorders>
           </w:tcPr>
           <w:p>
             <w:pPr>
-              <w:spacing w:before="0" w:after="0"/>
+              <w:spacing w:before="20" w:after="20"/>
             </w:pPr>
             <w:r>
               <w:rPr>
-                <w:rFonts w:ascii="Arial" w:hAnsi="Arial"/>
-                <w:sz w:val="19"/>
+                <w:rFonts w:ascii="Calibri" w:hAnsi="Calibri"/>
+                <w:b/>
+                <w:sz w:val="18"/>
               </w:rPr>
-              <w:t>Liegt ein ärztliches Rezept vor?    ☐ Ja    ☐ Nein</w:t>
+              <w:t>Häufiges Husten:</w:t>
+            </w:r>
+          </w:p>
+        </w:tc>
+        <w:tc>
+          <w:tcPr>
+            <w:tcW w:type="dxa" w:w="5"/>
+            <w:tcBorders>
+              <w:top w:val="none" w:sz="0" w:color="FFFFFF" w:space="0"/>
+              <w:bottom w:val="single" w:sz="4" w:color="CCCCCC" w:space="0"/>
+              <w:left w:val="none" w:sz="0" w:color="FFFFFF" w:space="0"/>
+              <w:right w:val="none" w:sz="0" w:color="FFFFFF" w:space="0"/>
+            </w:tcBorders>
+          </w:tcPr>
+          <w:p>
+            <w:pPr>
+              <w:spacing w:before="20" w:after="20"/>
+            </w:pPr>
+            <w:r>
+              <w:rPr>
+                <w:rFonts w:ascii="Calibri" w:hAnsi="Calibri"/>
+                <w:sz w:val="18"/>
+              </w:rPr>
+              <w:t>ja  O    nein  O</w:t>
+            </w:r>
+          </w:p>
+        </w:tc>
+        <w:tc>
+          <w:tcPr>
+            <w:tcW w:type="dxa" w:w="3"/>
+            <w:tcBorders>
+              <w:top w:val="none" w:sz="0" w:color="FFFFFF" w:space="0"/>
+              <w:bottom w:val="single" w:sz="4" w:color="CCCCCC" w:space="0"/>
+              <w:left w:val="none" w:sz="0" w:color="FFFFFF" w:space="0"/>
+              <w:right w:val="none" w:sz="0" w:color="FFFFFF" w:space="0"/>
+            </w:tcBorders>
+          </w:tcPr>
+          <w:p>
+            <w:pPr>
+              <w:spacing w:before="20" w:after="20"/>
+            </w:pPr>
+            <w:r>
+              <w:rPr>
+                <w:rFonts w:ascii="Calibri" w:hAnsi="Calibri"/>
+                <w:b/>
+                <w:sz w:val="18"/>
+              </w:rPr>
+              <w:t>Diabetes:</w:t>
+            </w:r>
+          </w:p>
+        </w:tc>
+        <w:tc>
+          <w:tcPr>
+            <w:tcW w:type="dxa" w:w="5"/>
+            <w:tcBorders>
+              <w:top w:val="none" w:sz="0" w:color="FFFFFF" w:space="0"/>
+              <w:bottom w:val="single" w:sz="4" w:color="CCCCCC" w:space="0"/>
+              <w:left w:val="none" w:sz="0" w:color="FFFFFF" w:space="0"/>
+              <w:right w:val="none" w:sz="0" w:color="FFFFFF" w:space="0"/>
+            </w:tcBorders>
+          </w:tcPr>
+          <w:p>
+            <w:pPr>
+              <w:spacing w:before="20" w:after="20"/>
+            </w:pPr>
+            <w:r>
+              <w:rPr>
+                <w:rFonts w:ascii="Calibri" w:hAnsi="Calibri"/>
+                <w:sz w:val="18"/>
+              </w:rPr>
+              <w:t>ja  O    nein  O</w:t>
+            </w:r>
+          </w:p>
+        </w:tc>
+      </w:tr>
+      <w:tr>
+        <w:tc>
+          <w:tcPr>
+            <w:tcW w:type="dxa" w:w="3"/>
+            <w:tcBorders>
+              <w:top w:val="none" w:sz="0" w:color="FFFFFF" w:space="0"/>
+              <w:bottom w:val="single" w:sz="4" w:color="CCCCCC" w:space="0"/>
+              <w:left w:val="none" w:sz="0" w:color="FFFFFF" w:space="0"/>
+              <w:right w:val="none" w:sz="0" w:color="FFFFFF" w:space="0"/>
+            </w:tcBorders>
+          </w:tcPr>
+          <w:p>
+            <w:pPr>
+              <w:spacing w:before="20" w:after="20"/>
+            </w:pPr>
+            <w:r>
+              <w:rPr>
+                <w:rFonts w:ascii="Calibri" w:hAnsi="Calibri"/>
+                <w:b/>
+                <w:sz w:val="18"/>
+              </w:rPr>
+              <w:t>Luftnot:</w:t>
+            </w:r>
+          </w:p>
+        </w:tc>
+        <w:tc>
+          <w:tcPr>
+            <w:tcW w:type="dxa" w:w="5"/>
+            <w:tcBorders>
+              <w:top w:val="none" w:sz="0" w:color="FFFFFF" w:space="0"/>
+              <w:bottom w:val="single" w:sz="4" w:color="CCCCCC" w:space="0"/>
+              <w:left w:val="none" w:sz="0" w:color="FFFFFF" w:space="0"/>
+              <w:right w:val="none" w:sz="0" w:color="FFFFFF" w:space="0"/>
+            </w:tcBorders>
+          </w:tcPr>
+          <w:p>
+            <w:pPr>
+              <w:spacing w:before="20" w:after="20"/>
+            </w:pPr>
+            <w:r>
+              <w:rPr>
+                <w:rFonts w:ascii="Calibri" w:hAnsi="Calibri"/>
+                <w:sz w:val="18"/>
+              </w:rPr>
+              <w:t>ja  O    nein  O</w:t>
+            </w:r>
+          </w:p>
+        </w:tc>
+        <w:tc>
+          <w:tcPr>
+            <w:tcW w:type="dxa" w:w="3"/>
+            <w:tcBorders>
+              <w:top w:val="none" w:sz="0" w:color="FFFFFF" w:space="0"/>
+              <w:bottom w:val="single" w:sz="4" w:color="CCCCCC" w:space="0"/>
+              <w:left w:val="none" w:sz="0" w:color="FFFFFF" w:space="0"/>
+              <w:right w:val="none" w:sz="0" w:color="FFFFFF" w:space="0"/>
+            </w:tcBorders>
+          </w:tcPr>
+          <w:p>
+            <w:pPr>
+              <w:spacing w:before="20" w:after="20"/>
+            </w:pPr>
+            <w:r>
+              <w:rPr>
+                <w:rFonts w:ascii="Calibri" w:hAnsi="Calibri"/>
+                <w:b/>
+                <w:sz w:val="18"/>
+              </w:rPr>
+            </w:r>
+          </w:p>
+        </w:tc>
+        <w:tc>
+          <w:tcPr>
+            <w:tcW w:type="dxa" w:w="5"/>
+            <w:tcBorders>
+              <w:top w:val="none" w:sz="0" w:color="FFFFFF" w:space="0"/>
+              <w:bottom w:val="single" w:sz="4" w:color="CCCCCC" w:space="0"/>
+              <w:left w:val="none" w:sz="0" w:color="FFFFFF" w:space="0"/>
+              <w:right w:val="none" w:sz="0" w:color="FFFFFF" w:space="0"/>
+            </w:tcBorders>
+          </w:tcPr>
+          <w:p>
+            <w:pPr>
+              <w:spacing w:before="20" w:after="20"/>
+            </w:pPr>
+            <w:r>
+              <w:rPr>
+                <w:rFonts w:ascii="Calibri" w:hAnsi="Calibri"/>
+                <w:sz w:val="18"/>
+              </w:rPr>
+            </w:r>
+          </w:p>
+        </w:tc>
+      </w:tr>
+      <w:tr>
+        <w:tc>
+          <w:tcPr>
+            <w:tcW w:type="dxa" w:w="3"/>
+            <w:tcBorders>
+              <w:top w:val="none" w:sz="0" w:color="FFFFFF" w:space="0"/>
+              <w:bottom w:val="single" w:sz="4" w:color="CCCCCC" w:space="0"/>
+              <w:left w:val="none" w:sz="0" w:color="FFFFFF" w:space="0"/>
+              <w:right w:val="none" w:sz="0" w:color="FFFFFF" w:space="0"/>
+            </w:tcBorders>
+          </w:tcPr>
+          <w:p>
+            <w:pPr>
+              <w:spacing w:before="20" w:after="20"/>
+            </w:pPr>
+            <w:r>
+              <w:rPr>
+                <w:rFonts w:ascii="Calibri" w:hAnsi="Calibri"/>
+                <w:b/>
+                <w:sz w:val="18"/>
+              </w:rPr>
+              <w:t>Rheumatische Erkrankungen:</w:t>
+            </w:r>
+          </w:p>
+        </w:tc>
+        <w:tc>
+          <w:tcPr>
+            <w:tcW w:type="dxa" w:w="5"/>
+            <w:tcBorders>
+              <w:top w:val="none" w:sz="0" w:color="FFFFFF" w:space="0"/>
+              <w:bottom w:val="single" w:sz="4" w:color="CCCCCC" w:space="0"/>
+              <w:left w:val="none" w:sz="0" w:color="FFFFFF" w:space="0"/>
+              <w:right w:val="none" w:sz="0" w:color="FFFFFF" w:space="0"/>
+            </w:tcBorders>
+          </w:tcPr>
+          <w:p>
+            <w:pPr>
+              <w:spacing w:before="20" w:after="20"/>
+            </w:pPr>
+            <w:r>
+              <w:rPr>
+                <w:rFonts w:ascii="Calibri" w:hAnsi="Calibri"/>
+                <w:sz w:val="18"/>
+              </w:rPr>
+              <w:t>ja  O    nein  O</w:t>
+            </w:r>
+          </w:p>
+        </w:tc>
+        <w:tc>
+          <w:tcPr>
+            <w:tcW w:type="dxa" w:w="3"/>
+            <w:tcBorders>
+              <w:top w:val="none" w:sz="0" w:color="FFFFFF" w:space="0"/>
+              <w:bottom w:val="single" w:sz="4" w:color="CCCCCC" w:space="0"/>
+              <w:left w:val="none" w:sz="0" w:color="FFFFFF" w:space="0"/>
+              <w:right w:val="none" w:sz="0" w:color="FFFFFF" w:space="0"/>
+            </w:tcBorders>
+          </w:tcPr>
+          <w:p>
+            <w:pPr>
+              <w:spacing w:before="20" w:after="20"/>
+            </w:pPr>
+            <w:r>
+              <w:rPr>
+                <w:rFonts w:ascii="Calibri" w:hAnsi="Calibri"/>
+                <w:b/>
+                <w:sz w:val="18"/>
+              </w:rPr>
+            </w:r>
+          </w:p>
+        </w:tc>
+        <w:tc>
+          <w:tcPr>
+            <w:tcW w:type="dxa" w:w="5"/>
+            <w:tcBorders>
+              <w:top w:val="none" w:sz="0" w:color="FFFFFF" w:space="0"/>
+              <w:bottom w:val="single" w:sz="4" w:color="CCCCCC" w:space="0"/>
+              <w:left w:val="none" w:sz="0" w:color="FFFFFF" w:space="0"/>
+              <w:right w:val="none" w:sz="0" w:color="FFFFFF" w:space="0"/>
+            </w:tcBorders>
+          </w:tcPr>
+          <w:p>
+            <w:pPr>
+              <w:spacing w:before="20" w:after="20"/>
+            </w:pPr>
+            <w:r>
+              <w:rPr>
+                <w:rFonts w:ascii="Calibri" w:hAnsi="Calibri"/>
+                <w:sz w:val="18"/>
+              </w:rPr>
+            </w:r>
+          </w:p>
+        </w:tc>
+      </w:tr>
+      <w:tr>
+        <w:tc>
+          <w:tcPr>
+            <w:tcW w:type="dxa" w:w="3"/>
+            <w:tcBorders>
+              <w:top w:val="none" w:sz="0" w:color="FFFFFF" w:space="0"/>
+              <w:bottom w:val="single" w:sz="4" w:color="CCCCCC" w:space="0"/>
+              <w:left w:val="none" w:sz="0" w:color="FFFFFF" w:space="0"/>
+              <w:right w:val="none" w:sz="0" w:color="FFFFFF" w:space="0"/>
+            </w:tcBorders>
+          </w:tcPr>
+          <w:p>
+            <w:pPr>
+              <w:spacing w:before="20" w:after="20"/>
+            </w:pPr>
+            <w:r>
+              <w:rPr>
+                <w:rFonts w:ascii="Calibri" w:hAnsi="Calibri"/>
+                <w:b/>
+                <w:sz w:val="18"/>
+              </w:rPr>
+              <w:t>unerwünschter Gewichtsverlust:</w:t>
+            </w:r>
+          </w:p>
+        </w:tc>
+        <w:tc>
+          <w:tcPr>
+            <w:tcW w:type="dxa" w:w="5"/>
+            <w:tcBorders>
+              <w:top w:val="none" w:sz="0" w:color="FFFFFF" w:space="0"/>
+              <w:bottom w:val="single" w:sz="4" w:color="CCCCCC" w:space="0"/>
+              <w:left w:val="none" w:sz="0" w:color="FFFFFF" w:space="0"/>
+              <w:right w:val="none" w:sz="0" w:color="FFFFFF" w:space="0"/>
+            </w:tcBorders>
+          </w:tcPr>
+          <w:p>
+            <w:pPr>
+              <w:spacing w:before="20" w:after="20"/>
+            </w:pPr>
+            <w:r>
+              <w:rPr>
+                <w:rFonts w:ascii="Calibri" w:hAnsi="Calibri"/>
+                <w:sz w:val="18"/>
+              </w:rPr>
+              <w:t>ja  O    nein  O</w:t>
+            </w:r>
+          </w:p>
+        </w:tc>
+        <w:tc>
+          <w:tcPr>
+            <w:tcW w:type="dxa" w:w="3"/>
+            <w:tcBorders>
+              <w:top w:val="none" w:sz="0" w:color="FFFFFF" w:space="0"/>
+              <w:bottom w:val="single" w:sz="4" w:color="CCCCCC" w:space="0"/>
+              <w:left w:val="none" w:sz="0" w:color="FFFFFF" w:space="0"/>
+              <w:right w:val="none" w:sz="0" w:color="FFFFFF" w:space="0"/>
+            </w:tcBorders>
+          </w:tcPr>
+          <w:p>
+            <w:pPr>
+              <w:spacing w:before="20" w:after="20"/>
+            </w:pPr>
+            <w:r>
+              <w:rPr>
+                <w:rFonts w:ascii="Calibri" w:hAnsi="Calibri"/>
+                <w:b/>
+                <w:sz w:val="18"/>
+              </w:rPr>
+            </w:r>
+          </w:p>
+        </w:tc>
+        <w:tc>
+          <w:tcPr>
+            <w:tcW w:type="dxa" w:w="5"/>
+            <w:tcBorders>
+              <w:top w:val="none" w:sz="0" w:color="FFFFFF" w:space="0"/>
+              <w:bottom w:val="single" w:sz="4" w:color="CCCCCC" w:space="0"/>
+              <w:left w:val="none" w:sz="0" w:color="FFFFFF" w:space="0"/>
+              <w:right w:val="none" w:sz="0" w:color="FFFFFF" w:space="0"/>
+            </w:tcBorders>
+          </w:tcPr>
+          <w:p>
+            <w:pPr>
+              <w:spacing w:before="20" w:after="20"/>
+            </w:pPr>
+            <w:r>
+              <w:rPr>
+                <w:rFonts w:ascii="Calibri" w:hAnsi="Calibri"/>
+                <w:sz w:val="18"/>
+              </w:rPr>
+            </w:r>
+          </w:p>
+        </w:tc>
+      </w:tr>
+      <w:tr>
+        <w:tc>
+          <w:tcPr>
+            <w:tcW w:type="dxa" w:w="3"/>
+            <w:tcBorders>
+              <w:top w:val="none" w:sz="0" w:color="FFFFFF" w:space="0"/>
+              <w:bottom w:val="single" w:sz="4" w:color="CCCCCC" w:space="0"/>
+              <w:left w:val="none" w:sz="0" w:color="FFFFFF" w:space="0"/>
+              <w:right w:val="none" w:sz="0" w:color="FFFFFF" w:space="0"/>
+            </w:tcBorders>
+          </w:tcPr>
+          <w:p>
+            <w:pPr>
+              <w:spacing w:before="20" w:after="20"/>
+            </w:pPr>
+            <w:r>
+              <w:rPr>
+                <w:rFonts w:ascii="Calibri" w:hAnsi="Calibri"/>
+                <w:b/>
+                <w:sz w:val="18"/>
+              </w:rPr>
+              <w:t>Tinnitus:</w:t>
+            </w:r>
+          </w:p>
+        </w:tc>
+        <w:tc>
+          <w:tcPr>
+            <w:tcW w:type="dxa" w:w="5"/>
+            <w:tcBorders>
+              <w:top w:val="none" w:sz="0" w:color="FFFFFF" w:space="0"/>
+              <w:bottom w:val="single" w:sz="4" w:color="CCCCCC" w:space="0"/>
+              <w:left w:val="none" w:sz="0" w:color="FFFFFF" w:space="0"/>
+              <w:right w:val="none" w:sz="0" w:color="FFFFFF" w:space="0"/>
+            </w:tcBorders>
+          </w:tcPr>
+          <w:p>
+            <w:pPr>
+              <w:spacing w:before="20" w:after="20"/>
+            </w:pPr>
+            <w:r>
+              <w:rPr>
+                <w:rFonts w:ascii="Calibri" w:hAnsi="Calibri"/>
+                <w:sz w:val="18"/>
+              </w:rPr>
+              <w:t>ja  O    nein  O    links  O    rechts  O</w:t>
+            </w:r>
+          </w:p>
+        </w:tc>
+        <w:tc>
+          <w:tcPr>
+            <w:tcW w:type="dxa" w:w="3"/>
+            <w:tcBorders>
+              <w:top w:val="none" w:sz="0" w:color="FFFFFF" w:space="0"/>
+              <w:bottom w:val="single" w:sz="4" w:color="CCCCCC" w:space="0"/>
+              <w:left w:val="none" w:sz="0" w:color="FFFFFF" w:space="0"/>
+              <w:right w:val="none" w:sz="0" w:color="FFFFFF" w:space="0"/>
+            </w:tcBorders>
+          </w:tcPr>
+          <w:p>
+            <w:pPr>
+              <w:spacing w:before="20" w:after="20"/>
+            </w:pPr>
+            <w:r>
+              <w:rPr>
+                <w:rFonts w:ascii="Calibri" w:hAnsi="Calibri"/>
+                <w:b/>
+                <w:sz w:val="18"/>
+              </w:rPr>
+            </w:r>
+          </w:p>
+        </w:tc>
+        <w:tc>
+          <w:tcPr>
+            <w:tcW w:type="dxa" w:w="5"/>
+            <w:tcBorders>
+              <w:top w:val="none" w:sz="0" w:color="FFFFFF" w:space="0"/>
+              <w:bottom w:val="single" w:sz="4" w:color="CCCCCC" w:space="0"/>
+              <w:left w:val="none" w:sz="0" w:color="FFFFFF" w:space="0"/>
+              <w:right w:val="none" w:sz="0" w:color="FFFFFF" w:space="0"/>
+            </w:tcBorders>
+          </w:tcPr>
+          <w:p>
+            <w:pPr>
+              <w:spacing w:before="20" w:after="20"/>
+            </w:pPr>
+            <w:r>
+              <w:rPr>
+                <w:rFonts w:ascii="Calibri" w:hAnsi="Calibri"/>
+                <w:sz w:val="18"/>
+              </w:rPr>
+            </w:r>
+          </w:p>
+        </w:tc>
+      </w:tr>
+      <w:tr>
+        <w:tc>
+          <w:tcPr>
+            <w:tcW w:type="dxa" w:w="3"/>
+            <w:tcBorders>
+              <w:top w:val="none" w:sz="0" w:color="FFFFFF" w:space="0"/>
+              <w:bottom w:val="single" w:sz="4" w:color="CCCCCC" w:space="0"/>
+              <w:left w:val="none" w:sz="0" w:color="FFFFFF" w:space="0"/>
+              <w:right w:val="none" w:sz="0" w:color="FFFFFF" w:space="0"/>
+            </w:tcBorders>
+          </w:tcPr>
+          <w:p>
+            <w:pPr>
+              <w:spacing w:before="20" w:after="20"/>
+            </w:pPr>
+            <w:r>
+              <w:rPr>
+                <w:rFonts w:ascii="Calibri" w:hAnsi="Calibri"/>
+                <w:b/>
+                <w:sz w:val="18"/>
+              </w:rPr>
+              <w:t>Krebserkrankungen/Tumore:</w:t>
+            </w:r>
+          </w:p>
+        </w:tc>
+        <w:tc>
+          <w:tcPr>
+            <w:tcW w:type="dxa" w:w="5"/>
+            <w:tcBorders>
+              <w:top w:val="none" w:sz="0" w:color="FFFFFF" w:space="0"/>
+              <w:bottom w:val="single" w:sz="4" w:color="CCCCCC" w:space="0"/>
+              <w:left w:val="none" w:sz="0" w:color="FFFFFF" w:space="0"/>
+              <w:right w:val="none" w:sz="0" w:color="FFFFFF" w:space="0"/>
+            </w:tcBorders>
+          </w:tcPr>
+          <w:p>
+            <w:pPr>
+              <w:spacing w:before="20" w:after="20"/>
+            </w:pPr>
+            <w:r>
+              <w:rPr>
+                <w:rFonts w:ascii="Calibri" w:hAnsi="Calibri"/>
+                <w:sz w:val="18"/>
+              </w:rPr>
+              <w:t>ja  O    nein  O</w:t>
+            </w:r>
+          </w:p>
+        </w:tc>
+        <w:tc>
+          <w:tcPr>
+            <w:tcW w:type="dxa" w:w="3"/>
+            <w:tcBorders>
+              <w:top w:val="none" w:sz="0" w:color="FFFFFF" w:space="0"/>
+              <w:bottom w:val="single" w:sz="4" w:color="CCCCCC" w:space="0"/>
+              <w:left w:val="none" w:sz="0" w:color="FFFFFF" w:space="0"/>
+              <w:right w:val="none" w:sz="0" w:color="FFFFFF" w:space="0"/>
+            </w:tcBorders>
+          </w:tcPr>
+          <w:p>
+            <w:pPr>
+              <w:spacing w:before="20" w:after="20"/>
+            </w:pPr>
+            <w:r>
+              <w:rPr>
+                <w:rFonts w:ascii="Calibri" w:hAnsi="Calibri"/>
+                <w:b/>
+                <w:sz w:val="18"/>
+              </w:rPr>
+            </w:r>
+          </w:p>
+        </w:tc>
+        <w:tc>
+          <w:tcPr>
+            <w:tcW w:type="dxa" w:w="5"/>
+            <w:tcBorders>
+              <w:top w:val="none" w:sz="0" w:color="FFFFFF" w:space="0"/>
+              <w:bottom w:val="single" w:sz="4" w:color="CCCCCC" w:space="0"/>
+              <w:left w:val="none" w:sz="0" w:color="FFFFFF" w:space="0"/>
+              <w:right w:val="none" w:sz="0" w:color="FFFFFF" w:space="0"/>
+            </w:tcBorders>
+          </w:tcPr>
+          <w:p>
+            <w:pPr>
+              <w:spacing w:before="20" w:after="20"/>
+            </w:pPr>
+            <w:r>
+              <w:rPr>
+                <w:rFonts w:ascii="Calibri" w:hAnsi="Calibri"/>
+                <w:sz w:val="18"/>
+              </w:rPr>
+            </w:r>
+          </w:p>
+        </w:tc>
+      </w:tr>
+      <w:tr>
+        <w:tc>
+          <w:tcPr>
+            <w:tcW w:type="dxa" w:w="3"/>
+            <w:tcBorders>
+              <w:top w:val="none" w:sz="0" w:color="FFFFFF" w:space="0"/>
+              <w:bottom w:val="single" w:sz="4" w:color="CCCCCC" w:space="0"/>
+              <w:left w:val="none" w:sz="0" w:color="FFFFFF" w:space="0"/>
+              <w:right w:val="none" w:sz="0" w:color="FFFFFF" w:space="0"/>
+            </w:tcBorders>
+          </w:tcPr>
+          <w:p>
+            <w:pPr>
+              <w:spacing w:before="20" w:after="20"/>
+            </w:pPr>
+            <w:r>
+              <w:rPr>
+                <w:rFonts w:ascii="Calibri" w:hAnsi="Calibri"/>
+                <w:b/>
+                <w:sz w:val="18"/>
+              </w:rPr>
+              <w:t>Allergien/Unverträglichkeiten</w:t>
+            </w:r>
+          </w:p>
+        </w:tc>
+        <w:tc>
+          <w:tcPr>
+            <w:tcW w:type="dxa" w:w="5"/>
+            <w:tcBorders>
+              <w:top w:val="none" w:sz="0" w:color="FFFFFF" w:space="0"/>
+              <w:bottom w:val="single" w:sz="4" w:color="CCCCCC" w:space="0"/>
+              <w:left w:val="none" w:sz="0" w:color="FFFFFF" w:space="0"/>
+              <w:right w:val="none" w:sz="0" w:color="FFFFFF" w:space="0"/>
+            </w:tcBorders>
+          </w:tcPr>
+          <w:p>
+            <w:pPr>
+              <w:spacing w:before="20" w:after="20"/>
+            </w:pPr>
+            <w:r>
+              <w:rPr>
+                <w:rFonts w:ascii="Calibri" w:hAnsi="Calibri"/>
+                <w:sz w:val="18"/>
+              </w:rPr>
+              <w:t>ja  O    nein  O    Welche? _______________</w:t>
+            </w:r>
+          </w:p>
+        </w:tc>
+        <w:tc>
+          <w:tcPr>
+            <w:tcW w:type="dxa" w:w="3"/>
+            <w:tcBorders>
+              <w:top w:val="none" w:sz="0" w:color="FFFFFF" w:space="0"/>
+              <w:bottom w:val="single" w:sz="4" w:color="CCCCCC" w:space="0"/>
+              <w:left w:val="none" w:sz="0" w:color="FFFFFF" w:space="0"/>
+              <w:right w:val="none" w:sz="0" w:color="FFFFFF" w:space="0"/>
+            </w:tcBorders>
+          </w:tcPr>
+          <w:p>
+            <w:pPr>
+              <w:spacing w:before="20" w:after="20"/>
+            </w:pPr>
+            <w:r>
+              <w:rPr>
+                <w:rFonts w:ascii="Calibri" w:hAnsi="Calibri"/>
+                <w:b/>
+                <w:sz w:val="18"/>
+              </w:rPr>
+            </w:r>
+          </w:p>
+        </w:tc>
+        <w:tc>
+          <w:tcPr>
+            <w:tcW w:type="dxa" w:w="5"/>
+            <w:tcBorders>
+              <w:top w:val="none" w:sz="0" w:color="FFFFFF" w:space="0"/>
+              <w:bottom w:val="single" w:sz="4" w:color="CCCCCC" w:space="0"/>
+              <w:left w:val="none" w:sz="0" w:color="FFFFFF" w:space="0"/>
+              <w:right w:val="none" w:sz="0" w:color="FFFFFF" w:space="0"/>
+            </w:tcBorders>
+          </w:tcPr>
+          <w:p>
+            <w:pPr>
+              <w:spacing w:before="20" w:after="20"/>
+            </w:pPr>
+            <w:r>
+              <w:rPr>
+                <w:rFonts w:ascii="Calibri" w:hAnsi="Calibri"/>
+                <w:sz w:val="18"/>
+              </w:rPr>
             </w:r>
           </w:p>
         </w:tc>
@@ -538,751 +1440,329 @@
     </w:tbl>
     <w:p>
       <w:pPr>
-        <w:spacing w:before="200" w:after="80"/>
-        <w:shd w:val="clear" w:color="auto" w:fill="D6E4F0"/>
+        <w:spacing w:before="0" w:after="0" w:line="80" w:lineRule="exact"/>
+      </w:pPr>
+    </w:p>
+    <w:p>
+      <w:pPr>
+        <w:spacing w:before="0" w:after="40"/>
         <w:pBdr>
-          <w:left w:val="single" w:sz="18" w:space="6" w:color="2E74B5"/>
+          <w:bottom w:val="single" w:sz="4" w:space="1" w:color="000000"/>
         </w:pBdr>
       </w:pPr>
       <w:r>
         <w:rPr>
-          <w:rFonts w:ascii="Arial" w:hAnsi="Arial"/>
-          <w:b/>
+          <w:rFonts w:ascii="Calibri" w:hAnsi="Calibri"/>
+          <w:b w:val="0"/>
           <w:i w:val="0"/>
-          <w:color w:val="2E74B5"/>
-          <w:sz w:val="22"/>
+          <w:sz w:val="20"/>
         </w:rPr>
-        <w:t xml:space="preserve">  3  ·  Aktuelle Beschwerden</w:t>
+        <w:t>Andere: ___________________________________________________________________</w:t>
       </w:r>
     </w:p>
-    <w:tbl>
-      <w:tblPr>
-        <w:tblStyle w:val="TableGrid"/>
-        <w:tblW w:type="auto" w:w="0"/>
-        <w:tblLayout w:type="fixed"/>
-        <w:tblLook w:firstColumn="1" w:firstRow="1" w:lastColumn="0" w:lastRow="0" w:noHBand="0" w:noVBand="1" w:val="04A0"/>
-      </w:tblPr>
-      <w:tblGrid>
-        <w:gridCol w:w="4986"/>
-        <w:gridCol w:w="4986"/>
-      </w:tblGrid>
-      <w:tr>
-        <w:trPr>
-          <w:trHeight w:val="700" w:hRule="atLeast"/>
-        </w:trPr>
-        <w:tc>
-          <w:tcPr>
-            <w:tcW w:type="dxa" w:w="9972"/>
-            <w:gridSpan w:val="2"/>
-            <w:tcMar>
-              <w:top w:w="80" w:type="dxa"/>
-              <w:bottom w:w="80" w:type="dxa"/>
-              <w:left w:w="120" w:type="dxa"/>
-              <w:right w:w="120" w:type="dxa"/>
-            </w:tcMar>
-            <w:tcBorders>
-              <w:top w:val="single" w:sz="4" w:space="0" w:color="CCCCCC"/>
-              <w:left w:val="single" w:sz="4" w:space="0" w:color="CCCCCC"/>
-              <w:bottom w:val="single" w:sz="4" w:space="0" w:color="CCCCCC"/>
-              <w:right w:val="single" w:sz="4" w:space="0" w:color="CCCCCC"/>
-            </w:tcBorders>
-          </w:tcPr>
-          <w:p>
-            <w:pPr>
-              <w:spacing w:before="0" w:after="0"/>
-            </w:pPr>
-            <w:r>
-              <w:rPr>
-                <w:rFonts w:ascii="Arial" w:hAnsi="Arial"/>
-                <w:b/>
-                <w:color w:val="444444"/>
-                <w:sz w:val="17"/>
-              </w:rPr>
-              <w:t>Hauptbeschwerde / Diagnose</w:t>
-            </w:r>
-          </w:p>
-        </w:tc>
-      </w:tr>
-      <w:tr>
-        <w:trPr>
-          <w:trHeight w:val="440" w:hRule="atLeast"/>
-        </w:trPr>
-        <w:tc>
-          <w:tcPr>
-            <w:tcW w:type="dxa" w:w="4986"/>
-            <w:tcMar>
-              <w:top w:w="80" w:type="dxa"/>
-              <w:bottom w:w="80" w:type="dxa"/>
-              <w:left w:w="120" w:type="dxa"/>
-              <w:right w:w="120" w:type="dxa"/>
-            </w:tcMar>
-            <w:tcBorders>
-              <w:top w:val="single" w:sz="4" w:space="0" w:color="CCCCCC"/>
-              <w:left w:val="single" w:sz="4" w:space="0" w:color="CCCCCC"/>
-              <w:bottom w:val="single" w:sz="4" w:space="0" w:color="CCCCCC"/>
-              <w:right w:val="single" w:sz="4" w:space="0" w:color="CCCCCC"/>
-            </w:tcBorders>
-          </w:tcPr>
-          <w:p>
-            <w:pPr>
-              <w:spacing w:before="0" w:after="0"/>
-            </w:pPr>
-            <w:r>
-              <w:rPr>
-                <w:rFonts w:ascii="Arial" w:hAnsi="Arial"/>
-                <w:b/>
-                <w:color w:val="444444"/>
-                <w:sz w:val="17"/>
-              </w:rPr>
-              <w:t>Seit wann bestehen die Beschwerden?</w:t>
-            </w:r>
-          </w:p>
-        </w:tc>
-        <w:tc>
-          <w:tcPr>
-            <w:tcW w:type="dxa" w:w="4986"/>
-            <w:tcMar>
-              <w:top w:w="80" w:type="dxa"/>
-              <w:bottom w:w="80" w:type="dxa"/>
-              <w:left w:w="120" w:type="dxa"/>
-              <w:right w:w="120" w:type="dxa"/>
-            </w:tcMar>
-            <w:tcBorders>
-              <w:top w:val="single" w:sz="4" w:space="0" w:color="CCCCCC"/>
-              <w:left w:val="single" w:sz="4" w:space="0" w:color="CCCCCC"/>
-              <w:bottom w:val="single" w:sz="4" w:space="0" w:color="CCCCCC"/>
-              <w:right w:val="single" w:sz="4" w:space="0" w:color="CCCCCC"/>
-            </w:tcBorders>
-          </w:tcPr>
-          <w:p>
-            <w:pPr>
-              <w:spacing w:before="0" w:after="0"/>
-            </w:pPr>
-            <w:r>
-              <w:rPr>
-                <w:rFonts w:ascii="Arial" w:hAnsi="Arial"/>
-                <w:b/>
-                <w:color w:val="444444"/>
-                <w:sz w:val="17"/>
-              </w:rPr>
-              <w:t>Wie haben sie begonnen?</w:t>
-            </w:r>
-          </w:p>
-        </w:tc>
-      </w:tr>
-      <w:tr>
-        <w:trPr>
-          <w:trHeight w:val="360" w:hRule="atLeast"/>
-        </w:trPr>
-        <w:tc>
-          <w:tcPr>
-            <w:tcW w:type="dxa" w:w="9972"/>
-            <w:gridSpan w:val="2"/>
-            <w:tcMar>
-              <w:top w:w="80" w:type="dxa"/>
-              <w:bottom w:w="80" w:type="dxa"/>
-              <w:left w:w="120" w:type="dxa"/>
-              <w:right w:w="120" w:type="dxa"/>
-            </w:tcMar>
-            <w:tcBorders>
-              <w:top w:val="single" w:sz="4" w:space="0" w:color="CCCCCC"/>
-              <w:left w:val="single" w:sz="4" w:space="0" w:color="CCCCCC"/>
-              <w:bottom w:val="single" w:sz="4" w:space="0" w:color="CCCCCC"/>
-              <w:right w:val="single" w:sz="4" w:space="0" w:color="CCCCCC"/>
-            </w:tcBorders>
-          </w:tcPr>
-          <w:p>
-            <w:pPr>
-              <w:spacing w:before="0" w:after="0"/>
-            </w:pPr>
-            <w:r>
-              <w:rPr>
-                <w:rFonts w:ascii="Arial" w:hAnsi="Arial"/>
-                <w:sz w:val="19"/>
-              </w:rPr>
-              <w:t>Schmerzstärke  (0 = kein Schmerz · 10 = stärkster Schmerz):      0    1    2    3    4    5    6    7    8    9    10</w:t>
-            </w:r>
-          </w:p>
-        </w:tc>
-      </w:tr>
-      <w:tr>
-        <w:trPr>
-          <w:trHeight w:val="360" w:hRule="atLeast"/>
-        </w:trPr>
-        <w:tc>
-          <w:tcPr>
-            <w:tcW w:type="dxa" w:w="9972"/>
-            <w:gridSpan w:val="2"/>
-            <w:tcMar>
-              <w:top w:w="80" w:type="dxa"/>
-              <w:bottom w:w="80" w:type="dxa"/>
-              <w:left w:w="120" w:type="dxa"/>
-              <w:right w:w="120" w:type="dxa"/>
-            </w:tcMar>
-            <w:tcBorders>
-              <w:top w:val="single" w:sz="4" w:space="0" w:color="CCCCCC"/>
-              <w:left w:val="single" w:sz="4" w:space="0" w:color="CCCCCC"/>
-              <w:bottom w:val="single" w:sz="4" w:space="0" w:color="CCCCCC"/>
-              <w:right w:val="single" w:sz="4" w:space="0" w:color="CCCCCC"/>
-            </w:tcBorders>
-          </w:tcPr>
-          <w:p>
-            <w:pPr>
-              <w:spacing w:before="0" w:after="0"/>
-            </w:pPr>
-            <w:r>
-              <w:rPr>
-                <w:rFonts w:ascii="Arial" w:hAnsi="Arial"/>
-                <w:sz w:val="19"/>
-              </w:rPr>
-              <w:t>Schmerzcharakter:    ☐ dumpf    ☐ stechend    ☐ brennend    ☐ ziehend    ☐ drückend    ☐ anderes: ______________________</w:t>
-            </w:r>
-          </w:p>
-        </w:tc>
-      </w:tr>
-      <w:tr>
-        <w:trPr>
-          <w:trHeight w:val="360" w:hRule="atLeast"/>
-        </w:trPr>
-        <w:tc>
-          <w:tcPr>
-            <w:tcW w:type="dxa" w:w="9972"/>
-            <w:gridSpan w:val="2"/>
-            <w:tcMar>
-              <w:top w:w="80" w:type="dxa"/>
-              <w:bottom w:w="80" w:type="dxa"/>
-              <w:left w:w="120" w:type="dxa"/>
-              <w:right w:w="120" w:type="dxa"/>
-            </w:tcMar>
-            <w:tcBorders>
-              <w:top w:val="single" w:sz="4" w:space="0" w:color="CCCCCC"/>
-              <w:left w:val="single" w:sz="4" w:space="0" w:color="CCCCCC"/>
-              <w:bottom w:val="single" w:sz="4" w:space="0" w:color="CCCCCC"/>
-              <w:right w:val="single" w:sz="4" w:space="0" w:color="CCCCCC"/>
-            </w:tcBorders>
-          </w:tcPr>
-          <w:p>
-            <w:pPr>
-              <w:spacing w:before="0" w:after="0"/>
-            </w:pPr>
-            <w:r>
-              <w:rPr>
-                <w:rFonts w:ascii="Arial" w:hAnsi="Arial"/>
-                <w:sz w:val="19"/>
-              </w:rPr>
-              <w:t>Beschwerden stärker:    ☐ morgens    ☐ tagsüber    ☐ abends    ☐ nachts    ☐ bei Belastung    ☐ in Ruhe</w:t>
-            </w:r>
-          </w:p>
-        </w:tc>
-      </w:tr>
-    </w:tbl>
     <w:p>
       <w:pPr>
-        <w:spacing w:before="200" w:after="80"/>
-        <w:shd w:val="clear" w:color="auto" w:fill="D6E4F0"/>
+        <w:spacing w:before="0" w:after="40"/>
         <w:pBdr>
-          <w:left w:val="single" w:sz="18" w:space="6" w:color="2E74B5"/>
+          <w:bottom w:val="single" w:sz="4" w:space="1" w:color="000000"/>
         </w:pBdr>
       </w:pPr>
       <w:r>
         <w:rPr>
-          <w:rFonts w:ascii="Arial" w:hAnsi="Arial"/>
+          <w:rFonts w:ascii="Calibri" w:hAnsi="Calibri"/>
+          <w:b w:val="0"/>
+          <w:i w:val="0"/>
+          <w:sz w:val="20"/>
+        </w:rPr>
+        <w:t>Welche Erwartungen haben sie an die Therapie bzw. welche Ziele möchten sie verfolgen?</w:t>
+      </w:r>
+    </w:p>
+    <w:p>
+      <w:pPr>
+        <w:spacing w:before="120" w:after="120"/>
+        <w:jc w:val="center"/>
+      </w:pPr>
+      <w:r>
+        <w:rPr>
+          <w:rFonts w:ascii="Calibri" w:hAnsi="Calibri"/>
           <w:b/>
           <w:i w:val="0"/>
-          <w:color w:val="2E74B5"/>
           <w:sz w:val="22"/>
         </w:rPr>
-        <w:t xml:space="preserve">  4  ·  Medizinische Vorgeschichte</w:t>
+        <w:t>Vielen Dank!</w:t>
       </w:r>
     </w:p>
-    <w:tbl>
-      <w:tblPr>
-        <w:tblStyle w:val="TableGrid"/>
-        <w:tblW w:type="auto" w:w="0"/>
-        <w:tblLayout w:type="fixed"/>
-        <w:tblLook w:firstColumn="1" w:firstRow="1" w:lastColumn="0" w:lastRow="0" w:noHBand="0" w:noVBand="1" w:val="04A0"/>
-      </w:tblPr>
-      <w:tblGrid>
-        <w:gridCol w:w="4986"/>
-        <w:gridCol w:w="4986"/>
-      </w:tblGrid>
-      <w:tr>
-        <w:trPr>
-          <w:trHeight w:val="560" w:hRule="atLeast"/>
-        </w:trPr>
-        <w:tc>
-          <w:tcPr>
-            <w:tcW w:type="dxa" w:w="9972"/>
-            <w:gridSpan w:val="2"/>
-            <w:tcMar>
-              <w:top w:w="80" w:type="dxa"/>
-              <w:bottom w:w="80" w:type="dxa"/>
-              <w:left w:w="120" w:type="dxa"/>
-              <w:right w:w="120" w:type="dxa"/>
-            </w:tcMar>
-            <w:tcBorders>
-              <w:top w:val="single" w:sz="4" w:space="0" w:color="CCCCCC"/>
-              <w:left w:val="single" w:sz="4" w:space="0" w:color="CCCCCC"/>
-              <w:bottom w:val="single" w:sz="4" w:space="0" w:color="CCCCCC"/>
-              <w:right w:val="single" w:sz="4" w:space="0" w:color="CCCCCC"/>
-            </w:tcBorders>
-          </w:tcPr>
-          <w:p>
-            <w:pPr>
-              <w:spacing w:before="0" w:after="0"/>
-            </w:pPr>
-            <w:r>
-              <w:rPr>
-                <w:rFonts w:ascii="Arial" w:hAnsi="Arial"/>
-                <w:b/>
-                <w:color w:val="444444"/>
-                <w:sz w:val="17"/>
-              </w:rPr>
-              <w:t>Voroperationen</w:t>
-            </w:r>
-          </w:p>
-        </w:tc>
-      </w:tr>
-      <w:tr>
-        <w:trPr>
-          <w:trHeight w:val="560" w:hRule="atLeast"/>
-        </w:trPr>
-        <w:tc>
-          <w:tcPr>
-            <w:tcW w:type="dxa" w:w="9972"/>
-            <w:gridSpan w:val="2"/>
-            <w:tcMar>
-              <w:top w:w="80" w:type="dxa"/>
-              <w:bottom w:w="80" w:type="dxa"/>
-              <w:left w:w="120" w:type="dxa"/>
-              <w:right w:w="120" w:type="dxa"/>
-            </w:tcMar>
-            <w:tcBorders>
-              <w:top w:val="single" w:sz="4" w:space="0" w:color="CCCCCC"/>
-              <w:left w:val="single" w:sz="4" w:space="0" w:color="CCCCCC"/>
-              <w:bottom w:val="single" w:sz="4" w:space="0" w:color="CCCCCC"/>
-              <w:right w:val="single" w:sz="4" w:space="0" w:color="CCCCCC"/>
-            </w:tcBorders>
-          </w:tcPr>
-          <w:p>
-            <w:pPr>
-              <w:spacing w:before="0" w:after="0"/>
-            </w:pPr>
-            <w:r>
-              <w:rPr>
-                <w:rFonts w:ascii="Arial" w:hAnsi="Arial"/>
-                <w:b/>
-                <w:color w:val="444444"/>
-                <w:sz w:val="17"/>
-              </w:rPr>
-              <w:t>Vorerkrankungen / chronische Erkrankungen</w:t>
-            </w:r>
-          </w:p>
-        </w:tc>
-      </w:tr>
-      <w:tr>
-        <w:trPr>
-          <w:trHeight w:val="560" w:hRule="atLeast"/>
-        </w:trPr>
-        <w:tc>
-          <w:tcPr>
-            <w:tcW w:type="dxa" w:w="9972"/>
-            <w:gridSpan w:val="2"/>
-            <w:tcMar>
-              <w:top w:w="80" w:type="dxa"/>
-              <w:bottom w:w="80" w:type="dxa"/>
-              <w:left w:w="120" w:type="dxa"/>
-              <w:right w:w="120" w:type="dxa"/>
-            </w:tcMar>
-            <w:tcBorders>
-              <w:top w:val="single" w:sz="4" w:space="0" w:color="CCCCCC"/>
-              <w:left w:val="single" w:sz="4" w:space="0" w:color="CCCCCC"/>
-              <w:bottom w:val="single" w:sz="4" w:space="0" w:color="CCCCCC"/>
-              <w:right w:val="single" w:sz="4" w:space="0" w:color="CCCCCC"/>
-            </w:tcBorders>
-          </w:tcPr>
-          <w:p>
-            <w:pPr>
-              <w:spacing w:before="0" w:after="0"/>
-            </w:pPr>
-            <w:r>
-              <w:rPr>
-                <w:rFonts w:ascii="Arial" w:hAnsi="Arial"/>
-                <w:b/>
-                <w:color w:val="444444"/>
-                <w:sz w:val="17"/>
-              </w:rPr>
-              <w:t>Aktuelle Medikamente</w:t>
-            </w:r>
-          </w:p>
-        </w:tc>
-      </w:tr>
-      <w:tr>
-        <w:trPr>
-          <w:trHeight w:val="560" w:hRule="atLeast"/>
-        </w:trPr>
-        <w:tc>
-          <w:tcPr>
-            <w:tcW w:type="dxa" w:w="9972"/>
-            <w:gridSpan w:val="2"/>
-            <w:tcMar>
-              <w:top w:w="80" w:type="dxa"/>
-              <w:bottom w:w="80" w:type="dxa"/>
-              <w:left w:w="120" w:type="dxa"/>
-              <w:right w:w="120" w:type="dxa"/>
-            </w:tcMar>
-            <w:tcBorders>
-              <w:top w:val="single" w:sz="4" w:space="0" w:color="CCCCCC"/>
-              <w:left w:val="single" w:sz="4" w:space="0" w:color="CCCCCC"/>
-              <w:bottom w:val="single" w:sz="4" w:space="0" w:color="CCCCCC"/>
-              <w:right w:val="single" w:sz="4" w:space="0" w:color="CCCCCC"/>
-            </w:tcBorders>
-          </w:tcPr>
-          <w:p>
-            <w:pPr>
-              <w:spacing w:before="0" w:after="0"/>
-            </w:pPr>
-            <w:r>
-              <w:rPr>
-                <w:rFonts w:ascii="Arial" w:hAnsi="Arial"/>
-                <w:b/>
-                <w:color w:val="444444"/>
-                <w:sz w:val="17"/>
-              </w:rPr>
-              <w:t>Allergien / Unverträglichkeiten</w:t>
-            </w:r>
-          </w:p>
-        </w:tc>
-      </w:tr>
-      <w:tr>
-        <w:trPr>
-          <w:trHeight w:val="360" w:hRule="atLeast"/>
-        </w:trPr>
-        <w:tc>
-          <w:tcPr>
-            <w:tcW w:type="dxa" w:w="9972"/>
-            <w:gridSpan w:val="2"/>
-            <w:tcMar>
-              <w:top w:w="80" w:type="dxa"/>
-              <w:bottom w:w="80" w:type="dxa"/>
-              <w:left w:w="120" w:type="dxa"/>
-              <w:right w:w="120" w:type="dxa"/>
-            </w:tcMar>
-            <w:tcBorders>
-              <w:top w:val="single" w:sz="4" w:space="0" w:color="CCCCCC"/>
-              <w:left w:val="single" w:sz="4" w:space="0" w:color="CCCCCC"/>
-              <w:bottom w:val="single" w:sz="4" w:space="0" w:color="CCCCCC"/>
-              <w:right w:val="single" w:sz="4" w:space="0" w:color="CCCCCC"/>
-            </w:tcBorders>
-          </w:tcPr>
-          <w:p>
-            <w:pPr>
-              <w:spacing w:before="0" w:after="0"/>
-            </w:pPr>
-            <w:r>
-              <w:rPr>
-                <w:rFonts w:ascii="Arial" w:hAnsi="Arial"/>
-                <w:sz w:val="19"/>
-              </w:rPr>
-              <w:t>Frühere Physiotherapie?    ☐ Ja    ☐ Nein</w:t>
-            </w:r>
-          </w:p>
-        </w:tc>
-      </w:tr>
-      <w:tr>
-        <w:trPr>
-          <w:trHeight w:val="480" w:hRule="atLeast"/>
-        </w:trPr>
-        <w:tc>
-          <w:tcPr>
-            <w:tcW w:type="dxa" w:w="9972"/>
-            <w:gridSpan w:val="2"/>
-            <w:tcMar>
-              <w:top w:w="80" w:type="dxa"/>
-              <w:bottom w:w="80" w:type="dxa"/>
-              <w:left w:w="120" w:type="dxa"/>
-              <w:right w:w="120" w:type="dxa"/>
-            </w:tcMar>
-            <w:tcBorders>
-              <w:top w:val="single" w:sz="4" w:space="0" w:color="CCCCCC"/>
-              <w:left w:val="single" w:sz="4" w:space="0" w:color="CCCCCC"/>
-              <w:bottom w:val="single" w:sz="4" w:space="0" w:color="CCCCCC"/>
-              <w:right w:val="single" w:sz="4" w:space="0" w:color="CCCCCC"/>
-            </w:tcBorders>
-          </w:tcPr>
-          <w:p>
-            <w:pPr>
-              <w:spacing w:before="0" w:after="0"/>
-            </w:pPr>
-            <w:r>
-              <w:rPr>
-                <w:rFonts w:ascii="Arial" w:hAnsi="Arial"/>
-                <w:b/>
-                <w:color w:val="444444"/>
-                <w:sz w:val="17"/>
-              </w:rPr>
-              <w:t>Wenn ja — wann und weshalb?</w:t>
-            </w:r>
-          </w:p>
-        </w:tc>
-      </w:tr>
-    </w:tbl>
     <w:p>
       <w:pPr>
-        <w:spacing w:before="200" w:after="80"/>
-        <w:shd w:val="clear" w:color="auto" w:fill="D6E4F0"/>
         <w:pBdr>
-          <w:left w:val="single" w:sz="18" w:space="6" w:color="2E74B5"/>
+          <w:bottom w:val="single" w:sz="6" w:space="1" w:color="000000"/>
+        </w:pBdr>
+        <w:spacing w:before="0" w:after="80"/>
+      </w:pPr>
+    </w:p>
+    <w:p>
+      <w:pPr>
+        <w:spacing w:before="80" w:after="80"/>
+      </w:pPr>
+      <w:r>
+        <w:rPr>
+          <w:rFonts w:ascii="Calibri" w:hAnsi="Calibri"/>
+          <w:b/>
+          <w:i w:val="0"/>
+          <w:sz w:val="20"/>
+        </w:rPr>
+        <w:t>Ergänzungen durch den/die TherapeutIn:</w:t>
+      </w:r>
+    </w:p>
+    <w:p>
+      <w:pPr>
+        <w:spacing w:before="0" w:after="40"/>
+        <w:pBdr>
+          <w:bottom w:val="single" w:sz="4" w:space="1" w:color="000000"/>
         </w:pBdr>
       </w:pPr>
       <w:r>
         <w:rPr>
-          <w:rFonts w:ascii="Arial" w:hAnsi="Arial"/>
-          <w:b/>
+          <w:rFonts w:ascii="Calibri" w:hAnsi="Calibri"/>
+          <w:b w:val="0"/>
           <w:i w:val="0"/>
-          <w:color w:val="2E74B5"/>
-          <w:sz w:val="22"/>
+          <w:sz w:val="20"/>
         </w:rPr>
-        <w:t xml:space="preserve">  5  ·  Therapieziele</w:t>
+        <w:t>Beweglichkeit/Kraft/Sensibilität:</w:t>
       </w:r>
     </w:p>
-    <w:tbl>
-      <w:tblPr>
-        <w:tblStyle w:val="TableGrid"/>
-        <w:tblW w:type="auto" w:w="0"/>
-        <w:tblLayout w:type="fixed"/>
-        <w:tblLook w:firstColumn="1" w:firstRow="1" w:lastColumn="0" w:lastRow="0" w:noHBand="0" w:noVBand="1" w:val="04A0"/>
-      </w:tblPr>
-      <w:tblGrid>
-        <w:gridCol w:w="4986"/>
-        <w:gridCol w:w="4986"/>
-      </w:tblGrid>
-      <w:tr>
-        <w:trPr>
-          <w:trHeight w:val="600" w:hRule="atLeast"/>
-        </w:trPr>
-        <w:tc>
-          <w:tcPr>
-            <w:tcW w:type="dxa" w:w="9972"/>
-            <w:gridSpan w:val="2"/>
-            <w:tcMar>
-              <w:top w:w="80" w:type="dxa"/>
-              <w:bottom w:w="80" w:type="dxa"/>
-              <w:left w:w="120" w:type="dxa"/>
-              <w:right w:w="120" w:type="dxa"/>
-            </w:tcMar>
-            <w:tcBorders>
-              <w:top w:val="single" w:sz="4" w:space="0" w:color="CCCCCC"/>
-              <w:left w:val="single" w:sz="4" w:space="0" w:color="CCCCCC"/>
-              <w:bottom w:val="single" w:sz="4" w:space="0" w:color="CCCCCC"/>
-              <w:right w:val="single" w:sz="4" w:space="0" w:color="CCCCCC"/>
-            </w:tcBorders>
-          </w:tcPr>
-          <w:p>
-            <w:pPr>
-              <w:spacing w:before="0" w:after="0"/>
-            </w:pPr>
-            <w:r>
-              <w:rPr>
-                <w:rFonts w:ascii="Arial" w:hAnsi="Arial"/>
-                <w:b/>
-                <w:color w:val="444444"/>
-                <w:sz w:val="17"/>
-              </w:rPr>
-              <w:t>Was möchten Sie durch die Therapie erreichen?</w:t>
-            </w:r>
-          </w:p>
-        </w:tc>
-      </w:tr>
-      <w:tr>
-        <w:trPr>
-          <w:trHeight w:val="560" w:hRule="atLeast"/>
-        </w:trPr>
-        <w:tc>
-          <w:tcPr>
-            <w:tcW w:type="dxa" w:w="9972"/>
-            <w:gridSpan w:val="2"/>
-            <w:tcMar>
-              <w:top w:w="80" w:type="dxa"/>
-              <w:bottom w:w="80" w:type="dxa"/>
-              <w:left w:w="120" w:type="dxa"/>
-              <w:right w:w="120" w:type="dxa"/>
-            </w:tcMar>
-            <w:tcBorders>
-              <w:top w:val="single" w:sz="4" w:space="0" w:color="CCCCCC"/>
-              <w:left w:val="single" w:sz="4" w:space="0" w:color="CCCCCC"/>
-              <w:bottom w:val="single" w:sz="4" w:space="0" w:color="CCCCCC"/>
-              <w:right w:val="single" w:sz="4" w:space="0" w:color="CCCCCC"/>
-            </w:tcBorders>
-          </w:tcPr>
-          <w:p>
-            <w:pPr>
-              <w:spacing w:before="0" w:after="0"/>
-            </w:pPr>
-            <w:r>
-              <w:rPr>
-                <w:rFonts w:ascii="Arial" w:hAnsi="Arial"/>
-                <w:b/>
-                <w:color w:val="444444"/>
-                <w:sz w:val="17"/>
-              </w:rPr>
-              <w:t>Gibt es Einschränkungen oder Besonderheiten, die ich wissen sollte?</w:t>
-            </w:r>
-          </w:p>
-        </w:tc>
-      </w:tr>
-    </w:tbl>
     <w:p>
       <w:pPr>
-        <w:spacing w:before="200" w:after="80"/>
-        <w:shd w:val="clear" w:color="auto" w:fill="D6E4F0"/>
+        <w:spacing w:before="0" w:after="40"/>
         <w:pBdr>
-          <w:left w:val="single" w:sz="18" w:space="6" w:color="2E74B5"/>
+          <w:bottom w:val="single" w:sz="4" w:space="1" w:color="000000"/>
         </w:pBdr>
       </w:pPr>
       <w:r>
         <w:rPr>
-          <w:rFonts w:ascii="Arial" w:hAnsi="Arial"/>
-          <w:b/>
+          <w:rFonts w:ascii="Calibri" w:hAnsi="Calibri"/>
+          <w:b w:val="0"/>
           <w:i w:val="0"/>
-          <w:color w:val="2E74B5"/>
-          <w:sz w:val="22"/>
+          <w:sz w:val="20"/>
         </w:rPr>
-        <w:t xml:space="preserve">  6  ·  Einwilligung &amp; Unterschrift</w:t>
       </w:r>
     </w:p>
     <w:p>
       <w:pPr>
-        <w:spacing w:before="80" w:after="160"/>
+        <w:spacing w:before="0" w:after="40"/>
+        <w:pBdr>
+          <w:bottom w:val="single" w:sz="4" w:space="1" w:color="000000"/>
+        </w:pBdr>
       </w:pPr>
       <w:r>
         <w:rPr>
-          <w:rFonts w:ascii="Arial" w:hAnsi="Arial"/>
-          <w:sz w:val="19"/>
+          <w:rFonts w:ascii="Calibri" w:hAnsi="Calibri"/>
+          <w:b w:val="0"/>
+          <w:i w:val="0"/>
+          <w:sz w:val="20"/>
         </w:rPr>
-        <w:t>Ich bestätige, dass die oben gemachten Angaben wahrheitsgemäß und vollständig sind. Ich bin damit einverstanden, dass diese Daten im Rahmen der physiotherapeutischen Behandlung verarbeitet und gespeichert werden (Art. 9 Abs. 2 lit. h DSGVO).</w:t>
       </w:r>
     </w:p>
-    <w:tbl>
-      <w:tblPr>
-        <w:tblStyle w:val="TableGrid"/>
-        <w:tblW w:type="auto" w:w="0"/>
-        <w:tblLook w:firstColumn="1" w:firstRow="1" w:lastColumn="0" w:lastRow="0" w:noHBand="0" w:noVBand="1" w:val="04A0"/>
-      </w:tblPr>
-      <w:tblGrid>
-        <w:gridCol w:w="3324"/>
-        <w:gridCol w:w="3324"/>
-        <w:gridCol w:w="3324"/>
-      </w:tblGrid>
-      <w:tr>
-        <w:trPr>
-          <w:trHeight w:val="700" w:hRule="atLeast"/>
-          <w:trHeight w:val="700" w:hRule="atLeast"/>
-          <w:trHeight w:val="700" w:hRule="atLeast"/>
-        </w:trPr>
-        <w:tc>
-          <w:tcPr>
-            <w:tcW w:type="dxa" w:w="5"/>
-            <w:tcMar>
-              <w:top w:w="80" w:type="dxa"/>
-              <w:bottom w:w="80" w:type="dxa"/>
-              <w:left w:w="120" w:type="dxa"/>
-              <w:right w:w="120" w:type="dxa"/>
-            </w:tcMar>
-            <w:tcBorders>
-              <w:top w:val="single" w:sz="4" w:space="0" w:color="CCCCCC"/>
-              <w:left w:val="single" w:sz="4" w:space="0" w:color="CCCCCC"/>
-              <w:bottom w:val="single" w:sz="4" w:space="0" w:color="CCCCCC"/>
-              <w:right w:val="single" w:sz="4" w:space="0" w:color="CCCCCC"/>
-            </w:tcBorders>
-          </w:tcPr>
-          <w:p>
-            <w:pPr>
-              <w:spacing w:before="0" w:after="0"/>
-            </w:pPr>
-            <w:r>
-              <w:rPr>
-                <w:rFonts w:ascii="Arial" w:hAnsi="Arial"/>
-                <w:b/>
-                <w:color w:val="444444"/>
-                <w:sz w:val="17"/>
-              </w:rPr>
-              <w:t>Ort</w:t>
-            </w:r>
-          </w:p>
-        </w:tc>
-        <w:tc>
-          <w:tcPr>
-            <w:tcW w:type="dxa" w:w="5"/>
-            <w:tcMar>
-              <w:top w:w="80" w:type="dxa"/>
-              <w:bottom w:w="80" w:type="dxa"/>
-              <w:left w:w="120" w:type="dxa"/>
-              <w:right w:w="120" w:type="dxa"/>
-            </w:tcMar>
-            <w:tcBorders>
-              <w:top w:val="single" w:sz="4" w:space="0" w:color="CCCCCC"/>
-              <w:left w:val="single" w:sz="4" w:space="0" w:color="CCCCCC"/>
-              <w:bottom w:val="single" w:sz="4" w:space="0" w:color="CCCCCC"/>
-              <w:right w:val="single" w:sz="4" w:space="0" w:color="CCCCCC"/>
-            </w:tcBorders>
-          </w:tcPr>
-          <w:p>
-            <w:pPr>
-              <w:spacing w:before="0" w:after="0"/>
-            </w:pPr>
-            <w:r>
-              <w:rPr>
-                <w:rFonts w:ascii="Arial" w:hAnsi="Arial"/>
-                <w:b/>
-                <w:color w:val="444444"/>
-                <w:sz w:val="17"/>
-              </w:rPr>
-              <w:t>Datum</w:t>
-            </w:r>
-          </w:p>
-        </w:tc>
-        <w:tc>
-          <w:tcPr>
-            <w:tcW w:type="dxa" w:w="5"/>
-            <w:tcMar>
-              <w:top w:w="80" w:type="dxa"/>
-              <w:bottom w:w="80" w:type="dxa"/>
-              <w:left w:w="120" w:type="dxa"/>
-              <w:right w:w="120" w:type="dxa"/>
-            </w:tcMar>
-            <w:tcBorders>
-              <w:top w:val="single" w:sz="4" w:space="0" w:color="CCCCCC"/>
-              <w:left w:val="single" w:sz="4" w:space="0" w:color="CCCCCC"/>
-              <w:bottom w:val="single" w:sz="4" w:space="0" w:color="CCCCCC"/>
-              <w:right w:val="single" w:sz="4" w:space="0" w:color="CCCCCC"/>
-            </w:tcBorders>
-          </w:tcPr>
-          <w:p>
-            <w:pPr>
-              <w:spacing w:before="0" w:after="0"/>
-            </w:pPr>
-            <w:r>
-              <w:rPr>
-                <w:rFonts w:ascii="Arial" w:hAnsi="Arial"/>
-                <w:b/>
-                <w:color w:val="444444"/>
-                <w:sz w:val="17"/>
-              </w:rPr>
-              <w:t>Unterschrift Patient / -in</w:t>
-            </w:r>
-          </w:p>
-        </w:tc>
-      </w:tr>
-    </w:tbl>
+    <w:p>
+      <w:pPr>
+        <w:spacing w:before="40" w:after="0"/>
+      </w:pPr>
+      <w:r>
+        <w:rPr>
+          <w:rFonts w:ascii="Calibri" w:hAnsi="Calibri"/>
+          <w:b w:val="0"/>
+          <w:i w:val="0"/>
+          <w:sz w:val="20"/>
+        </w:rPr>
+        <w:t>Geschichte:</w:t>
+      </w:r>
+    </w:p>
+    <w:p>
+      <w:pPr>
+        <w:spacing w:before="0" w:after="40"/>
+        <w:pBdr>
+          <w:bottom w:val="single" w:sz="4" w:space="1" w:color="000000"/>
+        </w:pBdr>
+      </w:pPr>
+      <w:r>
+        <w:rPr>
+          <w:rFonts w:ascii="Calibri" w:hAnsi="Calibri"/>
+          <w:b w:val="0"/>
+          <w:i w:val="0"/>
+          <w:sz w:val="20"/>
+        </w:rPr>
+      </w:r>
+    </w:p>
+    <w:p>
+      <w:pPr>
+        <w:spacing w:before="0" w:after="40"/>
+        <w:pBdr>
+          <w:bottom w:val="single" w:sz="4" w:space="1" w:color="000000"/>
+        </w:pBdr>
+      </w:pPr>
+      <w:r>
+        <w:rPr>
+          <w:rFonts w:ascii="Calibri" w:hAnsi="Calibri"/>
+          <w:b w:val="0"/>
+          <w:i w:val="0"/>
+          <w:sz w:val="20"/>
+        </w:rPr>
+      </w:r>
+    </w:p>
+    <w:p>
+      <w:pPr>
+        <w:spacing w:before="0" w:after="40"/>
+        <w:pBdr>
+          <w:bottom w:val="single" w:sz="4" w:space="1" w:color="000000"/>
+        </w:pBdr>
+      </w:pPr>
+      <w:r>
+        <w:rPr>
+          <w:rFonts w:ascii="Calibri" w:hAnsi="Calibri"/>
+          <w:b w:val="0"/>
+          <w:i w:val="0"/>
+          <w:sz w:val="20"/>
+        </w:rPr>
+      </w:r>
+    </w:p>
+    <w:p>
+      <w:pPr>
+        <w:spacing w:before="0" w:after="40"/>
+        <w:pBdr>
+          <w:bottom w:val="single" w:sz="4" w:space="1" w:color="000000"/>
+        </w:pBdr>
+      </w:pPr>
+      <w:r>
+        <w:rPr>
+          <w:rFonts w:ascii="Calibri" w:hAnsi="Calibri"/>
+          <w:b w:val="0"/>
+          <w:i w:val="0"/>
+          <w:sz w:val="20"/>
+        </w:rPr>
+      </w:r>
+    </w:p>
+    <w:p>
+      <w:pPr>
+        <w:spacing w:before="0" w:after="40"/>
+        <w:pBdr>
+          <w:bottom w:val="single" w:sz="4" w:space="1" w:color="000000"/>
+        </w:pBdr>
+      </w:pPr>
+      <w:r>
+        <w:rPr>
+          <w:rFonts w:ascii="Calibri" w:hAnsi="Calibri"/>
+          <w:b w:val="0"/>
+          <w:i w:val="0"/>
+          <w:sz w:val="20"/>
+        </w:rPr>
+      </w:r>
+    </w:p>
+    <w:p>
+      <w:pPr>
+        <w:spacing w:before="0" w:after="40"/>
+        <w:pBdr>
+          <w:bottom w:val="single" w:sz="4" w:space="1" w:color="000000"/>
+        </w:pBdr>
+      </w:pPr>
+      <w:r>
+        <w:rPr>
+          <w:rFonts w:ascii="Calibri" w:hAnsi="Calibri"/>
+          <w:b w:val="0"/>
+          <w:i w:val="0"/>
+          <w:sz w:val="20"/>
+        </w:rPr>
+      </w:r>
+    </w:p>
+    <w:p>
+      <w:pPr>
+        <w:spacing w:before="0" w:after="40"/>
+        <w:pBdr>
+          <w:bottom w:val="single" w:sz="4" w:space="1" w:color="000000"/>
+        </w:pBdr>
+      </w:pPr>
+      <w:r>
+        <w:rPr>
+          <w:rFonts w:ascii="Calibri" w:hAnsi="Calibri"/>
+          <w:b w:val="0"/>
+          <w:i w:val="0"/>
+          <w:sz w:val="20"/>
+        </w:rPr>
+        <w:t>MRT/Röntgen/:</w:t>
+      </w:r>
+    </w:p>
+    <w:p>
+      <w:pPr>
+        <w:spacing w:before="0" w:after="40"/>
+        <w:pBdr>
+          <w:bottom w:val="single" w:sz="4" w:space="1" w:color="000000"/>
+        </w:pBdr>
+      </w:pPr>
+      <w:r>
+        <w:rPr>
+          <w:rFonts w:ascii="Calibri" w:hAnsi="Calibri"/>
+          <w:b w:val="0"/>
+          <w:i w:val="0"/>
+          <w:sz w:val="20"/>
+        </w:rPr>
+        <w:t>Behandlungsplan:</w:t>
+      </w:r>
+    </w:p>
+    <w:p>
+      <w:pPr>
+        <w:spacing w:before="80" w:after="80"/>
+      </w:pPr>
+      <w:r>
+        <w:rPr>
+          <w:rFonts w:ascii="Calibri" w:hAnsi="Calibri"/>
+          <w:b w:val="0"/>
+          <w:i/>
+          <w:sz w:val="16"/>
+        </w:rPr>
+        <w:t>Ich wurde von meinem/r Therapeuten/in über die Notwendigkeit, Eignung, Durchführung, Therapieziele, eventuelle Risiken und Umfang der durchzuführenden Therapie aufgeklärt. Diese Erklärung wird durch das Patientenrechtegesetz vom 20.02.2013 notwendig. Als Patient/in erkenne ich diese Regelung an und willige in die durchzuführende Behandlung ein.</w:t>
+      </w:r>
+    </w:p>
+    <w:p>
+      <w:pPr>
+        <w:spacing w:before="120"/>
+      </w:pPr>
+      <w:r>
+        <w:rPr>
+          <w:rFonts w:ascii="Calibri" w:hAnsi="Calibri"/>
+          <w:b w:val="0"/>
+          <w:i w:val="0"/>
+          <w:sz w:val="20"/>
+        </w:rPr>
+        <w:t>Datum: ___________________________          Unterschrift: ___________________________</w:t>
+      </w:r>
+    </w:p>
     <w:sectPr>
-      <w:pgSz w:w="12240" w:h="15840"/>
-      <w:pgMar w:top="1134" w:right="1134" w:bottom="1134" w:left="1134" w:header="720" w:footer="720" w:gutter="0"/>
+      <w:footerReference w:type="default" r:id="rId9"/>
+      <w:pgSz w:w="11906" w:h="16838"/>
+      <w:pgMar w:top="850" w:right="1134" w:bottom="850" w:left="1134" w:header="720" w:footer="720" w:gutter="0"/>
       <w:cols w:space="720"/>
       <w:docGrid w:linePitch="360"/>
     </w:sectPr>
   </w:body>
 </w:document>
+</file>
+
+<file path=word/footer1.xml><?xml version="1.0" encoding="utf-8"?>
+<w:ftr xmlns:m="http://schemas.openxmlformats.org/officeDocument/2006/math" xmlns:mc="http://schemas.openxmlformats.org/markup-compatibility/2006" xmlns:mo="http://schemas.microsoft.com/office/mac/office/2008/main" xmlns:mv="urn:schemas-microsoft-com:mac:vml" xmlns:o="urn:schemas-microsoft-com:office:office" xmlns:r="http://schemas.openxmlformats.org/officeDocument/2006/relationships" xmlns:v="urn:schemas-microsoft-com:vml" xmlns:w10="urn:schemas-microsoft-com:office:word" xmlns:w14="http://schemas.microsoft.com/office/word/2010/wordml" xmlns:w="http://schemas.openxmlformats.org/wordprocessingml/2006/main" xmlns:wne="http://schemas.microsoft.com/office/word/2006/wordml" xmlns:wp14="http://schemas.microsoft.com/office/word/2010/wordprocessingDrawing" xmlns:wp="http://schemas.openxmlformats.org/drawingml/2006/wordprocessingDrawing" xmlns:wpc="http://schemas.microsoft.com/office/word/2010/wordprocessingCanvas" xmlns:wpg="http://schemas.microsoft.com/office/word/2010/wordprocessingGroup" xmlns:wpi="http://schemas.microsoft.com/office/word/2010/wordprocessingInk" xmlns:wps="http://schemas.microsoft.com/office/word/2010/wordprocessingShape" mc:Ignorable="w14 wp14">
+  <w:p>
+    <w:pPr>
+      <w:pStyle w:val="Footer"/>
+      <w:jc w:val="center"/>
+    </w:pPr>
+    <w:r>
+      <w:rPr>
+        <w:rFonts w:ascii="Calibri" w:hAnsi="Calibri"/>
+        <w:color w:val="808080"/>
+        <w:sz w:val="16"/>
+      </w:rPr>
+      <w:t>Mobile Physiotherapie Grausam  ·  Nick Grausam  ·  info@physiotherapie-grausam.com  ·  0176 459 28 768</w:t>
+    </w:r>
+  </w:p>
+</w:ftr>
 </file>
 
 <file path=word/numbering.xml><?xml version="1.0" encoding="utf-8"?>

</xml_diff>